<commit_message>
docs(rncp): dossier Bloc 2 v3 — enrichi à 28 pages avec annexes
- §3.2 Modèle de données (14 entités Doctrine, relations)
- §6.2 extrait réel du test d'inscription (WebTestCase)
- Annexe A : extraits de code (SecurityHeadersSubscriber, /api/health,
  firewall + access_control — reproduits fidèlement du dépôt)
- Annexe B : chaîne CI/CD avec captures GitHub Actions (run vert détaillé ;
  l'échec deploy sans secrets présenté comme garde-fou)
- Annexe C : sorties d'outillage (PHPUnit, Jest, composer/npm audit, curl health)
28 pages / 30 max, validation OOXML PASSED.

Co-Authored-By: Claude Fable 5 <noreply@anthropic.com>
</commit_message>
<xml_diff>
--- a/dossier/Dossier_Bloc2_Albion_Helper_v3.docx
+++ b/dossier/Dossier_Bloc2_Albion_Helper_v3.docx
@@ -3899,7 +3899,7 @@
           <w:sz w:val="22"/>
           <w:szCs w:val="22"/>
         </w:rPr>
-        <w:t xml:space="preserve">Sécurisée : tout passe par le firewall Symfony (JWT, rôles, throttling) avant d'atteindre le moindre contrôleur ; les en-têtes de sécurité sont posés globalement par un EventSubscriber.</w:t>
+        <w:t xml:space="preserve">Sécurisée : tout passe par le firewall Symfony (JWT, rôles, throttling) avant d'atteindre le moindre contrôleur ; les en-têtes de sécurité sont posés globalement par un EventSubscriber (code complet en annexe A).</w:t>
       </w:r>
     </w:p>
     <w:p>
@@ -3920,6 +3920,1195 @@
         <w:t xml:space="preserve">Supervisable : endpoint public /api/health (état BDD + API externe) interrogeable par une sonde, canal de log « incident » dédié.</w:t>
       </w:r>
     </w:p>
+    <w:p>
+      <w:pPr>
+        <w:pStyle w:val="Heading2"/>
+      </w:pPr>
+      <w:r>
+        <w:t xml:space="preserve">3.2 Modèle de données</w:t>
+      </w:r>
+    </w:p>
+    <w:p>
+      <w:pPr>
+        <w:spacing w:after="140" w:before="0" w:line="330"/>
+        <w:jc w:val="both"/>
+      </w:pPr>
+      <w:r>
+        <w:rPr>
+          <w:b w:val="false"/>
+          <w:bCs w:val="false"/>
+          <w:i w:val="false"/>
+          <w:iCs w:val="false"/>
+          <w:sz w:val="22"/>
+          <w:szCs w:val="22"/>
+        </w:rPr>
+        <w:t xml:space="preserve">Le schéma relationnel est porté par 14 entités Doctrine, versionnées par migrations. Les données volatiles du jeu (statistiques de joueurs, batailles) ne sont volontairement pas persistées : elles sont relayées depuis l'API officielle, ce qui évite toute donnée obsolète en base.</w:t>
+      </w:r>
+    </w:p>
+    <w:tbl>
+      <w:tblPr>
+        <w:tblW w:type="dxa" w:w="9072"/>
+        <w:tblBorders>
+          <w:top w:val="single" w:color="auto" w:sz="4"/>
+          <w:left w:val="single" w:color="auto" w:sz="4"/>
+          <w:bottom w:val="single" w:color="auto" w:sz="4"/>
+          <w:right w:val="single" w:color="auto" w:sz="4"/>
+          <w:insideH w:val="single" w:color="auto" w:sz="4"/>
+          <w:insideV w:val="single" w:color="auto" w:sz="4"/>
+        </w:tblBorders>
+      </w:tblPr>
+      <w:tblGrid>
+        <w:gridCol w:w="1701"/>
+        <w:gridCol w:w="4536"/>
+        <w:gridCol w:w="2835"/>
+      </w:tblGrid>
+      <w:tr>
+        <w:trPr>
+          <w:tblHeader/>
+        </w:trPr>
+        <w:tc>
+          <w:tcPr>
+            <w:tcW w:type="dxa" w:w="1701"/>
+            <w:tcBorders>
+              <w:top w:val="single" w:color="8B6914" w:sz="10"/>
+              <w:left w:val="none" w:color="FFFFFF" w:sz="0"/>
+              <w:bottom w:val="single" w:color="8B6914" w:sz="5"/>
+              <w:right w:val="none" w:color="FFFFFF" w:sz="0"/>
+            </w:tcBorders>
+            <w:tcMar>
+              <w:top w:type="dxa" w:w="70"/>
+              <w:left w:type="dxa" w:w="60"/>
+              <w:bottom w:type="dxa" w:w="70"/>
+              <w:right w:type="dxa" w:w="120"/>
+            </w:tcMar>
+          </w:tcPr>
+          <w:p>
+            <w:pPr>
+              <w:spacing w:after="0" w:line="264"/>
+            </w:pPr>
+            <w:r>
+              <w:rPr>
+                <w:b/>
+                <w:bCs/>
+                <w:color w:val="2D1A00"/>
+                <w:sz w:val="19"/>
+                <w:szCs w:val="19"/>
+              </w:rPr>
+              <w:t xml:space="preserve">Entité</w:t>
+            </w:r>
+          </w:p>
+        </w:tc>
+        <w:tc>
+          <w:tcPr>
+            <w:tcW w:type="dxa" w:w="4536"/>
+            <w:tcBorders>
+              <w:top w:val="single" w:color="8B6914" w:sz="10"/>
+              <w:left w:val="none" w:color="FFFFFF" w:sz="0"/>
+              <w:bottom w:val="single" w:color="8B6914" w:sz="5"/>
+              <w:right w:val="none" w:color="FFFFFF" w:sz="0"/>
+            </w:tcBorders>
+            <w:tcMar>
+              <w:top w:type="dxa" w:w="70"/>
+              <w:left w:type="dxa" w:w="60"/>
+              <w:bottom w:type="dxa" w:w="70"/>
+              <w:right w:type="dxa" w:w="120"/>
+            </w:tcMar>
+          </w:tcPr>
+          <w:p>
+            <w:pPr>
+              <w:spacing w:after="0" w:line="264"/>
+            </w:pPr>
+            <w:r>
+              <w:rPr>
+                <w:b/>
+                <w:bCs/>
+                <w:color w:val="2D1A00"/>
+                <w:sz w:val="19"/>
+                <w:szCs w:val="19"/>
+              </w:rPr>
+              <w:t xml:space="preserve">Rôle</w:t>
+            </w:r>
+          </w:p>
+        </w:tc>
+        <w:tc>
+          <w:tcPr>
+            <w:tcW w:type="dxa" w:w="2835"/>
+            <w:tcBorders>
+              <w:top w:val="single" w:color="8B6914" w:sz="10"/>
+              <w:left w:val="none" w:color="FFFFFF" w:sz="0"/>
+              <w:bottom w:val="single" w:color="8B6914" w:sz="5"/>
+              <w:right w:val="none" w:color="FFFFFF" w:sz="0"/>
+            </w:tcBorders>
+            <w:tcMar>
+              <w:top w:type="dxa" w:w="70"/>
+              <w:left w:type="dxa" w:w="60"/>
+              <w:bottom w:type="dxa" w:w="70"/>
+              <w:right w:type="dxa" w:w="120"/>
+            </w:tcMar>
+          </w:tcPr>
+          <w:p>
+            <w:pPr>
+              <w:spacing w:after="0" w:line="264"/>
+            </w:pPr>
+            <w:r>
+              <w:rPr>
+                <w:b/>
+                <w:bCs/>
+                <w:color w:val="2D1A00"/>
+                <w:sz w:val="19"/>
+                <w:szCs w:val="19"/>
+              </w:rPr>
+              <w:t xml:space="preserve">Relations principales</w:t>
+            </w:r>
+          </w:p>
+        </w:tc>
+      </w:tr>
+      <w:tr>
+        <w:tc>
+          <w:tcPr>
+            <w:tcW w:type="dxa" w:w="1701"/>
+            <w:tcBorders>
+              <w:top w:val="none" w:color="FFFFFF" w:sz="0"/>
+              <w:left w:val="none" w:color="FFFFFF" w:sz="0"/>
+              <w:bottom w:val="single" w:color="E0D5BB" w:sz="2"/>
+              <w:right w:val="none" w:color="FFFFFF" w:sz="0"/>
+            </w:tcBorders>
+            <w:tcMar>
+              <w:top w:type="dxa" w:w="70"/>
+              <w:left w:type="dxa" w:w="60"/>
+              <w:bottom w:type="dxa" w:w="70"/>
+              <w:right w:type="dxa" w:w="120"/>
+            </w:tcMar>
+          </w:tcPr>
+          <w:p>
+            <w:pPr>
+              <w:spacing w:after="0" w:line="264"/>
+            </w:pPr>
+            <w:r>
+              <w:rPr>
+                <w:b w:val="false"/>
+                <w:bCs w:val="false"/>
+                <w:sz w:val="19"/>
+                <w:szCs w:val="19"/>
+              </w:rPr>
+              <w:t xml:space="preserve">User</w:t>
+            </w:r>
+          </w:p>
+        </w:tc>
+        <w:tc>
+          <w:tcPr>
+            <w:tcW w:type="dxa" w:w="4536"/>
+            <w:tcBorders>
+              <w:top w:val="none" w:color="FFFFFF" w:sz="0"/>
+              <w:left w:val="none" w:color="FFFFFF" w:sz="0"/>
+              <w:bottom w:val="single" w:color="E0D5BB" w:sz="2"/>
+              <w:right w:val="none" w:color="FFFFFF" w:sz="0"/>
+            </w:tcBorders>
+            <w:tcMar>
+              <w:top w:type="dxa" w:w="70"/>
+              <w:left w:type="dxa" w:w="60"/>
+              <w:bottom w:type="dxa" w:w="70"/>
+              <w:right w:type="dxa" w:w="120"/>
+            </w:tcMar>
+          </w:tcPr>
+          <w:p>
+            <w:pPr>
+              <w:spacing w:after="0" w:line="264"/>
+            </w:pPr>
+            <w:r>
+              <w:rPr>
+                <w:b w:val="false"/>
+                <w:bCs w:val="false"/>
+                <w:sz w:val="19"/>
+                <w:szCs w:val="19"/>
+              </w:rPr>
+              <w:t xml:space="preserve">Compte utilisateur : identifiant, mot de passe bcrypt, rôles, préférences (JSON)</w:t>
+            </w:r>
+          </w:p>
+        </w:tc>
+        <w:tc>
+          <w:tcPr>
+            <w:tcW w:type="dxa" w:w="2835"/>
+            <w:tcBorders>
+              <w:top w:val="none" w:color="FFFFFF" w:sz="0"/>
+              <w:left w:val="none" w:color="FFFFFF" w:sz="0"/>
+              <w:bottom w:val="single" w:color="E0D5BB" w:sz="2"/>
+              <w:right w:val="none" w:color="FFFFFF" w:sz="0"/>
+            </w:tcBorders>
+            <w:tcMar>
+              <w:top w:type="dxa" w:w="70"/>
+              <w:left w:type="dxa" w:w="60"/>
+              <w:bottom w:type="dxa" w:w="70"/>
+              <w:right w:type="dxa" w:w="120"/>
+            </w:tcMar>
+          </w:tcPr>
+          <w:p>
+            <w:pPr>
+              <w:spacing w:after="0" w:line="264"/>
+            </w:pPr>
+            <w:r>
+              <w:rPr>
+                <w:b w:val="false"/>
+                <w:bCs w:val="false"/>
+                <w:sz w:val="19"/>
+                <w:szCs w:val="19"/>
+              </w:rPr>
+              <w:t xml:space="preserve">1—N GameRoute, 1—N Composition</w:t>
+            </w:r>
+          </w:p>
+        </w:tc>
+      </w:tr>
+      <w:tr>
+        <w:tc>
+          <w:tcPr>
+            <w:tcW w:type="dxa" w:w="1701"/>
+            <w:tcBorders>
+              <w:top w:val="none" w:color="FFFFFF" w:sz="0"/>
+              <w:left w:val="none" w:color="FFFFFF" w:sz="0"/>
+              <w:bottom w:val="single" w:color="E0D5BB" w:sz="2"/>
+              <w:right w:val="none" w:color="FFFFFF" w:sz="0"/>
+            </w:tcBorders>
+            <w:tcMar>
+              <w:top w:type="dxa" w:w="70"/>
+              <w:left w:type="dxa" w:w="60"/>
+              <w:bottom w:type="dxa" w:w="70"/>
+              <w:right w:type="dxa" w:w="120"/>
+            </w:tcMar>
+          </w:tcPr>
+          <w:p>
+            <w:pPr>
+              <w:spacing w:after="0" w:line="264"/>
+            </w:pPr>
+            <w:r>
+              <w:rPr>
+                <w:b w:val="false"/>
+                <w:bCs w:val="false"/>
+                <w:sz w:val="19"/>
+                <w:szCs w:val="19"/>
+              </w:rPr>
+              <w:t xml:space="preserve">RefreshToken</w:t>
+            </w:r>
+          </w:p>
+        </w:tc>
+        <w:tc>
+          <w:tcPr>
+            <w:tcW w:type="dxa" w:w="4536"/>
+            <w:tcBorders>
+              <w:top w:val="none" w:color="FFFFFF" w:sz="0"/>
+              <w:left w:val="none" w:color="FFFFFF" w:sz="0"/>
+              <w:bottom w:val="single" w:color="E0D5BB" w:sz="2"/>
+              <w:right w:val="none" w:color="FFFFFF" w:sz="0"/>
+            </w:tcBorders>
+            <w:tcMar>
+              <w:top w:type="dxa" w:w="70"/>
+              <w:left w:type="dxa" w:w="60"/>
+              <w:bottom w:type="dxa" w:w="70"/>
+              <w:right w:type="dxa" w:w="120"/>
+            </w:tcMar>
+          </w:tcPr>
+          <w:p>
+            <w:pPr>
+              <w:spacing w:after="0" w:line="264"/>
+            </w:pPr>
+            <w:r>
+              <w:rPr>
+                <w:b w:val="false"/>
+                <w:bCs w:val="false"/>
+                <w:sz w:val="19"/>
+                <w:szCs w:val="19"/>
+              </w:rPr>
+              <w:t xml:space="preserve">Jetons de rafraîchissement JWT, rotation single_use</w:t>
+            </w:r>
+          </w:p>
+        </w:tc>
+        <w:tc>
+          <w:tcPr>
+            <w:tcW w:type="dxa" w:w="2835"/>
+            <w:tcBorders>
+              <w:top w:val="none" w:color="FFFFFF" w:sz="0"/>
+              <w:left w:val="none" w:color="FFFFFF" w:sz="0"/>
+              <w:bottom w:val="single" w:color="E0D5BB" w:sz="2"/>
+              <w:right w:val="none" w:color="FFFFFF" w:sz="0"/>
+            </w:tcBorders>
+            <w:tcMar>
+              <w:top w:type="dxa" w:w="70"/>
+              <w:left w:type="dxa" w:w="60"/>
+              <w:bottom w:type="dxa" w:w="70"/>
+              <w:right w:type="dxa" w:w="120"/>
+            </w:tcMar>
+          </w:tcPr>
+          <w:p>
+            <w:pPr>
+              <w:spacing w:after="0" w:line="264"/>
+            </w:pPr>
+            <w:r>
+              <w:rPr>
+                <w:b w:val="false"/>
+                <w:bCs w:val="false"/>
+                <w:sz w:val="19"/>
+                <w:szCs w:val="19"/>
+              </w:rPr>
+              <w:t xml:space="preserve">— (géré par bundle)</w:t>
+            </w:r>
+          </w:p>
+        </w:tc>
+      </w:tr>
+      <w:tr>
+        <w:tc>
+          <w:tcPr>
+            <w:tcW w:type="dxa" w:w="1701"/>
+            <w:tcBorders>
+              <w:top w:val="none" w:color="FFFFFF" w:sz="0"/>
+              <w:left w:val="none" w:color="FFFFFF" w:sz="0"/>
+              <w:bottom w:val="single" w:color="E0D5BB" w:sz="2"/>
+              <w:right w:val="none" w:color="FFFFFF" w:sz="0"/>
+            </w:tcBorders>
+            <w:tcMar>
+              <w:top w:type="dxa" w:w="70"/>
+              <w:left w:type="dxa" w:w="60"/>
+              <w:bottom w:type="dxa" w:w="70"/>
+              <w:right w:type="dxa" w:w="120"/>
+            </w:tcMar>
+          </w:tcPr>
+          <w:p>
+            <w:pPr>
+              <w:spacing w:after="0" w:line="264"/>
+            </w:pPr>
+            <w:r>
+              <w:rPr>
+                <w:b w:val="false"/>
+                <w:bCs w:val="false"/>
+                <w:sz w:val="19"/>
+                <w:szCs w:val="19"/>
+              </w:rPr>
+              <w:t xml:space="preserve">GameRoute</w:t>
+            </w:r>
+          </w:p>
+        </w:tc>
+        <w:tc>
+          <w:tcPr>
+            <w:tcW w:type="dxa" w:w="4536"/>
+            <w:tcBorders>
+              <w:top w:val="none" w:color="FFFFFF" w:sz="0"/>
+              <w:left w:val="none" w:color="FFFFFF" w:sz="0"/>
+              <w:bottom w:val="single" w:color="E0D5BB" w:sz="2"/>
+              <w:right w:val="none" w:color="FFFFFF" w:sz="0"/>
+            </w:tcBorders>
+            <w:tcMar>
+              <w:top w:type="dxa" w:w="70"/>
+              <w:left w:type="dxa" w:w="60"/>
+              <w:bottom w:type="dxa" w:w="70"/>
+              <w:right w:type="dxa" w:w="120"/>
+            </w:tcMar>
+          </w:tcPr>
+          <w:p>
+            <w:pPr>
+              <w:spacing w:after="0" w:line="264"/>
+            </w:pPr>
+            <w:r>
+              <w:rPr>
+                <w:b w:val="false"/>
+                <w:bCs w:val="false"/>
+                <w:sz w:val="19"/>
+                <w:szCs w:val="19"/>
+              </w:rPr>
+              <w:t xml:space="preserve">Route de farming : nom, jeton de partage aléatoire, expiration 24 h</w:t>
+            </w:r>
+          </w:p>
+        </w:tc>
+        <w:tc>
+          <w:tcPr>
+            <w:tcW w:type="dxa" w:w="2835"/>
+            <w:tcBorders>
+              <w:top w:val="none" w:color="FFFFFF" w:sz="0"/>
+              <w:left w:val="none" w:color="FFFFFF" w:sz="0"/>
+              <w:bottom w:val="single" w:color="E0D5BB" w:sz="2"/>
+              <w:right w:val="none" w:color="FFFFFF" w:sz="0"/>
+            </w:tcBorders>
+            <w:tcMar>
+              <w:top w:type="dxa" w:w="70"/>
+              <w:left w:type="dxa" w:w="60"/>
+              <w:bottom w:type="dxa" w:w="70"/>
+              <w:right w:type="dxa" w:w="120"/>
+            </w:tcMar>
+          </w:tcPr>
+          <w:p>
+            <w:pPr>
+              <w:spacing w:after="0" w:line="264"/>
+            </w:pPr>
+            <w:r>
+              <w:rPr>
+                <w:b w:val="false"/>
+                <w:bCs w:val="false"/>
+                <w:sz w:val="19"/>
+                <w:szCs w:val="19"/>
+              </w:rPr>
+              <w:t xml:space="preserve">N—1 User · 1—N RouteZone</w:t>
+            </w:r>
+          </w:p>
+        </w:tc>
+      </w:tr>
+      <w:tr>
+        <w:tc>
+          <w:tcPr>
+            <w:tcW w:type="dxa" w:w="1701"/>
+            <w:tcBorders>
+              <w:top w:val="none" w:color="FFFFFF" w:sz="0"/>
+              <w:left w:val="none" w:color="FFFFFF" w:sz="0"/>
+              <w:bottom w:val="single" w:color="E0D5BB" w:sz="2"/>
+              <w:right w:val="none" w:color="FFFFFF" w:sz="0"/>
+            </w:tcBorders>
+            <w:tcMar>
+              <w:top w:type="dxa" w:w="70"/>
+              <w:left w:type="dxa" w:w="60"/>
+              <w:bottom w:type="dxa" w:w="70"/>
+              <w:right w:type="dxa" w:w="120"/>
+            </w:tcMar>
+          </w:tcPr>
+          <w:p>
+            <w:pPr>
+              <w:spacing w:after="0" w:line="264"/>
+            </w:pPr>
+            <w:r>
+              <w:rPr>
+                <w:b w:val="false"/>
+                <w:bCs w:val="false"/>
+                <w:sz w:val="19"/>
+                <w:szCs w:val="19"/>
+              </w:rPr>
+              <w:t xml:space="preserve">RouteZone</w:t>
+            </w:r>
+          </w:p>
+        </w:tc>
+        <w:tc>
+          <w:tcPr>
+            <w:tcW w:type="dxa" w:w="4536"/>
+            <w:tcBorders>
+              <w:top w:val="none" w:color="FFFFFF" w:sz="0"/>
+              <w:left w:val="none" w:color="FFFFFF" w:sz="0"/>
+              <w:bottom w:val="single" w:color="E0D5BB" w:sz="2"/>
+              <w:right w:val="none" w:color="FFFFFF" w:sz="0"/>
+            </w:tcBorders>
+            <w:tcMar>
+              <w:top w:type="dxa" w:w="70"/>
+              <w:left w:type="dxa" w:w="60"/>
+              <w:bottom w:type="dxa" w:w="70"/>
+              <w:right w:type="dxa" w:w="120"/>
+            </w:tcMar>
+          </w:tcPr>
+          <w:p>
+            <w:pPr>
+              <w:spacing w:after="0" w:line="264"/>
+            </w:pPr>
+            <w:r>
+              <w:rPr>
+                <w:b w:val="false"/>
+                <w:bCs w:val="false"/>
+                <w:sz w:val="19"/>
+                <w:szCs w:val="19"/>
+              </w:rPr>
+              <w:t xml:space="preserve">Étape ordonnée d'une route + minuteur</w:t>
+            </w:r>
+          </w:p>
+        </w:tc>
+        <w:tc>
+          <w:tcPr>
+            <w:tcW w:type="dxa" w:w="2835"/>
+            <w:tcBorders>
+              <w:top w:val="none" w:color="FFFFFF" w:sz="0"/>
+              <w:left w:val="none" w:color="FFFFFF" w:sz="0"/>
+              <w:bottom w:val="single" w:color="E0D5BB" w:sz="2"/>
+              <w:right w:val="none" w:color="FFFFFF" w:sz="0"/>
+            </w:tcBorders>
+            <w:tcMar>
+              <w:top w:type="dxa" w:w="70"/>
+              <w:left w:type="dxa" w:w="60"/>
+              <w:bottom w:type="dxa" w:w="70"/>
+              <w:right w:type="dxa" w:w="120"/>
+            </w:tcMar>
+          </w:tcPr>
+          <w:p>
+            <w:pPr>
+              <w:spacing w:after="0" w:line="264"/>
+            </w:pPr>
+            <w:r>
+              <w:rPr>
+                <w:b w:val="false"/>
+                <w:bCs w:val="false"/>
+                <w:sz w:val="19"/>
+                <w:szCs w:val="19"/>
+              </w:rPr>
+              <w:t xml:space="preserve">N—1 GameRoute · N—1 Zone</w:t>
+            </w:r>
+          </w:p>
+        </w:tc>
+      </w:tr>
+      <w:tr>
+        <w:tc>
+          <w:tcPr>
+            <w:tcW w:type="dxa" w:w="1701"/>
+            <w:tcBorders>
+              <w:top w:val="none" w:color="FFFFFF" w:sz="0"/>
+              <w:left w:val="none" w:color="FFFFFF" w:sz="0"/>
+              <w:bottom w:val="single" w:color="E0D5BB" w:sz="2"/>
+              <w:right w:val="none" w:color="FFFFFF" w:sz="0"/>
+            </w:tcBorders>
+            <w:tcMar>
+              <w:top w:type="dxa" w:w="70"/>
+              <w:left w:type="dxa" w:w="60"/>
+              <w:bottom w:type="dxa" w:w="70"/>
+              <w:right w:type="dxa" w:w="120"/>
+            </w:tcMar>
+          </w:tcPr>
+          <w:p>
+            <w:pPr>
+              <w:spacing w:after="0" w:line="264"/>
+            </w:pPr>
+            <w:r>
+              <w:rPr>
+                <w:b w:val="false"/>
+                <w:bCs w:val="false"/>
+                <w:sz w:val="19"/>
+                <w:szCs w:val="19"/>
+              </w:rPr>
+              <w:t xml:space="preserve">Zone</w:t>
+            </w:r>
+          </w:p>
+        </w:tc>
+        <w:tc>
+          <w:tcPr>
+            <w:tcW w:type="dxa" w:w="4536"/>
+            <w:tcBorders>
+              <w:top w:val="none" w:color="FFFFFF" w:sz="0"/>
+              <w:left w:val="none" w:color="FFFFFF" w:sz="0"/>
+              <w:bottom w:val="single" w:color="E0D5BB" w:sz="2"/>
+              <w:right w:val="none" w:color="FFFFFF" w:sz="0"/>
+            </w:tcBorders>
+            <w:tcMar>
+              <w:top w:type="dxa" w:w="70"/>
+              <w:left w:type="dxa" w:w="60"/>
+              <w:bottom w:type="dxa" w:w="70"/>
+              <w:right w:type="dxa" w:w="120"/>
+            </w:tcMar>
+          </w:tcPr>
+          <w:p>
+            <w:pPr>
+              <w:spacing w:after="0" w:line="264"/>
+            </w:pPr>
+            <w:r>
+              <w:rPr>
+                <w:b w:val="false"/>
+                <w:bCs w:val="false"/>
+                <w:sz w:val="19"/>
+                <w:szCs w:val="19"/>
+              </w:rPr>
+              <w:t xml:space="preserve">Carte du jeu : nom, tier, type</w:t>
+            </w:r>
+          </w:p>
+        </w:tc>
+        <w:tc>
+          <w:tcPr>
+            <w:tcW w:type="dxa" w:w="2835"/>
+            <w:tcBorders>
+              <w:top w:val="none" w:color="FFFFFF" w:sz="0"/>
+              <w:left w:val="none" w:color="FFFFFF" w:sz="0"/>
+              <w:bottom w:val="single" w:color="E0D5BB" w:sz="2"/>
+              <w:right w:val="none" w:color="FFFFFF" w:sz="0"/>
+            </w:tcBorders>
+            <w:tcMar>
+              <w:top w:type="dxa" w:w="70"/>
+              <w:left w:type="dxa" w:w="60"/>
+              <w:bottom w:type="dxa" w:w="70"/>
+              <w:right w:type="dxa" w:w="120"/>
+            </w:tcMar>
+          </w:tcPr>
+          <w:p>
+            <w:pPr>
+              <w:spacing w:after="0" w:line="264"/>
+            </w:pPr>
+            <w:r>
+              <w:rPr>
+                <w:b w:val="false"/>
+                <w:bCs w:val="false"/>
+                <w:sz w:val="19"/>
+                <w:szCs w:val="19"/>
+              </w:rPr>
+              <w:t xml:space="preserve">1—N Marker / Resource / Mob</w:t>
+            </w:r>
+          </w:p>
+        </w:tc>
+      </w:tr>
+      <w:tr>
+        <w:tc>
+          <w:tcPr>
+            <w:tcW w:type="dxa" w:w="1701"/>
+            <w:tcBorders>
+              <w:top w:val="none" w:color="FFFFFF" w:sz="0"/>
+              <w:left w:val="none" w:color="FFFFFF" w:sz="0"/>
+              <w:bottom w:val="single" w:color="E0D5BB" w:sz="2"/>
+              <w:right w:val="none" w:color="FFFFFF" w:sz="0"/>
+            </w:tcBorders>
+            <w:tcMar>
+              <w:top w:type="dxa" w:w="70"/>
+              <w:left w:type="dxa" w:w="60"/>
+              <w:bottom w:type="dxa" w:w="70"/>
+              <w:right w:type="dxa" w:w="120"/>
+            </w:tcMar>
+          </w:tcPr>
+          <w:p>
+            <w:pPr>
+              <w:spacing w:after="0" w:line="264"/>
+            </w:pPr>
+            <w:r>
+              <w:rPr>
+                <w:b w:val="false"/>
+                <w:bCs w:val="false"/>
+                <w:sz w:val="19"/>
+                <w:szCs w:val="19"/>
+              </w:rPr>
+              <w:t xml:space="preserve">Marker / Resource / Mob</w:t>
+            </w:r>
+          </w:p>
+        </w:tc>
+        <w:tc>
+          <w:tcPr>
+            <w:tcW w:type="dxa" w:w="4536"/>
+            <w:tcBorders>
+              <w:top w:val="none" w:color="FFFFFF" w:sz="0"/>
+              <w:left w:val="none" w:color="FFFFFF" w:sz="0"/>
+              <w:bottom w:val="single" w:color="E0D5BB" w:sz="2"/>
+              <w:right w:val="none" w:color="FFFFFF" w:sz="0"/>
+            </w:tcBorders>
+            <w:tcMar>
+              <w:top w:type="dxa" w:w="70"/>
+              <w:left w:type="dxa" w:w="60"/>
+              <w:bottom w:type="dxa" w:w="70"/>
+              <w:right w:type="dxa" w:w="120"/>
+            </w:tcMar>
+          </w:tcPr>
+          <w:p>
+            <w:pPr>
+              <w:spacing w:after="0" w:line="264"/>
+            </w:pPr>
+            <w:r>
+              <w:rPr>
+                <w:b w:val="false"/>
+                <w:bCs w:val="false"/>
+                <w:sz w:val="19"/>
+                <w:szCs w:val="19"/>
+              </w:rPr>
+              <w:t xml:space="preserve">Points d'intérêt d'une zone : coffres, ressources, créatures</w:t>
+            </w:r>
+          </w:p>
+        </w:tc>
+        <w:tc>
+          <w:tcPr>
+            <w:tcW w:type="dxa" w:w="2835"/>
+            <w:tcBorders>
+              <w:top w:val="none" w:color="FFFFFF" w:sz="0"/>
+              <w:left w:val="none" w:color="FFFFFF" w:sz="0"/>
+              <w:bottom w:val="single" w:color="E0D5BB" w:sz="2"/>
+              <w:right w:val="none" w:color="FFFFFF" w:sz="0"/>
+            </w:tcBorders>
+            <w:tcMar>
+              <w:top w:type="dxa" w:w="70"/>
+              <w:left w:type="dxa" w:w="60"/>
+              <w:bottom w:type="dxa" w:w="70"/>
+              <w:right w:type="dxa" w:w="120"/>
+            </w:tcMar>
+          </w:tcPr>
+          <w:p>
+            <w:pPr>
+              <w:spacing w:after="0" w:line="264"/>
+            </w:pPr>
+            <w:r>
+              <w:rPr>
+                <w:b w:val="false"/>
+                <w:bCs w:val="false"/>
+                <w:sz w:val="19"/>
+                <w:szCs w:val="19"/>
+              </w:rPr>
+              <w:t xml:space="preserve">N—1 Zone</w:t>
+            </w:r>
+          </w:p>
+        </w:tc>
+      </w:tr>
+      <w:tr>
+        <w:tc>
+          <w:tcPr>
+            <w:tcW w:type="dxa" w:w="1701"/>
+            <w:tcBorders>
+              <w:top w:val="none" w:color="FFFFFF" w:sz="0"/>
+              <w:left w:val="none" w:color="FFFFFF" w:sz="0"/>
+              <w:bottom w:val="single" w:color="E0D5BB" w:sz="2"/>
+              <w:right w:val="none" w:color="FFFFFF" w:sz="0"/>
+            </w:tcBorders>
+            <w:tcMar>
+              <w:top w:type="dxa" w:w="70"/>
+              <w:left w:type="dxa" w:w="60"/>
+              <w:bottom w:type="dxa" w:w="70"/>
+              <w:right w:type="dxa" w:w="120"/>
+            </w:tcMar>
+          </w:tcPr>
+          <w:p>
+            <w:pPr>
+              <w:spacing w:after="0" w:line="264"/>
+            </w:pPr>
+            <w:r>
+              <w:rPr>
+                <w:b w:val="false"/>
+                <w:bCs w:val="false"/>
+                <w:sz w:val="19"/>
+                <w:szCs w:val="19"/>
+              </w:rPr>
+              <w:t xml:space="preserve">Composition</w:t>
+            </w:r>
+          </w:p>
+        </w:tc>
+        <w:tc>
+          <w:tcPr>
+            <w:tcW w:type="dxa" w:w="4536"/>
+            <w:tcBorders>
+              <w:top w:val="none" w:color="FFFFFF" w:sz="0"/>
+              <w:left w:val="none" w:color="FFFFFF" w:sz="0"/>
+              <w:bottom w:val="single" w:color="E0D5BB" w:sz="2"/>
+              <w:right w:val="none" w:color="FFFFFF" w:sz="0"/>
+            </w:tcBorders>
+            <w:tcMar>
+              <w:top w:type="dxa" w:w="70"/>
+              <w:left w:type="dxa" w:w="60"/>
+              <w:bottom w:type="dxa" w:w="70"/>
+              <w:right w:type="dxa" w:w="120"/>
+            </w:tcMar>
+          </w:tcPr>
+          <w:p>
+            <w:pPr>
+              <w:spacing w:after="0" w:line="264"/>
+            </w:pPr>
+            <w:r>
+              <w:rPr>
+                <w:b w:val="false"/>
+                <w:bCs w:val="false"/>
+                <w:sz w:val="19"/>
+                <w:szCs w:val="19"/>
+              </w:rPr>
+              <w:t xml:space="preserve">Composition d'équipe : joueurs et équipements (JSON), visibilité, jeton de partage</w:t>
+            </w:r>
+          </w:p>
+        </w:tc>
+        <w:tc>
+          <w:tcPr>
+            <w:tcW w:type="dxa" w:w="2835"/>
+            <w:tcBorders>
+              <w:top w:val="none" w:color="FFFFFF" w:sz="0"/>
+              <w:left w:val="none" w:color="FFFFFF" w:sz="0"/>
+              <w:bottom w:val="single" w:color="E0D5BB" w:sz="2"/>
+              <w:right w:val="none" w:color="FFFFFF" w:sz="0"/>
+            </w:tcBorders>
+            <w:tcMar>
+              <w:top w:type="dxa" w:w="70"/>
+              <w:left w:type="dxa" w:w="60"/>
+              <w:bottom w:type="dxa" w:w="70"/>
+              <w:right w:type="dxa" w:w="120"/>
+            </w:tcMar>
+          </w:tcPr>
+          <w:p>
+            <w:pPr>
+              <w:spacing w:after="0" w:line="264"/>
+            </w:pPr>
+            <w:r>
+              <w:rPr>
+                <w:b w:val="false"/>
+                <w:bCs w:val="false"/>
+                <w:sz w:val="19"/>
+                <w:szCs w:val="19"/>
+              </w:rPr>
+              <w:t xml:space="preserve">N—1 User</w:t>
+            </w:r>
+          </w:p>
+        </w:tc>
+      </w:tr>
+      <w:tr>
+        <w:tc>
+          <w:tcPr>
+            <w:tcW w:type="dxa" w:w="1701"/>
+            <w:tcBorders>
+              <w:top w:val="none" w:color="FFFFFF" w:sz="0"/>
+              <w:left w:val="none" w:color="FFFFFF" w:sz="0"/>
+              <w:bottom w:val="single" w:color="E0D5BB" w:sz="2"/>
+              <w:right w:val="none" w:color="FFFFFF" w:sz="0"/>
+            </w:tcBorders>
+            <w:tcMar>
+              <w:top w:type="dxa" w:w="70"/>
+              <w:left w:type="dxa" w:w="60"/>
+              <w:bottom w:type="dxa" w:w="70"/>
+              <w:right w:type="dxa" w:w="120"/>
+            </w:tcMar>
+          </w:tcPr>
+          <w:p>
+            <w:pPr>
+              <w:spacing w:after="0" w:line="264"/>
+            </w:pPr>
+            <w:r>
+              <w:rPr>
+                <w:b w:val="false"/>
+                <w:bCs w:val="false"/>
+                <w:sz w:val="19"/>
+                <w:szCs w:val="19"/>
+              </w:rPr>
+              <w:t xml:space="preserve">Item</w:t>
+            </w:r>
+          </w:p>
+        </w:tc>
+        <w:tc>
+          <w:tcPr>
+            <w:tcW w:type="dxa" w:w="4536"/>
+            <w:tcBorders>
+              <w:top w:val="none" w:color="FFFFFF" w:sz="0"/>
+              <w:left w:val="none" w:color="FFFFFF" w:sz="0"/>
+              <w:bottom w:val="single" w:color="E0D5BB" w:sz="2"/>
+              <w:right w:val="none" w:color="FFFFFF" w:sz="0"/>
+            </w:tcBorders>
+            <w:tcMar>
+              <w:top w:type="dxa" w:w="70"/>
+              <w:left w:type="dxa" w:w="60"/>
+              <w:bottom w:type="dxa" w:w="70"/>
+              <w:right w:type="dxa" w:w="120"/>
+            </w:tcMar>
+          </w:tcPr>
+          <w:p>
+            <w:pPr>
+              <w:spacing w:after="0" w:line="264"/>
+            </w:pPr>
+            <w:r>
+              <w:rPr>
+                <w:b w:val="false"/>
+                <w:bCs w:val="false"/>
+                <w:sz w:val="19"/>
+                <w:szCs w:val="19"/>
+              </w:rPr>
+              <w:t xml:space="preserve">12 066 objets du jeu synchronisés, noms localisés (JSON)</w:t>
+            </w:r>
+          </w:p>
+        </w:tc>
+        <w:tc>
+          <w:tcPr>
+            <w:tcW w:type="dxa" w:w="2835"/>
+            <w:tcBorders>
+              <w:top w:val="none" w:color="FFFFFF" w:sz="0"/>
+              <w:left w:val="none" w:color="FFFFFF" w:sz="0"/>
+              <w:bottom w:val="single" w:color="E0D5BB" w:sz="2"/>
+              <w:right w:val="none" w:color="FFFFFF" w:sz="0"/>
+            </w:tcBorders>
+            <w:tcMar>
+              <w:top w:type="dxa" w:w="70"/>
+              <w:left w:type="dxa" w:w="60"/>
+              <w:bottom w:type="dxa" w:w="70"/>
+              <w:right w:type="dxa" w:w="120"/>
+            </w:tcMar>
+          </w:tcPr>
+          <w:p>
+            <w:pPr>
+              <w:spacing w:after="0" w:line="264"/>
+            </w:pPr>
+            <w:r>
+              <w:rPr>
+                <w:b w:val="false"/>
+                <w:bCs w:val="false"/>
+                <w:sz w:val="19"/>
+                <w:szCs w:val="19"/>
+              </w:rPr>
+              <w:t xml:space="preserve">1—N ItemMarketData</w:t>
+            </w:r>
+          </w:p>
+        </w:tc>
+      </w:tr>
+      <w:tr>
+        <w:tc>
+          <w:tcPr>
+            <w:tcW w:type="dxa" w:w="1701"/>
+            <w:tcBorders>
+              <w:top w:val="none" w:color="FFFFFF" w:sz="0"/>
+              <w:left w:val="none" w:color="FFFFFF" w:sz="0"/>
+              <w:bottom w:val="single" w:color="E0D5BB" w:sz="2"/>
+              <w:right w:val="none" w:color="FFFFFF" w:sz="0"/>
+            </w:tcBorders>
+            <w:tcMar>
+              <w:top w:type="dxa" w:w="70"/>
+              <w:left w:type="dxa" w:w="60"/>
+              <w:bottom w:type="dxa" w:w="70"/>
+              <w:right w:type="dxa" w:w="120"/>
+            </w:tcMar>
+          </w:tcPr>
+          <w:p>
+            <w:pPr>
+              <w:spacing w:after="0" w:line="264"/>
+            </w:pPr>
+            <w:r>
+              <w:rPr>
+                <w:b w:val="false"/>
+                <w:bCs w:val="false"/>
+                <w:sz w:val="19"/>
+                <w:szCs w:val="19"/>
+              </w:rPr>
+              <w:t xml:space="preserve">ItemMarketData</w:t>
+            </w:r>
+          </w:p>
+        </w:tc>
+        <w:tc>
+          <w:tcPr>
+            <w:tcW w:type="dxa" w:w="4536"/>
+            <w:tcBorders>
+              <w:top w:val="none" w:color="FFFFFF" w:sz="0"/>
+              <w:left w:val="none" w:color="FFFFFF" w:sz="0"/>
+              <w:bottom w:val="single" w:color="E0D5BB" w:sz="2"/>
+              <w:right w:val="none" w:color="FFFFFF" w:sz="0"/>
+            </w:tcBorders>
+            <w:tcMar>
+              <w:top w:type="dxa" w:w="70"/>
+              <w:left w:type="dxa" w:w="60"/>
+              <w:bottom w:type="dxa" w:w="70"/>
+              <w:right w:type="dxa" w:w="120"/>
+            </w:tcMar>
+          </w:tcPr>
+          <w:p>
+            <w:pPr>
+              <w:spacing w:after="0" w:line="264"/>
+            </w:pPr>
+            <w:r>
+              <w:rPr>
+                <w:b w:val="false"/>
+                <w:bCs w:val="false"/>
+                <w:sz w:val="19"/>
+                <w:szCs w:val="19"/>
+              </w:rPr>
+              <w:t xml:space="preserve">Prix de marché par ville et qualité, horodatés</w:t>
+            </w:r>
+          </w:p>
+        </w:tc>
+        <w:tc>
+          <w:tcPr>
+            <w:tcW w:type="dxa" w:w="2835"/>
+            <w:tcBorders>
+              <w:top w:val="none" w:color="FFFFFF" w:sz="0"/>
+              <w:left w:val="none" w:color="FFFFFF" w:sz="0"/>
+              <w:bottom w:val="single" w:color="E0D5BB" w:sz="2"/>
+              <w:right w:val="none" w:color="FFFFFF" w:sz="0"/>
+            </w:tcBorders>
+            <w:tcMar>
+              <w:top w:type="dxa" w:w="70"/>
+              <w:left w:type="dxa" w:w="60"/>
+              <w:bottom w:type="dxa" w:w="70"/>
+              <w:right w:type="dxa" w:w="120"/>
+            </w:tcMar>
+          </w:tcPr>
+          <w:p>
+            <w:pPr>
+              <w:spacing w:after="0" w:line="264"/>
+            </w:pPr>
+            <w:r>
+              <w:rPr>
+                <w:b w:val="false"/>
+                <w:bCs w:val="false"/>
+                <w:sz w:val="19"/>
+                <w:szCs w:val="19"/>
+              </w:rPr>
+              <w:t xml:space="preserve">N—1 Item</w:t>
+            </w:r>
+          </w:p>
+        </w:tc>
+      </w:tr>
+      <w:tr>
+        <w:tc>
+          <w:tcPr>
+            <w:tcW w:type="dxa" w:w="1701"/>
+            <w:tcBorders>
+              <w:top w:val="none" w:color="FFFFFF" w:sz="0"/>
+              <w:left w:val="none" w:color="FFFFFF" w:sz="0"/>
+              <w:bottom w:val="single" w:color="E0D5BB" w:sz="2"/>
+              <w:right w:val="none" w:color="FFFFFF" w:sz="0"/>
+            </w:tcBorders>
+            <w:tcMar>
+              <w:top w:type="dxa" w:w="70"/>
+              <w:left w:type="dxa" w:w="60"/>
+              <w:bottom w:type="dxa" w:w="70"/>
+              <w:right w:type="dxa" w:w="120"/>
+            </w:tcMar>
+          </w:tcPr>
+          <w:p>
+            <w:pPr>
+              <w:spacing w:after="0" w:line="264"/>
+            </w:pPr>
+            <w:r>
+              <w:rPr>
+                <w:b w:val="false"/>
+                <w:bCs w:val="false"/>
+                <w:sz w:val="19"/>
+                <w:szCs w:val="19"/>
+              </w:rPr>
+              <w:t xml:space="preserve">CraftingRecipe(-Ingredient)</w:t>
+            </w:r>
+          </w:p>
+        </w:tc>
+        <w:tc>
+          <w:tcPr>
+            <w:tcW w:type="dxa" w:w="4536"/>
+            <w:tcBorders>
+              <w:top w:val="none" w:color="FFFFFF" w:sz="0"/>
+              <w:left w:val="none" w:color="FFFFFF" w:sz="0"/>
+              <w:bottom w:val="single" w:color="E0D5BB" w:sz="2"/>
+              <w:right w:val="none" w:color="FFFFFF" w:sz="0"/>
+            </w:tcBorders>
+            <w:tcMar>
+              <w:top w:type="dxa" w:w="70"/>
+              <w:left w:type="dxa" w:w="60"/>
+              <w:bottom w:type="dxa" w:w="70"/>
+              <w:right w:type="dxa" w:w="120"/>
+            </w:tcMar>
+          </w:tcPr>
+          <w:p>
+            <w:pPr>
+              <w:spacing w:after="0" w:line="264"/>
+            </w:pPr>
+            <w:r>
+              <w:rPr>
+                <w:b w:val="false"/>
+                <w:bCs w:val="false"/>
+                <w:sz w:val="19"/>
+                <w:szCs w:val="19"/>
+              </w:rPr>
+              <w:t xml:space="preserve">Recettes de craft et leurs ingrédients quantifiés</w:t>
+            </w:r>
+          </w:p>
+        </w:tc>
+        <w:tc>
+          <w:tcPr>
+            <w:tcW w:type="dxa" w:w="2835"/>
+            <w:tcBorders>
+              <w:top w:val="none" w:color="FFFFFF" w:sz="0"/>
+              <w:left w:val="none" w:color="FFFFFF" w:sz="0"/>
+              <w:bottom w:val="single" w:color="E0D5BB" w:sz="2"/>
+              <w:right w:val="none" w:color="FFFFFF" w:sz="0"/>
+            </w:tcBorders>
+            <w:tcMar>
+              <w:top w:type="dxa" w:w="70"/>
+              <w:left w:type="dxa" w:w="60"/>
+              <w:bottom w:type="dxa" w:w="70"/>
+              <w:right w:type="dxa" w:w="120"/>
+            </w:tcMar>
+          </w:tcPr>
+          <w:p>
+            <w:pPr>
+              <w:spacing w:after="0" w:line="264"/>
+            </w:pPr>
+            <w:r>
+              <w:rPr>
+                <w:b w:val="false"/>
+                <w:bCs w:val="false"/>
+                <w:sz w:val="19"/>
+                <w:szCs w:val="19"/>
+              </w:rPr>
+              <w:t xml:space="preserve">1—N ingrédients, N—1 Item</w:t>
+            </w:r>
+          </w:p>
+        </w:tc>
+      </w:tr>
+      <w:tr>
+        <w:tc>
+          <w:tcPr>
+            <w:tcW w:type="dxa" w:w="1701"/>
+            <w:tcBorders>
+              <w:top w:val="none" w:color="FFFFFF" w:sz="0"/>
+              <w:left w:val="none" w:color="FFFFFF" w:sz="0"/>
+              <w:bottom w:val="single" w:color="8B6914" w:sz="10"/>
+              <w:right w:val="none" w:color="FFFFFF" w:sz="0"/>
+            </w:tcBorders>
+            <w:tcMar>
+              <w:top w:type="dxa" w:w="70"/>
+              <w:left w:type="dxa" w:w="60"/>
+              <w:bottom w:type="dxa" w:w="70"/>
+              <w:right w:type="dxa" w:w="120"/>
+            </w:tcMar>
+          </w:tcPr>
+          <w:p>
+            <w:pPr>
+              <w:spacing w:after="0" w:line="264"/>
+            </w:pPr>
+            <w:r>
+              <w:rPr>
+                <w:b w:val="false"/>
+                <w:bCs w:val="false"/>
+                <w:sz w:val="19"/>
+                <w:szCs w:val="19"/>
+              </w:rPr>
+              <w:t xml:space="preserve">SearchLog</w:t>
+            </w:r>
+          </w:p>
+        </w:tc>
+        <w:tc>
+          <w:tcPr>
+            <w:tcW w:type="dxa" w:w="4536"/>
+            <w:tcBorders>
+              <w:top w:val="none" w:color="FFFFFF" w:sz="0"/>
+              <w:left w:val="none" w:color="FFFFFF" w:sz="0"/>
+              <w:bottom w:val="single" w:color="8B6914" w:sz="10"/>
+              <w:right w:val="none" w:color="FFFFFF" w:sz="0"/>
+            </w:tcBorders>
+            <w:tcMar>
+              <w:top w:type="dxa" w:w="70"/>
+              <w:left w:type="dxa" w:w="60"/>
+              <w:bottom w:type="dxa" w:w="70"/>
+              <w:right w:type="dxa" w:w="120"/>
+            </w:tcMar>
+          </w:tcPr>
+          <w:p>
+            <w:pPr>
+              <w:spacing w:after="0" w:line="264"/>
+            </w:pPr>
+            <w:r>
+              <w:rPr>
+                <w:b w:val="false"/>
+                <w:bCs w:val="false"/>
+                <w:sz w:val="19"/>
+                <w:szCs w:val="19"/>
+              </w:rPr>
+              <w:t xml:space="preserve">Journal des recherches (alimente les KPI de l'administration)</w:t>
+            </w:r>
+          </w:p>
+        </w:tc>
+        <w:tc>
+          <w:tcPr>
+            <w:tcW w:type="dxa" w:w="2835"/>
+            <w:tcBorders>
+              <w:top w:val="none" w:color="FFFFFF" w:sz="0"/>
+              <w:left w:val="none" w:color="FFFFFF" w:sz="0"/>
+              <w:bottom w:val="single" w:color="8B6914" w:sz="10"/>
+              <w:right w:val="none" w:color="FFFFFF" w:sz="0"/>
+            </w:tcBorders>
+            <w:tcMar>
+              <w:top w:type="dxa" w:w="70"/>
+              <w:left w:type="dxa" w:w="60"/>
+              <w:bottom w:type="dxa" w:w="70"/>
+              <w:right w:type="dxa" w:w="120"/>
+            </w:tcMar>
+          </w:tcPr>
+          <w:p>
+            <w:pPr>
+              <w:spacing w:after="0" w:line="264"/>
+            </w:pPr>
+            <w:r>
+              <w:rPr>
+                <w:b w:val="false"/>
+                <w:bCs w:val="false"/>
+                <w:sz w:val="19"/>
+                <w:szCs w:val="19"/>
+              </w:rPr>
+              <w:t xml:space="preserve">—</w:t>
+            </w:r>
+          </w:p>
+        </w:tc>
+      </w:tr>
+    </w:tbl>
     <w:p>
       <w:pPr>
         <w:pStyle w:val="Heading1"/>
@@ -7963,6 +9152,271 @@
     <w:p>
       <w:pPr>
         <w:spacing w:after="140" w:before="60" w:line="330"/>
+        <w:jc w:val="both"/>
+      </w:pPr>
+      <w:r>
+        <w:rPr>
+          <w:b w:val="false"/>
+          <w:bCs w:val="false"/>
+          <w:i w:val="false"/>
+          <w:iCs w:val="false"/>
+          <w:sz w:val="22"/>
+          <w:szCs w:val="22"/>
+        </w:rPr>
+        <w:t xml:space="preserve">Exemple réel — le scénario nominal d'inscription, exécuté contre l'API complète (WebTestCase, base SQLite dédiée) :</w:t>
+      </w:r>
+    </w:p>
+    <w:tbl>
+      <w:tblPr>
+        <w:tblW w:type="dxa" w:w="9072"/>
+        <w:tblBorders>
+          <w:top w:val="single" w:color="auto" w:sz="4"/>
+          <w:left w:val="single" w:color="auto" w:sz="4"/>
+          <w:bottom w:val="single" w:color="auto" w:sz="4"/>
+          <w:right w:val="single" w:color="auto" w:sz="4"/>
+          <w:insideH w:val="single" w:color="auto" w:sz="4"/>
+          <w:insideV w:val="single" w:color="auto" w:sz="4"/>
+        </w:tblBorders>
+      </w:tblPr>
+      <w:tblGrid>
+        <w:gridCol w:w="9072"/>
+      </w:tblGrid>
+      <w:tr>
+        <w:tc>
+          <w:tcPr>
+            <w:tcW w:type="dxa" w:w="9072"/>
+            <w:tcBorders>
+              <w:top w:val="single" w:color="E0D5BB" w:sz="2"/>
+              <w:left w:val="single" w:color="E0D5BB" w:sz="2"/>
+              <w:bottom w:val="single" w:color="E0D5BB" w:sz="2"/>
+              <w:right w:val="single" w:color="E0D5BB" w:sz="2"/>
+            </w:tcBorders>
+            <w:shd w:fill="FAF6EC" w:val="clear"/>
+            <w:tcMar>
+              <w:top w:type="dxa" w:w="90"/>
+              <w:left w:type="dxa" w:w="140"/>
+              <w:bottom w:type="dxa" w:w="90"/>
+              <w:right w:type="dxa" w:w="140"/>
+            </w:tcMar>
+          </w:tcPr>
+          <w:p>
+            <w:pPr>
+              <w:spacing w:after="0" w:line="230"/>
+            </w:pPr>
+            <w:r>
+              <w:rPr>
+                <w:rFonts w:ascii="Courier New" w:cs="Courier New" w:eastAsia="Courier New" w:hAnsi="Courier New"/>
+                <w:color w:val="3A2E15"/>
+                <w:sz w:val="16"/>
+                <w:szCs w:val="16"/>
+              </w:rPr>
+              <w:t xml:space="preserve">public function testRegisterSuccess(): void</w:t>
+            </w:r>
+          </w:p>
+          <w:p>
+            <w:pPr>
+              <w:spacing w:after="0" w:line="230"/>
+            </w:pPr>
+            <w:r>
+              <w:rPr>
+                <w:rFonts w:ascii="Courier New" w:cs="Courier New" w:eastAsia="Courier New" w:hAnsi="Courier New"/>
+                <w:color w:val="3A2E15"/>
+                <w:sz w:val="16"/>
+                <w:szCs w:val="16"/>
+              </w:rPr>
+              <w:t xml:space="preserve">{</w:t>
+            </w:r>
+          </w:p>
+          <w:p>
+            <w:pPr>
+              <w:spacing w:after="0" w:line="230"/>
+            </w:pPr>
+            <w:r>
+              <w:rPr>
+                <w:rFonts w:ascii="Courier New" w:cs="Courier New" w:eastAsia="Courier New" w:hAnsi="Courier New"/>
+                <w:color w:val="3A2E15"/>
+                <w:sz w:val="16"/>
+                <w:szCs w:val="16"/>
+              </w:rPr>
+              <w:t xml:space="preserve">    $client = static::createClient();</w:t>
+            </w:r>
+          </w:p>
+          <w:p>
+            <w:pPr>
+              <w:spacing w:after="0" w:line="230"/>
+            </w:pPr>
+            <w:r>
+              <w:rPr>
+                <w:rFonts w:ascii="Courier New" w:cs="Courier New" w:eastAsia="Courier New" w:hAnsi="Courier New"/>
+                <w:color w:val="3A2E15"/>
+                <w:sz w:val="16"/>
+                <w:szCs w:val="16"/>
+              </w:rPr>
+              <w:t xml:space="preserve">    $username = 'testuser_' . uniqid();</w:t>
+            </w:r>
+          </w:p>
+          <w:p>
+            <w:pPr>
+              <w:spacing w:after="0" w:line="230"/>
+            </w:pPr>
+            <w:r>
+              <w:rPr>
+                <w:rFonts w:ascii="Courier New" w:cs="Courier New" w:eastAsia="Courier New" w:hAnsi="Courier New"/>
+                <w:color w:val="3A2E15"/>
+                <w:sz w:val="16"/>
+                <w:szCs w:val="16"/>
+              </w:rPr>
+              <w:t xml:space="preserve"> </w:t>
+            </w:r>
+          </w:p>
+          <w:p>
+            <w:pPr>
+              <w:spacing w:after="0" w:line="230"/>
+            </w:pPr>
+            <w:r>
+              <w:rPr>
+                <w:rFonts w:ascii="Courier New" w:cs="Courier New" w:eastAsia="Courier New" w:hAnsi="Courier New"/>
+                <w:color w:val="3A2E15"/>
+                <w:sz w:val="16"/>
+                <w:szCs w:val="16"/>
+              </w:rPr>
+              <w:t xml:space="preserve">    $client-&gt;request('POST', '/api/register', [], [],</w:t>
+            </w:r>
+          </w:p>
+          <w:p>
+            <w:pPr>
+              <w:spacing w:after="0" w:line="230"/>
+            </w:pPr>
+            <w:r>
+              <w:rPr>
+                <w:rFonts w:ascii="Courier New" w:cs="Courier New" w:eastAsia="Courier New" w:hAnsi="Courier New"/>
+                <w:color w:val="3A2E15"/>
+                <w:sz w:val="16"/>
+                <w:szCs w:val="16"/>
+              </w:rPr>
+              <w:t xml:space="preserve">        ['CONTENT_TYPE' =&gt; 'application/json'],</w:t>
+            </w:r>
+          </w:p>
+          <w:p>
+            <w:pPr>
+              <w:spacing w:after="0" w:line="230"/>
+            </w:pPr>
+            <w:r>
+              <w:rPr>
+                <w:rFonts w:ascii="Courier New" w:cs="Courier New" w:eastAsia="Courier New" w:hAnsi="Courier New"/>
+                <w:color w:val="3A2E15"/>
+                <w:sz w:val="16"/>
+                <w:szCs w:val="16"/>
+              </w:rPr>
+              <w:t xml:space="preserve">        json_encode(['username' =&gt; $username, 'password' =&gt; 'password123'])</w:t>
+            </w:r>
+          </w:p>
+          <w:p>
+            <w:pPr>
+              <w:spacing w:after="0" w:line="230"/>
+            </w:pPr>
+            <w:r>
+              <w:rPr>
+                <w:rFonts w:ascii="Courier New" w:cs="Courier New" w:eastAsia="Courier New" w:hAnsi="Courier New"/>
+                <w:color w:val="3A2E15"/>
+                <w:sz w:val="16"/>
+                <w:szCs w:val="16"/>
+              </w:rPr>
+              <w:t xml:space="preserve">    );</w:t>
+            </w:r>
+          </w:p>
+          <w:p>
+            <w:pPr>
+              <w:spacing w:after="0" w:line="230"/>
+            </w:pPr>
+            <w:r>
+              <w:rPr>
+                <w:rFonts w:ascii="Courier New" w:cs="Courier New" w:eastAsia="Courier New" w:hAnsi="Courier New"/>
+                <w:color w:val="3A2E15"/>
+                <w:sz w:val="16"/>
+                <w:szCs w:val="16"/>
+              </w:rPr>
+              <w:t xml:space="preserve"> </w:t>
+            </w:r>
+          </w:p>
+          <w:p>
+            <w:pPr>
+              <w:spacing w:after="0" w:line="230"/>
+            </w:pPr>
+            <w:r>
+              <w:rPr>
+                <w:rFonts w:ascii="Courier New" w:cs="Courier New" w:eastAsia="Courier New" w:hAnsi="Courier New"/>
+                <w:color w:val="3A2E15"/>
+                <w:sz w:val="16"/>
+                <w:szCs w:val="16"/>
+              </w:rPr>
+              <w:t xml:space="preserve">    $this-&gt;assertResponseStatusCodeSame(201);</w:t>
+            </w:r>
+          </w:p>
+          <w:p>
+            <w:pPr>
+              <w:spacing w:after="0" w:line="230"/>
+            </w:pPr>
+            <w:r>
+              <w:rPr>
+                <w:rFonts w:ascii="Courier New" w:cs="Courier New" w:eastAsia="Courier New" w:hAnsi="Courier New"/>
+                <w:color w:val="3A2E15"/>
+                <w:sz w:val="16"/>
+                <w:szCs w:val="16"/>
+              </w:rPr>
+              <w:t xml:space="preserve">    $content = json_decode($client-&gt;getResponse()-&gt;getContent(), true);</w:t>
+            </w:r>
+          </w:p>
+          <w:p>
+            <w:pPr>
+              <w:spacing w:after="0" w:line="230"/>
+            </w:pPr>
+            <w:r>
+              <w:rPr>
+                <w:rFonts w:ascii="Courier New" w:cs="Courier New" w:eastAsia="Courier New" w:hAnsi="Courier New"/>
+                <w:color w:val="3A2E15"/>
+                <w:sz w:val="16"/>
+                <w:szCs w:val="16"/>
+              </w:rPr>
+              <w:t xml:space="preserve">    $this-&gt;assertEquals('User created', $content['status']);</w:t>
+            </w:r>
+          </w:p>
+          <w:p>
+            <w:pPr>
+              <w:spacing w:after="0" w:line="230"/>
+            </w:pPr>
+            <w:r>
+              <w:rPr>
+                <w:rFonts w:ascii="Courier New" w:cs="Courier New" w:eastAsia="Courier New" w:hAnsi="Courier New"/>
+                <w:color w:val="3A2E15"/>
+                <w:sz w:val="16"/>
+                <w:szCs w:val="16"/>
+              </w:rPr>
+              <w:t xml:space="preserve">}</w:t>
+            </w:r>
+          </w:p>
+        </w:tc>
+      </w:tr>
+    </w:tbl>
+    <w:p>
+      <w:pPr>
+        <w:spacing w:after="180" w:before="50"/>
+        <w:jc w:val="left"/>
+      </w:pPr>
+      <w:r>
+        <w:rPr>
+          <w:i/>
+          <w:iCs/>
+          <w:color w:val="5A4825"/>
+          <w:sz w:val="18"/>
+          <w:szCs w:val="18"/>
+        </w:rPr>
+        <w:t xml:space="preserve">Extrait de back/tests/Controller/AuthControllerTest.php — les sorties complètes des deux suites figurent en annexe C.</w:t>
+      </w:r>
+    </w:p>
+    <w:p>
+      <w:pPr>
+        <w:spacing w:after="140" w:before="0" w:line="330"/>
         <w:jc w:val="both"/>
       </w:pPr>
       <w:r>
@@ -22249,6 +23703,2245 @@
         <w:t xml:space="preserve">Axes d'amélioration identifiés pour la suite : migration des jetons vers des cookies httpOnly, finalisation des contrastes du tableau de craft (OBS-01), sortie de Create React App vers Vite pour assainir les dépendances de build, et extension de la couverture de tests aux modules v3 (batailles, multi-serveur côté API).</w:t>
       </w:r>
     </w:p>
+    <w:p>
+      <w:r>
+        <w:br w:type="page"/>
+      </w:r>
+    </w:p>
+    <w:p>
+      <w:pPr>
+        <w:pStyle w:val="Heading1"/>
+      </w:pPr>
+      <w:r>
+        <w:t xml:space="preserve">Annexe A — Extraits de code représentatifs</w:t>
+      </w:r>
+    </w:p>
+    <w:p>
+      <w:pPr>
+        <w:spacing w:after="140" w:before="0" w:line="330"/>
+        <w:jc w:val="both"/>
+      </w:pPr>
+      <w:r>
+        <w:rPr>
+          <w:b w:val="false"/>
+          <w:bCs w:val="false"/>
+          <w:i w:val="false"/>
+          <w:iCs w:val="false"/>
+          <w:sz w:val="22"/>
+          <w:szCs w:val="22"/>
+        </w:rPr>
+        <w:t xml:space="preserve">Les extraits ci-dessous sont reproduits tels quels depuis le dépôt. Ils illustrent trois préoccupations transverses du Bloc 2 : la sécurisation globale des réponses, la supervision, et la protection contre la force brute.</w:t>
+      </w:r>
+    </w:p>
+    <w:p>
+      <w:pPr>
+        <w:pStyle w:val="Heading2"/>
+      </w:pPr>
+      <w:r>
+        <w:t xml:space="preserve">A.1 En-têtes de sécurité globaux (OWASP A05)</w:t>
+      </w:r>
+    </w:p>
+    <w:p>
+      <w:pPr>
+        <w:spacing w:after="140" w:before="0" w:line="330"/>
+        <w:jc w:val="both"/>
+      </w:pPr>
+      <w:r>
+        <w:rPr>
+          <w:b w:val="false"/>
+          <w:bCs w:val="false"/>
+          <w:i w:val="false"/>
+          <w:iCs w:val="false"/>
+          <w:sz w:val="22"/>
+          <w:szCs w:val="22"/>
+        </w:rPr>
+        <w:t xml:space="preserve">Un EventSubscriber Symfony pose les en-têtes sur toutes les réponses de l'API — impossible d'oublier une route :</w:t>
+      </w:r>
+    </w:p>
+    <w:tbl>
+      <w:tblPr>
+        <w:tblW w:type="dxa" w:w="9072"/>
+        <w:tblBorders>
+          <w:top w:val="single" w:color="auto" w:sz="4"/>
+          <w:left w:val="single" w:color="auto" w:sz="4"/>
+          <w:bottom w:val="single" w:color="auto" w:sz="4"/>
+          <w:right w:val="single" w:color="auto" w:sz="4"/>
+          <w:insideH w:val="single" w:color="auto" w:sz="4"/>
+          <w:insideV w:val="single" w:color="auto" w:sz="4"/>
+        </w:tblBorders>
+      </w:tblPr>
+      <w:tblGrid>
+        <w:gridCol w:w="9072"/>
+      </w:tblGrid>
+      <w:tr>
+        <w:tc>
+          <w:tcPr>
+            <w:tcW w:type="dxa" w:w="9072"/>
+            <w:tcBorders>
+              <w:top w:val="single" w:color="E0D5BB" w:sz="2"/>
+              <w:left w:val="single" w:color="E0D5BB" w:sz="2"/>
+              <w:bottom w:val="single" w:color="E0D5BB" w:sz="2"/>
+              <w:right w:val="single" w:color="E0D5BB" w:sz="2"/>
+            </w:tcBorders>
+            <w:shd w:fill="FAF6EC" w:val="clear"/>
+            <w:tcMar>
+              <w:top w:type="dxa" w:w="90"/>
+              <w:left w:type="dxa" w:w="140"/>
+              <w:bottom w:type="dxa" w:w="90"/>
+              <w:right w:type="dxa" w:w="140"/>
+            </w:tcMar>
+          </w:tcPr>
+          <w:p>
+            <w:pPr>
+              <w:spacing w:after="0" w:line="230"/>
+            </w:pPr>
+            <w:r>
+              <w:rPr>
+                <w:rFonts w:ascii="Courier New" w:cs="Courier New" w:eastAsia="Courier New" w:hAnsi="Courier New"/>
+                <w:color w:val="3A2E15"/>
+                <w:sz w:val="16"/>
+                <w:szCs w:val="16"/>
+              </w:rPr>
+              <w:t xml:space="preserve">class SecurityHeadersSubscriber implements EventSubscriberInterface</w:t>
+            </w:r>
+          </w:p>
+          <w:p>
+            <w:pPr>
+              <w:spacing w:after="0" w:line="230"/>
+            </w:pPr>
+            <w:r>
+              <w:rPr>
+                <w:rFonts w:ascii="Courier New" w:cs="Courier New" w:eastAsia="Courier New" w:hAnsi="Courier New"/>
+                <w:color w:val="3A2E15"/>
+                <w:sz w:val="16"/>
+                <w:szCs w:val="16"/>
+              </w:rPr>
+              <w:t xml:space="preserve">{</w:t>
+            </w:r>
+          </w:p>
+          <w:p>
+            <w:pPr>
+              <w:spacing w:after="0" w:line="230"/>
+            </w:pPr>
+            <w:r>
+              <w:rPr>
+                <w:rFonts w:ascii="Courier New" w:cs="Courier New" w:eastAsia="Courier New" w:hAnsi="Courier New"/>
+                <w:color w:val="3A2E15"/>
+                <w:sz w:val="16"/>
+                <w:szCs w:val="16"/>
+              </w:rPr>
+              <w:t xml:space="preserve">    public static function getSubscribedEvents(): array</w:t>
+            </w:r>
+          </w:p>
+          <w:p>
+            <w:pPr>
+              <w:spacing w:after="0" w:line="230"/>
+            </w:pPr>
+            <w:r>
+              <w:rPr>
+                <w:rFonts w:ascii="Courier New" w:cs="Courier New" w:eastAsia="Courier New" w:hAnsi="Courier New"/>
+                <w:color w:val="3A2E15"/>
+                <w:sz w:val="16"/>
+                <w:szCs w:val="16"/>
+              </w:rPr>
+              <w:t xml:space="preserve">    {</w:t>
+            </w:r>
+          </w:p>
+          <w:p>
+            <w:pPr>
+              <w:spacing w:after="0" w:line="230"/>
+            </w:pPr>
+            <w:r>
+              <w:rPr>
+                <w:rFonts w:ascii="Courier New" w:cs="Courier New" w:eastAsia="Courier New" w:hAnsi="Courier New"/>
+                <w:color w:val="3A2E15"/>
+                <w:sz w:val="16"/>
+                <w:szCs w:val="16"/>
+              </w:rPr>
+              <w:t xml:space="preserve">        return [ResponseEvent::class =&gt; 'onResponse'];</w:t>
+            </w:r>
+          </w:p>
+          <w:p>
+            <w:pPr>
+              <w:spacing w:after="0" w:line="230"/>
+            </w:pPr>
+            <w:r>
+              <w:rPr>
+                <w:rFonts w:ascii="Courier New" w:cs="Courier New" w:eastAsia="Courier New" w:hAnsi="Courier New"/>
+                <w:color w:val="3A2E15"/>
+                <w:sz w:val="16"/>
+                <w:szCs w:val="16"/>
+              </w:rPr>
+              <w:t xml:space="preserve">    }</w:t>
+            </w:r>
+          </w:p>
+          <w:p>
+            <w:pPr>
+              <w:spacing w:after="0" w:line="230"/>
+            </w:pPr>
+            <w:r>
+              <w:rPr>
+                <w:rFonts w:ascii="Courier New" w:cs="Courier New" w:eastAsia="Courier New" w:hAnsi="Courier New"/>
+                <w:color w:val="3A2E15"/>
+                <w:sz w:val="16"/>
+                <w:szCs w:val="16"/>
+              </w:rPr>
+              <w:t xml:space="preserve"> </w:t>
+            </w:r>
+          </w:p>
+          <w:p>
+            <w:pPr>
+              <w:spacing w:after="0" w:line="230"/>
+            </w:pPr>
+            <w:r>
+              <w:rPr>
+                <w:rFonts w:ascii="Courier New" w:cs="Courier New" w:eastAsia="Courier New" w:hAnsi="Courier New"/>
+                <w:color w:val="3A2E15"/>
+                <w:sz w:val="16"/>
+                <w:szCs w:val="16"/>
+              </w:rPr>
+              <w:t xml:space="preserve">    public function onResponse(ResponseEvent $event): void</w:t>
+            </w:r>
+          </w:p>
+          <w:p>
+            <w:pPr>
+              <w:spacing w:after="0" w:line="230"/>
+            </w:pPr>
+            <w:r>
+              <w:rPr>
+                <w:rFonts w:ascii="Courier New" w:cs="Courier New" w:eastAsia="Courier New" w:hAnsi="Courier New"/>
+                <w:color w:val="3A2E15"/>
+                <w:sz w:val="16"/>
+                <w:szCs w:val="16"/>
+              </w:rPr>
+              <w:t xml:space="preserve">    {</w:t>
+            </w:r>
+          </w:p>
+          <w:p>
+            <w:pPr>
+              <w:spacing w:after="0" w:line="230"/>
+            </w:pPr>
+            <w:r>
+              <w:rPr>
+                <w:rFonts w:ascii="Courier New" w:cs="Courier New" w:eastAsia="Courier New" w:hAnsi="Courier New"/>
+                <w:color w:val="3A2E15"/>
+                <w:sz w:val="16"/>
+                <w:szCs w:val="16"/>
+              </w:rPr>
+              <w:t xml:space="preserve">        if (!$event-&gt;isMainRequest()</w:t>
+            </w:r>
+          </w:p>
+          <w:p>
+            <w:pPr>
+              <w:spacing w:after="0" w:line="230"/>
+            </w:pPr>
+            <w:r>
+              <w:rPr>
+                <w:rFonts w:ascii="Courier New" w:cs="Courier New" w:eastAsia="Courier New" w:hAnsi="Courier New"/>
+                <w:color w:val="3A2E15"/>
+                <w:sz w:val="16"/>
+                <w:szCs w:val="16"/>
+              </w:rPr>
+              <w:t xml:space="preserve">            || !str_starts_with($event-&gt;getRequest()-&gt;getPathInfo(), '/api')) {</w:t>
+            </w:r>
+          </w:p>
+          <w:p>
+            <w:pPr>
+              <w:spacing w:after="0" w:line="230"/>
+            </w:pPr>
+            <w:r>
+              <w:rPr>
+                <w:rFonts w:ascii="Courier New" w:cs="Courier New" w:eastAsia="Courier New" w:hAnsi="Courier New"/>
+                <w:color w:val="3A2E15"/>
+                <w:sz w:val="16"/>
+                <w:szCs w:val="16"/>
+              </w:rPr>
+              <w:t xml:space="preserve">            return;</w:t>
+            </w:r>
+          </w:p>
+          <w:p>
+            <w:pPr>
+              <w:spacing w:after="0" w:line="230"/>
+            </w:pPr>
+            <w:r>
+              <w:rPr>
+                <w:rFonts w:ascii="Courier New" w:cs="Courier New" w:eastAsia="Courier New" w:hAnsi="Courier New"/>
+                <w:color w:val="3A2E15"/>
+                <w:sz w:val="16"/>
+                <w:szCs w:val="16"/>
+              </w:rPr>
+              <w:t xml:space="preserve">        }</w:t>
+            </w:r>
+          </w:p>
+          <w:p>
+            <w:pPr>
+              <w:spacing w:after="0" w:line="230"/>
+            </w:pPr>
+            <w:r>
+              <w:rPr>
+                <w:rFonts w:ascii="Courier New" w:cs="Courier New" w:eastAsia="Courier New" w:hAnsi="Courier New"/>
+                <w:color w:val="3A2E15"/>
+                <w:sz w:val="16"/>
+                <w:szCs w:val="16"/>
+              </w:rPr>
+              <w:t xml:space="preserve"> </w:t>
+            </w:r>
+          </w:p>
+          <w:p>
+            <w:pPr>
+              <w:spacing w:after="0" w:line="230"/>
+            </w:pPr>
+            <w:r>
+              <w:rPr>
+                <w:rFonts w:ascii="Courier New" w:cs="Courier New" w:eastAsia="Courier New" w:hAnsi="Courier New"/>
+                <w:color w:val="3A2E15"/>
+                <w:sz w:val="16"/>
+                <w:szCs w:val="16"/>
+              </w:rPr>
+              <w:t xml:space="preserve">        $headers = $event-&gt;getResponse()-&gt;headers;</w:t>
+            </w:r>
+          </w:p>
+          <w:p>
+            <w:pPr>
+              <w:spacing w:after="0" w:line="230"/>
+            </w:pPr>
+            <w:r>
+              <w:rPr>
+                <w:rFonts w:ascii="Courier New" w:cs="Courier New" w:eastAsia="Courier New" w:hAnsi="Courier New"/>
+                <w:color w:val="3A2E15"/>
+                <w:sz w:val="16"/>
+                <w:szCs w:val="16"/>
+              </w:rPr>
+              <w:t xml:space="preserve">        $headers-&gt;set('X-Content-Type-Options', 'nosniff');</w:t>
+            </w:r>
+          </w:p>
+          <w:p>
+            <w:pPr>
+              <w:spacing w:after="0" w:line="230"/>
+            </w:pPr>
+            <w:r>
+              <w:rPr>
+                <w:rFonts w:ascii="Courier New" w:cs="Courier New" w:eastAsia="Courier New" w:hAnsi="Courier New"/>
+                <w:color w:val="3A2E15"/>
+                <w:sz w:val="16"/>
+                <w:szCs w:val="16"/>
+              </w:rPr>
+              <w:t xml:space="preserve">        $headers-&gt;set('X-Frame-Options', 'DENY');</w:t>
+            </w:r>
+          </w:p>
+          <w:p>
+            <w:pPr>
+              <w:spacing w:after="0" w:line="230"/>
+            </w:pPr>
+            <w:r>
+              <w:rPr>
+                <w:rFonts w:ascii="Courier New" w:cs="Courier New" w:eastAsia="Courier New" w:hAnsi="Courier New"/>
+                <w:color w:val="3A2E15"/>
+                <w:sz w:val="16"/>
+                <w:szCs w:val="16"/>
+              </w:rPr>
+              <w:t xml:space="preserve">        $headers-&gt;set('Referrer-Policy', 'strict-origin-when-cross-origin');</w:t>
+            </w:r>
+          </w:p>
+          <w:p>
+            <w:pPr>
+              <w:spacing w:after="0" w:line="230"/>
+            </w:pPr>
+            <w:r>
+              <w:rPr>
+                <w:rFonts w:ascii="Courier New" w:cs="Courier New" w:eastAsia="Courier New" w:hAnsi="Courier New"/>
+                <w:color w:val="3A2E15"/>
+                <w:sz w:val="16"/>
+                <w:szCs w:val="16"/>
+              </w:rPr>
+              <w:t xml:space="preserve">        // L'API ne sert que du JSON : aucune exécution de contenu autorisée</w:t>
+            </w:r>
+          </w:p>
+          <w:p>
+            <w:pPr>
+              <w:spacing w:after="0" w:line="230"/>
+            </w:pPr>
+            <w:r>
+              <w:rPr>
+                <w:rFonts w:ascii="Courier New" w:cs="Courier New" w:eastAsia="Courier New" w:hAnsi="Courier New"/>
+                <w:color w:val="3A2E15"/>
+                <w:sz w:val="16"/>
+                <w:szCs w:val="16"/>
+              </w:rPr>
+              <w:t xml:space="preserve">        $headers-&gt;set('Content-Security-Policy',</w:t>
+            </w:r>
+          </w:p>
+          <w:p>
+            <w:pPr>
+              <w:spacing w:after="0" w:line="230"/>
+            </w:pPr>
+            <w:r>
+              <w:rPr>
+                <w:rFonts w:ascii="Courier New" w:cs="Courier New" w:eastAsia="Courier New" w:hAnsi="Courier New"/>
+                <w:color w:val="3A2E15"/>
+                <w:sz w:val="16"/>
+                <w:szCs w:val="16"/>
+              </w:rPr>
+              <w:t xml:space="preserve">            "default-src 'none'; frame-ancestors 'none'");</w:t>
+            </w:r>
+          </w:p>
+          <w:p>
+            <w:pPr>
+              <w:spacing w:after="0" w:line="230"/>
+            </w:pPr>
+            <w:r>
+              <w:rPr>
+                <w:rFonts w:ascii="Courier New" w:cs="Courier New" w:eastAsia="Courier New" w:hAnsi="Courier New"/>
+                <w:color w:val="3A2E15"/>
+                <w:sz w:val="16"/>
+                <w:szCs w:val="16"/>
+              </w:rPr>
+              <w:t xml:space="preserve">    }</w:t>
+            </w:r>
+          </w:p>
+          <w:p>
+            <w:pPr>
+              <w:spacing w:after="0" w:line="230"/>
+            </w:pPr>
+            <w:r>
+              <w:rPr>
+                <w:rFonts w:ascii="Courier New" w:cs="Courier New" w:eastAsia="Courier New" w:hAnsi="Courier New"/>
+                <w:color w:val="3A2E15"/>
+                <w:sz w:val="16"/>
+                <w:szCs w:val="16"/>
+              </w:rPr>
+              <w:t xml:space="preserve">}</w:t>
+            </w:r>
+          </w:p>
+        </w:tc>
+      </w:tr>
+    </w:tbl>
+    <w:p>
+      <w:pPr>
+        <w:spacing w:after="180" w:before="50"/>
+        <w:jc w:val="left"/>
+      </w:pPr>
+      <w:r>
+        <w:rPr>
+          <w:i/>
+          <w:iCs/>
+          <w:color w:val="5A4825"/>
+          <w:sz w:val="18"/>
+          <w:szCs w:val="18"/>
+        </w:rPr>
+        <w:t xml:space="preserve">back/src/EventSubscriber/SecurityHeadersSubscriber.php (intégral) — vérifié par le scénario SEC-02.</w:t>
+      </w:r>
+    </w:p>
+    <w:p>
+      <w:pPr>
+        <w:pStyle w:val="Heading2"/>
+      </w:pPr>
+      <w:r>
+        <w:t xml:space="preserve">A.2 Sonde de supervision (C4.1.2, utilisée dès le Bloc 2)</w:t>
+      </w:r>
+    </w:p>
+    <w:p>
+      <w:pPr>
+        <w:spacing w:after="140" w:before="0" w:line="330"/>
+        <w:jc w:val="both"/>
+      </w:pPr>
+      <w:r>
+        <w:rPr>
+          <w:b w:val="false"/>
+          <w:bCs w:val="false"/>
+          <w:i w:val="false"/>
+          <w:iCs w:val="false"/>
+          <w:sz w:val="22"/>
+          <w:szCs w:val="22"/>
+        </w:rPr>
+        <w:t xml:space="preserve">L'endpoint public /api/health agrège l'état des dépendances critiques et renvoie 503 si l'une d'elles est dégradée — c'est lui que les sondes interrogent :</w:t>
+      </w:r>
+    </w:p>
+    <w:tbl>
+      <w:tblPr>
+        <w:tblW w:type="dxa" w:w="9072"/>
+        <w:tblBorders>
+          <w:top w:val="single" w:color="auto" w:sz="4"/>
+          <w:left w:val="single" w:color="auto" w:sz="4"/>
+          <w:bottom w:val="single" w:color="auto" w:sz="4"/>
+          <w:right w:val="single" w:color="auto" w:sz="4"/>
+          <w:insideH w:val="single" w:color="auto" w:sz="4"/>
+          <w:insideV w:val="single" w:color="auto" w:sz="4"/>
+        </w:tblBorders>
+      </w:tblPr>
+      <w:tblGrid>
+        <w:gridCol w:w="9072"/>
+      </w:tblGrid>
+      <w:tr>
+        <w:tc>
+          <w:tcPr>
+            <w:tcW w:type="dxa" w:w="9072"/>
+            <w:tcBorders>
+              <w:top w:val="single" w:color="E0D5BB" w:sz="2"/>
+              <w:left w:val="single" w:color="E0D5BB" w:sz="2"/>
+              <w:bottom w:val="single" w:color="E0D5BB" w:sz="2"/>
+              <w:right w:val="single" w:color="E0D5BB" w:sz="2"/>
+            </w:tcBorders>
+            <w:shd w:fill="FAF6EC" w:val="clear"/>
+            <w:tcMar>
+              <w:top w:type="dxa" w:w="90"/>
+              <w:left w:type="dxa" w:w="140"/>
+              <w:bottom w:type="dxa" w:w="90"/>
+              <w:right w:type="dxa" w:w="140"/>
+            </w:tcMar>
+          </w:tcPr>
+          <w:p>
+            <w:pPr>
+              <w:spacing w:after="0" w:line="230"/>
+            </w:pPr>
+            <w:r>
+              <w:rPr>
+                <w:rFonts w:ascii="Courier New" w:cs="Courier New" w:eastAsia="Courier New" w:hAnsi="Courier New"/>
+                <w:color w:val="3A2E15"/>
+                <w:sz w:val="16"/>
+                <w:szCs w:val="16"/>
+              </w:rPr>
+              <w:t xml:space="preserve">#[Route('/api/health', name: 'api_health', methods: ['GET'])]</w:t>
+            </w:r>
+          </w:p>
+          <w:p>
+            <w:pPr>
+              <w:spacing w:after="0" w:line="230"/>
+            </w:pPr>
+            <w:r>
+              <w:rPr>
+                <w:rFonts w:ascii="Courier New" w:cs="Courier New" w:eastAsia="Courier New" w:hAnsi="Courier New"/>
+                <w:color w:val="3A2E15"/>
+                <w:sz w:val="16"/>
+                <w:szCs w:val="16"/>
+              </w:rPr>
+              <w:t xml:space="preserve">public function check(): JsonResponse</w:t>
+            </w:r>
+          </w:p>
+          <w:p>
+            <w:pPr>
+              <w:spacing w:after="0" w:line="230"/>
+            </w:pPr>
+            <w:r>
+              <w:rPr>
+                <w:rFonts w:ascii="Courier New" w:cs="Courier New" w:eastAsia="Courier New" w:hAnsi="Courier New"/>
+                <w:color w:val="3A2E15"/>
+                <w:sz w:val="16"/>
+                <w:szCs w:val="16"/>
+              </w:rPr>
+              <w:t xml:space="preserve">{</w:t>
+            </w:r>
+          </w:p>
+          <w:p>
+            <w:pPr>
+              <w:spacing w:after="0" w:line="230"/>
+            </w:pPr>
+            <w:r>
+              <w:rPr>
+                <w:rFonts w:ascii="Courier New" w:cs="Courier New" w:eastAsia="Courier New" w:hAnsi="Courier New"/>
+                <w:color w:val="3A2E15"/>
+                <w:sz w:val="16"/>
+                <w:szCs w:val="16"/>
+              </w:rPr>
+              <w:t xml:space="preserve">    $status = [</w:t>
+            </w:r>
+          </w:p>
+          <w:p>
+            <w:pPr>
+              <w:spacing w:after="0" w:line="230"/>
+            </w:pPr>
+            <w:r>
+              <w:rPr>
+                <w:rFonts w:ascii="Courier New" w:cs="Courier New" w:eastAsia="Courier New" w:hAnsi="Courier New"/>
+                <w:color w:val="3A2E15"/>
+                <w:sz w:val="16"/>
+                <w:szCs w:val="16"/>
+              </w:rPr>
+              <w:t xml:space="preserve">        'status' =&gt; 'OK',</w:t>
+            </w:r>
+          </w:p>
+          <w:p>
+            <w:pPr>
+              <w:spacing w:after="0" w:line="230"/>
+            </w:pPr>
+            <w:r>
+              <w:rPr>
+                <w:rFonts w:ascii="Courier New" w:cs="Courier New" w:eastAsia="Courier New" w:hAnsi="Courier New"/>
+                <w:color w:val="3A2E15"/>
+                <w:sz w:val="16"/>
+                <w:szCs w:val="16"/>
+              </w:rPr>
+              <w:t xml:space="preserve">        'timestamp' =&gt; date('c'),</w:t>
+            </w:r>
+          </w:p>
+          <w:p>
+            <w:pPr>
+              <w:spacing w:after="0" w:line="230"/>
+            </w:pPr>
+            <w:r>
+              <w:rPr>
+                <w:rFonts w:ascii="Courier New" w:cs="Courier New" w:eastAsia="Courier New" w:hAnsi="Courier New"/>
+                <w:color w:val="3A2E15"/>
+                <w:sz w:val="16"/>
+                <w:szCs w:val="16"/>
+              </w:rPr>
+              <w:t xml:space="preserve">        'services' =&gt; [</w:t>
+            </w:r>
+          </w:p>
+          <w:p>
+            <w:pPr>
+              <w:spacing w:after="0" w:line="230"/>
+            </w:pPr>
+            <w:r>
+              <w:rPr>
+                <w:rFonts w:ascii="Courier New" w:cs="Courier New" w:eastAsia="Courier New" w:hAnsi="Courier New"/>
+                <w:color w:val="3A2E15"/>
+                <w:sz w:val="16"/>
+                <w:szCs w:val="16"/>
+              </w:rPr>
+              <w:t xml:space="preserve">            'database' =&gt; $this-&gt;checkDatabase(),</w:t>
+            </w:r>
+          </w:p>
+          <w:p>
+            <w:pPr>
+              <w:spacing w:after="0" w:line="230"/>
+            </w:pPr>
+            <w:r>
+              <w:rPr>
+                <w:rFonts w:ascii="Courier New" w:cs="Courier New" w:eastAsia="Courier New" w:hAnsi="Courier New"/>
+                <w:color w:val="3A2E15"/>
+                <w:sz w:val="16"/>
+                <w:szCs w:val="16"/>
+              </w:rPr>
+              <w:t xml:space="preserve">            'albion_api' =&gt; $this-&gt;checkAlbionApi(),</w:t>
+            </w:r>
+          </w:p>
+          <w:p>
+            <w:pPr>
+              <w:spacing w:after="0" w:line="230"/>
+            </w:pPr>
+            <w:r>
+              <w:rPr>
+                <w:rFonts w:ascii="Courier New" w:cs="Courier New" w:eastAsia="Courier New" w:hAnsi="Courier New"/>
+                <w:color w:val="3A2E15"/>
+                <w:sz w:val="16"/>
+                <w:szCs w:val="16"/>
+              </w:rPr>
+              <w:t xml:space="preserve">        ]</w:t>
+            </w:r>
+          </w:p>
+          <w:p>
+            <w:pPr>
+              <w:spacing w:after="0" w:line="230"/>
+            </w:pPr>
+            <w:r>
+              <w:rPr>
+                <w:rFonts w:ascii="Courier New" w:cs="Courier New" w:eastAsia="Courier New" w:hAnsi="Courier New"/>
+                <w:color w:val="3A2E15"/>
+                <w:sz w:val="16"/>
+                <w:szCs w:val="16"/>
+              </w:rPr>
+              <w:t xml:space="preserve">    ];</w:t>
+            </w:r>
+          </w:p>
+          <w:p>
+            <w:pPr>
+              <w:spacing w:after="0" w:line="230"/>
+            </w:pPr>
+            <w:r>
+              <w:rPr>
+                <w:rFonts w:ascii="Courier New" w:cs="Courier New" w:eastAsia="Courier New" w:hAnsi="Courier New"/>
+                <w:color w:val="3A2E15"/>
+                <w:sz w:val="16"/>
+                <w:szCs w:val="16"/>
+              </w:rPr>
+              <w:t xml:space="preserve"> </w:t>
+            </w:r>
+          </w:p>
+          <w:p>
+            <w:pPr>
+              <w:spacing w:after="0" w:line="230"/>
+            </w:pPr>
+            <w:r>
+              <w:rPr>
+                <w:rFonts w:ascii="Courier New" w:cs="Courier New" w:eastAsia="Courier New" w:hAnsi="Courier New"/>
+                <w:color w:val="3A2E15"/>
+                <w:sz w:val="16"/>
+                <w:szCs w:val="16"/>
+              </w:rPr>
+              <w:t xml:space="preserve">    $statusCode = 200;</w:t>
+            </w:r>
+          </w:p>
+          <w:p>
+            <w:pPr>
+              <w:spacing w:after="0" w:line="230"/>
+            </w:pPr>
+            <w:r>
+              <w:rPr>
+                <w:rFonts w:ascii="Courier New" w:cs="Courier New" w:eastAsia="Courier New" w:hAnsi="Courier New"/>
+                <w:color w:val="3A2E15"/>
+                <w:sz w:val="16"/>
+                <w:szCs w:val="16"/>
+              </w:rPr>
+              <w:t xml:space="preserve">    foreach ($status['services'] as $service) {</w:t>
+            </w:r>
+          </w:p>
+          <w:p>
+            <w:pPr>
+              <w:spacing w:after="0" w:line="230"/>
+            </w:pPr>
+            <w:r>
+              <w:rPr>
+                <w:rFonts w:ascii="Courier New" w:cs="Courier New" w:eastAsia="Courier New" w:hAnsi="Courier New"/>
+                <w:color w:val="3A2E15"/>
+                <w:sz w:val="16"/>
+                <w:szCs w:val="16"/>
+              </w:rPr>
+              <w:t xml:space="preserve">        if ($service['status'] !== 'OK') {</w:t>
+            </w:r>
+          </w:p>
+          <w:p>
+            <w:pPr>
+              <w:spacing w:after="0" w:line="230"/>
+            </w:pPr>
+            <w:r>
+              <w:rPr>
+                <w:rFonts w:ascii="Courier New" w:cs="Courier New" w:eastAsia="Courier New" w:hAnsi="Courier New"/>
+                <w:color w:val="3A2E15"/>
+                <w:sz w:val="16"/>
+                <w:szCs w:val="16"/>
+              </w:rPr>
+              <w:t xml:space="preserve">            $status['status'] = 'ERROR';</w:t>
+            </w:r>
+          </w:p>
+          <w:p>
+            <w:pPr>
+              <w:spacing w:after="0" w:line="230"/>
+            </w:pPr>
+            <w:r>
+              <w:rPr>
+                <w:rFonts w:ascii="Courier New" w:cs="Courier New" w:eastAsia="Courier New" w:hAnsi="Courier New"/>
+                <w:color w:val="3A2E15"/>
+                <w:sz w:val="16"/>
+                <w:szCs w:val="16"/>
+              </w:rPr>
+              <w:t xml:space="preserve">            $statusCode = 503;</w:t>
+            </w:r>
+          </w:p>
+          <w:p>
+            <w:pPr>
+              <w:spacing w:after="0" w:line="230"/>
+            </w:pPr>
+            <w:r>
+              <w:rPr>
+                <w:rFonts w:ascii="Courier New" w:cs="Courier New" w:eastAsia="Courier New" w:hAnsi="Courier New"/>
+                <w:color w:val="3A2E15"/>
+                <w:sz w:val="16"/>
+                <w:szCs w:val="16"/>
+              </w:rPr>
+              <w:t xml:space="preserve">            break;</w:t>
+            </w:r>
+          </w:p>
+          <w:p>
+            <w:pPr>
+              <w:spacing w:after="0" w:line="230"/>
+            </w:pPr>
+            <w:r>
+              <w:rPr>
+                <w:rFonts w:ascii="Courier New" w:cs="Courier New" w:eastAsia="Courier New" w:hAnsi="Courier New"/>
+                <w:color w:val="3A2E15"/>
+                <w:sz w:val="16"/>
+                <w:szCs w:val="16"/>
+              </w:rPr>
+              <w:t xml:space="preserve">        }</w:t>
+            </w:r>
+          </w:p>
+          <w:p>
+            <w:pPr>
+              <w:spacing w:after="0" w:line="230"/>
+            </w:pPr>
+            <w:r>
+              <w:rPr>
+                <w:rFonts w:ascii="Courier New" w:cs="Courier New" w:eastAsia="Courier New" w:hAnsi="Courier New"/>
+                <w:color w:val="3A2E15"/>
+                <w:sz w:val="16"/>
+                <w:szCs w:val="16"/>
+              </w:rPr>
+              <w:t xml:space="preserve">    }</w:t>
+            </w:r>
+          </w:p>
+          <w:p>
+            <w:pPr>
+              <w:spacing w:after="0" w:line="230"/>
+            </w:pPr>
+            <w:r>
+              <w:rPr>
+                <w:rFonts w:ascii="Courier New" w:cs="Courier New" w:eastAsia="Courier New" w:hAnsi="Courier New"/>
+                <w:color w:val="3A2E15"/>
+                <w:sz w:val="16"/>
+                <w:szCs w:val="16"/>
+              </w:rPr>
+              <w:t xml:space="preserve"> </w:t>
+            </w:r>
+          </w:p>
+          <w:p>
+            <w:pPr>
+              <w:spacing w:after="0" w:line="230"/>
+            </w:pPr>
+            <w:r>
+              <w:rPr>
+                <w:rFonts w:ascii="Courier New" w:cs="Courier New" w:eastAsia="Courier New" w:hAnsi="Courier New"/>
+                <w:color w:val="3A2E15"/>
+                <w:sz w:val="16"/>
+                <w:szCs w:val="16"/>
+              </w:rPr>
+              <w:t xml:space="preserve">    return new JsonResponse($status, $statusCode);</w:t>
+            </w:r>
+          </w:p>
+          <w:p>
+            <w:pPr>
+              <w:spacing w:after="0" w:line="230"/>
+            </w:pPr>
+            <w:r>
+              <w:rPr>
+                <w:rFonts w:ascii="Courier New" w:cs="Courier New" w:eastAsia="Courier New" w:hAnsi="Courier New"/>
+                <w:color w:val="3A2E15"/>
+                <w:sz w:val="16"/>
+                <w:szCs w:val="16"/>
+              </w:rPr>
+              <w:t xml:space="preserve">}</w:t>
+            </w:r>
+          </w:p>
+        </w:tc>
+      </w:tr>
+    </w:tbl>
+    <w:p>
+      <w:pPr>
+        <w:spacing w:after="180" w:before="50"/>
+        <w:jc w:val="left"/>
+      </w:pPr>
+      <w:r>
+        <w:rPr>
+          <w:i/>
+          <w:iCs/>
+          <w:color w:val="5A4825"/>
+          <w:sz w:val="18"/>
+          <w:szCs w:val="18"/>
+        </w:rPr>
+        <w:t xml:space="preserve">back/src/Controller/HealthCheckController.php (extrait) — testé par la recette SEC-02 et supervisé en production.</w:t>
+      </w:r>
+    </w:p>
+    <w:p>
+      <w:pPr>
+        <w:pStyle w:val="Heading2"/>
+      </w:pPr>
+      <w:r>
+        <w:t xml:space="preserve">A.3 Firewall : authentification et contrôle d'accès (OWASP A01 / A07)</w:t>
+      </w:r>
+    </w:p>
+    <w:p>
+      <w:pPr>
+        <w:spacing w:after="140" w:before="0" w:line="330"/>
+        <w:jc w:val="both"/>
+      </w:pPr>
+      <w:r>
+        <w:rPr>
+          <w:b w:val="false"/>
+          <w:bCs w:val="false"/>
+          <w:i w:val="false"/>
+          <w:iCs w:val="false"/>
+          <w:sz w:val="22"/>
+          <w:szCs w:val="22"/>
+        </w:rPr>
+        <w:t xml:space="preserve">Le firewall stateless combine JWT, rafraîchissement de jeton et verrouillage du login ; la liste des routes publiques est explicite, tout le reste exige un jeton :</w:t>
+      </w:r>
+    </w:p>
+    <w:tbl>
+      <w:tblPr>
+        <w:tblW w:type="dxa" w:w="9072"/>
+        <w:tblBorders>
+          <w:top w:val="single" w:color="auto" w:sz="4"/>
+          <w:left w:val="single" w:color="auto" w:sz="4"/>
+          <w:bottom w:val="single" w:color="auto" w:sz="4"/>
+          <w:right w:val="single" w:color="auto" w:sz="4"/>
+          <w:insideH w:val="single" w:color="auto" w:sz="4"/>
+          <w:insideV w:val="single" w:color="auto" w:sz="4"/>
+        </w:tblBorders>
+      </w:tblPr>
+      <w:tblGrid>
+        <w:gridCol w:w="9072"/>
+      </w:tblGrid>
+      <w:tr>
+        <w:tc>
+          <w:tcPr>
+            <w:tcW w:type="dxa" w:w="9072"/>
+            <w:tcBorders>
+              <w:top w:val="single" w:color="E0D5BB" w:sz="2"/>
+              <w:left w:val="single" w:color="E0D5BB" w:sz="2"/>
+              <w:bottom w:val="single" w:color="E0D5BB" w:sz="2"/>
+              <w:right w:val="single" w:color="E0D5BB" w:sz="2"/>
+            </w:tcBorders>
+            <w:shd w:fill="FAF6EC" w:val="clear"/>
+            <w:tcMar>
+              <w:top w:type="dxa" w:w="90"/>
+              <w:left w:type="dxa" w:w="140"/>
+              <w:bottom w:type="dxa" w:w="90"/>
+              <w:right w:type="dxa" w:w="140"/>
+            </w:tcMar>
+          </w:tcPr>
+          <w:p>
+            <w:pPr>
+              <w:spacing w:after="0" w:line="230"/>
+            </w:pPr>
+            <w:r>
+              <w:rPr>
+                <w:rFonts w:ascii="Courier New" w:cs="Courier New" w:eastAsia="Courier New" w:hAnsi="Courier New"/>
+                <w:color w:val="3A2E15"/>
+                <w:sz w:val="16"/>
+                <w:szCs w:val="16"/>
+              </w:rPr>
+              <w:t xml:space="preserve">stateless: true</w:t>
+            </w:r>
+          </w:p>
+          <w:p>
+            <w:pPr>
+              <w:spacing w:after="0" w:line="230"/>
+            </w:pPr>
+            <w:r>
+              <w:rPr>
+                <w:rFonts w:ascii="Courier New" w:cs="Courier New" w:eastAsia="Courier New" w:hAnsi="Courier New"/>
+                <w:color w:val="3A2E15"/>
+                <w:sz w:val="16"/>
+                <w:szCs w:val="16"/>
+              </w:rPr>
+              <w:t xml:space="preserve">entry_point: jwt</w:t>
+            </w:r>
+          </w:p>
+          <w:p>
+            <w:pPr>
+              <w:spacing w:after="0" w:line="230"/>
+            </w:pPr>
+            <w:r>
+              <w:rPr>
+                <w:rFonts w:ascii="Courier New" w:cs="Courier New" w:eastAsia="Courier New" w:hAnsi="Courier New"/>
+                <w:color w:val="3A2E15"/>
+                <w:sz w:val="16"/>
+                <w:szCs w:val="16"/>
+              </w:rPr>
+              <w:t xml:space="preserve">jwt: ~</w:t>
+            </w:r>
+          </w:p>
+          <w:p>
+            <w:pPr>
+              <w:spacing w:after="0" w:line="230"/>
+            </w:pPr>
+            <w:r>
+              <w:rPr>
+                <w:rFonts w:ascii="Courier New" w:cs="Courier New" w:eastAsia="Courier New" w:hAnsi="Courier New"/>
+                <w:color w:val="3A2E15"/>
+                <w:sz w:val="16"/>
+                <w:szCs w:val="16"/>
+              </w:rPr>
+              <w:t xml:space="preserve">refresh_jwt:</w:t>
+            </w:r>
+          </w:p>
+          <w:p>
+            <w:pPr>
+              <w:spacing w:after="0" w:line="230"/>
+            </w:pPr>
+            <w:r>
+              <w:rPr>
+                <w:rFonts w:ascii="Courier New" w:cs="Courier New" w:eastAsia="Courier New" w:hAnsi="Courier New"/>
+                <w:color w:val="3A2E15"/>
+                <w:sz w:val="16"/>
+                <w:szCs w:val="16"/>
+              </w:rPr>
+              <w:t xml:space="preserve">    check_path: /api/token/refresh</w:t>
+            </w:r>
+          </w:p>
+          <w:p>
+            <w:pPr>
+              <w:spacing w:after="0" w:line="230"/>
+            </w:pPr>
+            <w:r>
+              <w:rPr>
+                <w:rFonts w:ascii="Courier New" w:cs="Courier New" w:eastAsia="Courier New" w:hAnsi="Courier New"/>
+                <w:color w:val="3A2E15"/>
+                <w:sz w:val="16"/>
+                <w:szCs w:val="16"/>
+              </w:rPr>
+              <w:t xml:space="preserve">json_login:</w:t>
+            </w:r>
+          </w:p>
+          <w:p>
+            <w:pPr>
+              <w:spacing w:after="0" w:line="230"/>
+            </w:pPr>
+            <w:r>
+              <w:rPr>
+                <w:rFonts w:ascii="Courier New" w:cs="Courier New" w:eastAsia="Courier New" w:hAnsi="Courier New"/>
+                <w:color w:val="3A2E15"/>
+                <w:sz w:val="16"/>
+                <w:szCs w:val="16"/>
+              </w:rPr>
+              <w:t xml:space="preserve">    check_path: /api/login</w:t>
+            </w:r>
+          </w:p>
+          <w:p>
+            <w:pPr>
+              <w:spacing w:after="0" w:line="230"/>
+            </w:pPr>
+            <w:r>
+              <w:rPr>
+                <w:rFonts w:ascii="Courier New" w:cs="Courier New" w:eastAsia="Courier New" w:hAnsi="Courier New"/>
+                <w:color w:val="3A2E15"/>
+                <w:sz w:val="16"/>
+                <w:szCs w:val="16"/>
+              </w:rPr>
+              <w:t xml:space="preserve">    success_handler: lexik_jwt_authentication.handler.authentication_success</w:t>
+            </w:r>
+          </w:p>
+          <w:p>
+            <w:pPr>
+              <w:spacing w:after="0" w:line="230"/>
+            </w:pPr>
+            <w:r>
+              <w:rPr>
+                <w:rFonts w:ascii="Courier New" w:cs="Courier New" w:eastAsia="Courier New" w:hAnsi="Courier New"/>
+                <w:color w:val="3A2E15"/>
+                <w:sz w:val="16"/>
+                <w:szCs w:val="16"/>
+              </w:rPr>
+              <w:t xml:space="preserve">    failure_handler: lexik_jwt_authentication.handler.authentication_failure</w:t>
+            </w:r>
+          </w:p>
+          <w:p>
+            <w:pPr>
+              <w:spacing w:after="0" w:line="230"/>
+            </w:pPr>
+            <w:r>
+              <w:rPr>
+                <w:rFonts w:ascii="Courier New" w:cs="Courier New" w:eastAsia="Courier New" w:hAnsi="Courier New"/>
+                <w:color w:val="3A2E15"/>
+                <w:sz w:val="16"/>
+                <w:szCs w:val="16"/>
+              </w:rPr>
+              <w:t xml:space="preserve"># Protection brute-force : 5 tentatives max par utilisateur/IP, fenêtre de 15 min</w:t>
+            </w:r>
+          </w:p>
+          <w:p>
+            <w:pPr>
+              <w:spacing w:after="0" w:line="230"/>
+            </w:pPr>
+            <w:r>
+              <w:rPr>
+                <w:rFonts w:ascii="Courier New" w:cs="Courier New" w:eastAsia="Courier New" w:hAnsi="Courier New"/>
+                <w:color w:val="3A2E15"/>
+                <w:sz w:val="16"/>
+                <w:szCs w:val="16"/>
+              </w:rPr>
+              <w:t xml:space="preserve">login_throttling:</w:t>
+            </w:r>
+          </w:p>
+          <w:p>
+            <w:pPr>
+              <w:spacing w:after="0" w:line="230"/>
+            </w:pPr>
+            <w:r>
+              <w:rPr>
+                <w:rFonts w:ascii="Courier New" w:cs="Courier New" w:eastAsia="Courier New" w:hAnsi="Courier New"/>
+                <w:color w:val="3A2E15"/>
+                <w:sz w:val="16"/>
+                <w:szCs w:val="16"/>
+              </w:rPr>
+              <w:t xml:space="preserve">    max_attempts: 5</w:t>
+            </w:r>
+          </w:p>
+          <w:p>
+            <w:pPr>
+              <w:spacing w:after="0" w:line="230"/>
+            </w:pPr>
+            <w:r>
+              <w:rPr>
+                <w:rFonts w:ascii="Courier New" w:cs="Courier New" w:eastAsia="Courier New" w:hAnsi="Courier New"/>
+                <w:color w:val="3A2E15"/>
+                <w:sz w:val="16"/>
+                <w:szCs w:val="16"/>
+              </w:rPr>
+              <w:t xml:space="preserve">    interval: '15 minutes'</w:t>
+            </w:r>
+          </w:p>
+          <w:p>
+            <w:pPr>
+              <w:spacing w:after="0" w:line="230"/>
+            </w:pPr>
+            <w:r>
+              <w:rPr>
+                <w:rFonts w:ascii="Courier New" w:cs="Courier New" w:eastAsia="Courier New" w:hAnsi="Courier New"/>
+                <w:color w:val="3A2E15"/>
+                <w:sz w:val="16"/>
+                <w:szCs w:val="16"/>
+              </w:rPr>
+              <w:t xml:space="preserve"> </w:t>
+            </w:r>
+          </w:p>
+          <w:p>
+            <w:pPr>
+              <w:spacing w:after="0" w:line="230"/>
+            </w:pPr>
+            <w:r>
+              <w:rPr>
+                <w:rFonts w:ascii="Courier New" w:cs="Courier New" w:eastAsia="Courier New" w:hAnsi="Courier New"/>
+                <w:color w:val="3A2E15"/>
+                <w:sz w:val="16"/>
+                <w:szCs w:val="16"/>
+              </w:rPr>
+              <w:t xml:space="preserve">access_control:</w:t>
+            </w:r>
+          </w:p>
+          <w:p>
+            <w:pPr>
+              <w:spacing w:after="0" w:line="230"/>
+            </w:pPr>
+            <w:r>
+              <w:rPr>
+                <w:rFonts w:ascii="Courier New" w:cs="Courier New" w:eastAsia="Courier New" w:hAnsi="Courier New"/>
+                <w:color w:val="3A2E15"/>
+                <w:sz w:val="16"/>
+                <w:szCs w:val="16"/>
+              </w:rPr>
+              <w:t xml:space="preserve">    - { path: ^/api/health, roles: PUBLIC_ACCESS }</w:t>
+            </w:r>
+          </w:p>
+          <w:p>
+            <w:pPr>
+              <w:spacing w:after="0" w:line="230"/>
+            </w:pPr>
+            <w:r>
+              <w:rPr>
+                <w:rFonts w:ascii="Courier New" w:cs="Courier New" w:eastAsia="Courier New" w:hAnsi="Courier New"/>
+                <w:color w:val="3A2E15"/>
+                <w:sz w:val="16"/>
+                <w:szCs w:val="16"/>
+              </w:rPr>
+              <w:t xml:space="preserve">    - { path: ^/api/register, roles: PUBLIC_ACCESS }</w:t>
+            </w:r>
+          </w:p>
+          <w:p>
+            <w:pPr>
+              <w:spacing w:after="0" w:line="230"/>
+            </w:pPr>
+            <w:r>
+              <w:rPr>
+                <w:rFonts w:ascii="Courier New" w:cs="Courier New" w:eastAsia="Courier New" w:hAnsi="Courier New"/>
+                <w:color w:val="3A2E15"/>
+                <w:sz w:val="16"/>
+                <w:szCs w:val="16"/>
+              </w:rPr>
+              <w:t xml:space="preserve">    - { path: ^/api/login, roles: PUBLIC_ACCESS }</w:t>
+            </w:r>
+          </w:p>
+          <w:p>
+            <w:pPr>
+              <w:spacing w:after="0" w:line="230"/>
+            </w:pPr>
+            <w:r>
+              <w:rPr>
+                <w:rFonts w:ascii="Courier New" w:cs="Courier New" w:eastAsia="Courier New" w:hAnsi="Courier New"/>
+                <w:color w:val="3A2E15"/>
+                <w:sz w:val="16"/>
+                <w:szCs w:val="16"/>
+              </w:rPr>
+              <w:t xml:space="preserve">    - { path: ^/api/routes/share/, roles: PUBLIC_ACCESS }</w:t>
+            </w:r>
+          </w:p>
+          <w:p>
+            <w:pPr>
+              <w:spacing w:after="0" w:line="230"/>
+            </w:pPr>
+            <w:r>
+              <w:rPr>
+                <w:rFonts w:ascii="Courier New" w:cs="Courier New" w:eastAsia="Courier New" w:hAnsi="Courier New"/>
+                <w:color w:val="3A2E15"/>
+                <w:sz w:val="16"/>
+                <w:szCs w:val="16"/>
+              </w:rPr>
+              <w:t xml:space="preserve">    - { path: ^/api/compositions/share/, roles: PUBLIC_ACCESS }</w:t>
+            </w:r>
+          </w:p>
+          <w:p>
+            <w:pPr>
+              <w:spacing w:after="0" w:line="230"/>
+            </w:pPr>
+            <w:r>
+              <w:rPr>
+                <w:rFonts w:ascii="Courier New" w:cs="Courier New" w:eastAsia="Courier New" w:hAnsi="Courier New"/>
+                <w:color w:val="3A2E15"/>
+                <w:sz w:val="16"/>
+                <w:szCs w:val="16"/>
+              </w:rPr>
+              <w:t xml:space="preserve">    - { path: ^/api/admin, roles: ROLE_ADMIN }</w:t>
+            </w:r>
+          </w:p>
+          <w:p>
+            <w:pPr>
+              <w:spacing w:after="0" w:line="230"/>
+            </w:pPr>
+            <w:r>
+              <w:rPr>
+                <w:rFonts w:ascii="Courier New" w:cs="Courier New" w:eastAsia="Courier New" w:hAnsi="Courier New"/>
+                <w:color w:val="3A2E15"/>
+                <w:sz w:val="16"/>
+                <w:szCs w:val="16"/>
+              </w:rPr>
+              <w:t xml:space="preserve">    - { path: ^/api, roles: IS_AUTHENTICATED_FULLY }</w:t>
+            </w:r>
+          </w:p>
+        </w:tc>
+      </w:tr>
+    </w:tbl>
+    <w:p>
+      <w:pPr>
+        <w:spacing w:after="180" w:before="50"/>
+        <w:jc w:val="left"/>
+      </w:pPr>
+      <w:r>
+        <w:rPr>
+          <w:i/>
+          <w:iCs/>
+          <w:color w:val="5A4825"/>
+          <w:sz w:val="18"/>
+          <w:szCs w:val="18"/>
+        </w:rPr>
+        <w:t xml:space="preserve">back/config/packages/security.yaml (extraits) — HTTP 429 dès la 6e tentative (SEC-04), 401 sans jeton (SEC-01), admin réservé (ADM-02).</w:t>
+      </w:r>
+    </w:p>
+    <w:p>
+      <w:pPr>
+        <w:pStyle w:val="Heading1"/>
+      </w:pPr>
+      <w:r>
+        <w:t xml:space="preserve">Annexe B — Chaîne d'intégration et de déploiement continus</w:t>
+      </w:r>
+    </w:p>
+    <w:p>
+      <w:pPr>
+        <w:spacing w:after="140" w:before="0" w:line="330"/>
+        <w:jc w:val="both"/>
+      </w:pPr>
+      <w:r>
+        <w:rPr>
+          <w:b w:val="false"/>
+          <w:bCs w:val="false"/>
+          <w:i w:val="false"/>
+          <w:iCs w:val="false"/>
+          <w:sz w:val="22"/>
+          <w:szCs w:val="22"/>
+        </w:rPr>
+        <w:t xml:space="preserve">Le pipeline décrit aux sections 4 et 5 est observable publiquement sur le dépôt GitHub. Les captures ci-dessous en attestent l'exécution réelle.</w:t>
+      </w:r>
+    </w:p>
+    <w:tbl>
+      <w:tblPr>
+        <w:tblW w:type="dxa" w:w="9072"/>
+        <w:tblBorders>
+          <w:top w:val="single" w:color="auto" w:sz="4"/>
+          <w:left w:val="single" w:color="auto" w:sz="4"/>
+          <w:bottom w:val="single" w:color="auto" w:sz="4"/>
+          <w:right w:val="single" w:color="auto" w:sz="4"/>
+          <w:insideH w:val="single" w:color="auto" w:sz="4"/>
+          <w:insideV w:val="single" w:color="auto" w:sz="4"/>
+        </w:tblBorders>
+      </w:tblPr>
+      <w:tblGrid>
+        <w:gridCol w:w="9072"/>
+      </w:tblGrid>
+      <w:tr>
+        <w:tc>
+          <w:tcPr>
+            <w:tcW w:type="dxa" w:w="9072"/>
+            <w:tcBorders>
+              <w:top w:val="single" w:color="C9B98A" w:sz="4"/>
+              <w:left w:val="single" w:color="C9B98A" w:sz="4"/>
+              <w:bottom w:val="single" w:color="C9B98A" w:sz="4"/>
+              <w:right w:val="single" w:color="C9B98A" w:sz="4"/>
+            </w:tcBorders>
+            <w:tcMar>
+              <w:top w:type="dxa" w:w="50"/>
+              <w:left w:type="dxa" w:w="50"/>
+              <w:bottom w:type="dxa" w:w="30"/>
+              <w:right w:type="dxa" w:w="50"/>
+            </w:tcMar>
+          </w:tcPr>
+          <w:p>
+            <w:pPr>
+              <w:spacing w:after="0"/>
+              <w:jc w:val="center"/>
+            </w:pPr>
+            <w:r>
+              <w:drawing>
+                <wp:inline distT="0" distB="0" distL="0" distR="0">
+                  <wp:extent cx="5334000" cy="3333750"/>
+                  <wp:effectExtent t="0" r="0" b="0" l="0"/>
+                  <wp:docPr id="1" name="figure-13" descr="Détail d'un run vert : jobs backend-tests et frontend-tests exécutés en parallèle sur le commit poussé" title="Détail d'un run vert : jobs backend-tests et frontend-tests exécutés en parallèle sur le commit poussé"/>
+                  <wp:cNvGraphicFramePr>
+                    <a:graphicFrameLocks xmlns:a="http://schemas.openxmlformats.org/drawingml/2006/main" noChangeAspect="1"/>
+                  </wp:cNvGraphicFramePr>
+                  <a:graphic xmlns:a="http://schemas.openxmlformats.org/drawingml/2006/main">
+                    <a:graphicData uri="http://schemas.openxmlformats.org/drawingml/2006/picture">
+                      <pic:pic xmlns:pic="http://schemas.openxmlformats.org/drawingml/2006/picture">
+                        <pic:nvPicPr>
+                          <pic:cNvPr id="0" name="" descr=""/>
+                          <pic:cNvPicPr>
+                            <a:picLocks noChangeAspect="1" noChangeArrowheads="1"/>
+                          </pic:cNvPicPr>
+                        </pic:nvPicPr>
+                        <pic:blipFill>
+                          <a:blip r:embed="rId24" cstate="none"/>
+                          <a:srcRect/>
+                          <a:stretch>
+                            <a:fillRect/>
+                          </a:stretch>
+                        </pic:blipFill>
+                        <pic:spPr bwMode="auto">
+                          <a:xfrm>
+                            <a:off x="0" y="0"/>
+                            <a:ext cx="5334000" cy="3333750"/>
+                          </a:xfrm>
+                          <a:prstGeom prst="rect">
+                            <a:avLst/>
+                          </a:prstGeom>
+                        </pic:spPr>
+                      </pic:pic>
+                    </a:graphicData>
+                  </a:graphic>
+                </wp:inline>
+              </w:drawing>
+            </w:r>
+          </w:p>
+        </w:tc>
+      </w:tr>
+    </w:tbl>
+    <w:p>
+      <w:pPr>
+        <w:spacing w:after="200" w:before="60"/>
+        <w:jc w:val="center"/>
+      </w:pPr>
+      <w:r>
+        <w:rPr>
+          <w:i/>
+          <w:iCs/>
+          <w:color w:val="5A4825"/>
+          <w:sz w:val="18"/>
+          <w:szCs w:val="18"/>
+        </w:rPr>
+        <w:t xml:space="preserve">Figure 13 — Détail d'un run vert : jobs backend-tests et frontend-tests exécutés en parallèle sur le commit poussé</w:t>
+      </w:r>
+    </w:p>
+    <w:tbl>
+      <w:tblPr>
+        <w:tblW w:type="dxa" w:w="9072"/>
+        <w:tblBorders>
+          <w:top w:val="single" w:color="auto" w:sz="4"/>
+          <w:left w:val="single" w:color="auto" w:sz="4"/>
+          <w:bottom w:val="single" w:color="auto" w:sz="4"/>
+          <w:right w:val="single" w:color="auto" w:sz="4"/>
+          <w:insideH w:val="single" w:color="auto" w:sz="4"/>
+          <w:insideV w:val="single" w:color="auto" w:sz="4"/>
+        </w:tblBorders>
+      </w:tblPr>
+      <w:tblGrid>
+        <w:gridCol w:w="9072"/>
+      </w:tblGrid>
+      <w:tr>
+        <w:tc>
+          <w:tcPr>
+            <w:tcW w:type="dxa" w:w="9072"/>
+            <w:tcBorders>
+              <w:top w:val="single" w:color="C9B98A" w:sz="4"/>
+              <w:left w:val="single" w:color="C9B98A" w:sz="4"/>
+              <w:bottom w:val="single" w:color="C9B98A" w:sz="4"/>
+              <w:right w:val="single" w:color="C9B98A" w:sz="4"/>
+            </w:tcBorders>
+            <w:tcMar>
+              <w:top w:type="dxa" w:w="50"/>
+              <w:left w:type="dxa" w:w="50"/>
+              <w:bottom w:type="dxa" w:w="30"/>
+              <w:right w:type="dxa" w:w="50"/>
+            </w:tcMar>
+          </w:tcPr>
+          <w:p>
+            <w:pPr>
+              <w:spacing w:after="0"/>
+              <w:jc w:val="center"/>
+            </w:pPr>
+            <w:r>
+              <w:drawing>
+                <wp:inline distT="0" distB="0" distL="0" distR="0">
+                  <wp:extent cx="5334000" cy="3333750"/>
+                  <wp:effectExtent t="0" r="0" b="0" l="0"/>
+                  <wp:docPr id="1" name="figure-14" descr="Historique des runs. Le run rouge sur master est un garde-fou volontaire : sans les secrets SSH configurés, le job de déploiement refuse de s'exécuter — aucun identifiant n'existe dans le code" title="Historique des runs. Le run rouge sur master est un garde-fou volontaire : sans les secrets SSH configurés, le job de déploiement refuse de s'exécuter — aucun identifiant n'existe dans le code"/>
+                  <wp:cNvGraphicFramePr>
+                    <a:graphicFrameLocks xmlns:a="http://schemas.openxmlformats.org/drawingml/2006/main" noChangeAspect="1"/>
+                  </wp:cNvGraphicFramePr>
+                  <a:graphic xmlns:a="http://schemas.openxmlformats.org/drawingml/2006/main">
+                    <a:graphicData uri="http://schemas.openxmlformats.org/drawingml/2006/picture">
+                      <pic:pic xmlns:pic="http://schemas.openxmlformats.org/drawingml/2006/picture">
+                        <pic:nvPicPr>
+                          <pic:cNvPr id="0" name="" descr=""/>
+                          <pic:cNvPicPr>
+                            <a:picLocks noChangeAspect="1" noChangeArrowheads="1"/>
+                          </pic:cNvPicPr>
+                        </pic:nvPicPr>
+                        <pic:blipFill>
+                          <a:blip r:embed="rId25" cstate="none"/>
+                          <a:srcRect/>
+                          <a:stretch>
+                            <a:fillRect/>
+                          </a:stretch>
+                        </pic:blipFill>
+                        <pic:spPr bwMode="auto">
+                          <a:xfrm>
+                            <a:off x="0" y="0"/>
+                            <a:ext cx="5334000" cy="3333750"/>
+                          </a:xfrm>
+                          <a:prstGeom prst="rect">
+                            <a:avLst/>
+                          </a:prstGeom>
+                        </pic:spPr>
+                      </pic:pic>
+                    </a:graphicData>
+                  </a:graphic>
+                </wp:inline>
+              </w:drawing>
+            </w:r>
+          </w:p>
+        </w:tc>
+      </w:tr>
+    </w:tbl>
+    <w:p>
+      <w:pPr>
+        <w:spacing w:after="200" w:before="60"/>
+        <w:jc w:val="center"/>
+      </w:pPr>
+      <w:r>
+        <w:rPr>
+          <w:i/>
+          <w:iCs/>
+          <w:color w:val="5A4825"/>
+          <w:sz w:val="18"/>
+          <w:szCs w:val="18"/>
+        </w:rPr>
+        <w:t xml:space="preserve">Figure 14 — Historique des runs. Le run rouge sur master est un garde-fou volontaire : sans les secrets SSH configurés, le job de déploiement refuse de s'exécuter — aucun identifiant n'existe dans le code</w:t>
+      </w:r>
+    </w:p>
+    <w:p>
+      <w:pPr>
+        <w:spacing w:after="140" w:before="0" w:line="330"/>
+        <w:jc w:val="both"/>
+      </w:pPr>
+      <w:r>
+        <w:rPr>
+          <w:b w:val="false"/>
+          <w:bCs w:val="false"/>
+          <w:i w:val="false"/>
+          <w:iCs w:val="false"/>
+          <w:sz w:val="22"/>
+          <w:szCs w:val="22"/>
+        </w:rPr>
+        <w:t xml:space="preserve">Définition condensée du workflow (.github/workflows/main.yml) :</w:t>
+      </w:r>
+    </w:p>
+    <w:tbl>
+      <w:tblPr>
+        <w:tblW w:type="dxa" w:w="9072"/>
+        <w:tblBorders>
+          <w:top w:val="single" w:color="auto" w:sz="4"/>
+          <w:left w:val="single" w:color="auto" w:sz="4"/>
+          <w:bottom w:val="single" w:color="auto" w:sz="4"/>
+          <w:right w:val="single" w:color="auto" w:sz="4"/>
+          <w:insideH w:val="single" w:color="auto" w:sz="4"/>
+          <w:insideV w:val="single" w:color="auto" w:sz="4"/>
+        </w:tblBorders>
+      </w:tblPr>
+      <w:tblGrid>
+        <w:gridCol w:w="9072"/>
+      </w:tblGrid>
+      <w:tr>
+        <w:tc>
+          <w:tcPr>
+            <w:tcW w:type="dxa" w:w="9072"/>
+            <w:tcBorders>
+              <w:top w:val="single" w:color="E0D5BB" w:sz="2"/>
+              <w:left w:val="single" w:color="E0D5BB" w:sz="2"/>
+              <w:bottom w:val="single" w:color="E0D5BB" w:sz="2"/>
+              <w:right w:val="single" w:color="E0D5BB" w:sz="2"/>
+            </w:tcBorders>
+            <w:shd w:fill="FAF6EC" w:val="clear"/>
+            <w:tcMar>
+              <w:top w:type="dxa" w:w="90"/>
+              <w:left w:type="dxa" w:w="140"/>
+              <w:bottom w:type="dxa" w:w="90"/>
+              <w:right w:type="dxa" w:w="140"/>
+            </w:tcMar>
+          </w:tcPr>
+          <w:p>
+            <w:pPr>
+              <w:spacing w:after="0" w:line="230"/>
+            </w:pPr>
+            <w:r>
+              <w:rPr>
+                <w:rFonts w:ascii="Courier New" w:cs="Courier New" w:eastAsia="Courier New" w:hAnsi="Courier New"/>
+                <w:color w:val="3A2E15"/>
+                <w:sz w:val="16"/>
+                <w:szCs w:val="16"/>
+              </w:rPr>
+              <w:t xml:space="preserve">on:</w:t>
+            </w:r>
+          </w:p>
+          <w:p>
+            <w:pPr>
+              <w:spacing w:after="0" w:line="230"/>
+            </w:pPr>
+            <w:r>
+              <w:rPr>
+                <w:rFonts w:ascii="Courier New" w:cs="Courier New" w:eastAsia="Courier New" w:hAnsi="Courier New"/>
+                <w:color w:val="3A2E15"/>
+                <w:sz w:val="16"/>
+                <w:szCs w:val="16"/>
+              </w:rPr>
+              <w:t xml:space="preserve">  push: { branches: [master, develop] }</w:t>
+            </w:r>
+          </w:p>
+          <w:p>
+            <w:pPr>
+              <w:spacing w:after="0" w:line="230"/>
+            </w:pPr>
+            <w:r>
+              <w:rPr>
+                <w:rFonts w:ascii="Courier New" w:cs="Courier New" w:eastAsia="Courier New" w:hAnsi="Courier New"/>
+                <w:color w:val="3A2E15"/>
+                <w:sz w:val="16"/>
+                <w:szCs w:val="16"/>
+              </w:rPr>
+              <w:t xml:space="preserve">  pull_request: { branches: [master, develop] }</w:t>
+            </w:r>
+          </w:p>
+          <w:p>
+            <w:pPr>
+              <w:spacing w:after="0" w:line="230"/>
+            </w:pPr>
+            <w:r>
+              <w:rPr>
+                <w:rFonts w:ascii="Courier New" w:cs="Courier New" w:eastAsia="Courier New" w:hAnsi="Courier New"/>
+                <w:color w:val="3A2E15"/>
+                <w:sz w:val="16"/>
+                <w:szCs w:val="16"/>
+              </w:rPr>
+              <w:t xml:space="preserve"> </w:t>
+            </w:r>
+          </w:p>
+          <w:p>
+            <w:pPr>
+              <w:spacing w:after="0" w:line="230"/>
+            </w:pPr>
+            <w:r>
+              <w:rPr>
+                <w:rFonts w:ascii="Courier New" w:cs="Courier New" w:eastAsia="Courier New" w:hAnsi="Courier New"/>
+                <w:color w:val="3A2E15"/>
+                <w:sz w:val="16"/>
+                <w:szCs w:val="16"/>
+              </w:rPr>
+              <w:t xml:space="preserve">jobs:</w:t>
+            </w:r>
+          </w:p>
+          <w:p>
+            <w:pPr>
+              <w:spacing w:after="0" w:line="230"/>
+            </w:pPr>
+            <w:r>
+              <w:rPr>
+                <w:rFonts w:ascii="Courier New" w:cs="Courier New" w:eastAsia="Courier New" w:hAnsi="Courier New"/>
+                <w:color w:val="3A2E15"/>
+                <w:sz w:val="16"/>
+                <w:szCs w:val="16"/>
+              </w:rPr>
+              <w:t xml:space="preserve">  backend-tests:    # PHP 8.2, clés JWT de test, SQLite, php bin/phpunit</w:t>
+            </w:r>
+          </w:p>
+          <w:p>
+            <w:pPr>
+              <w:spacing w:after="0" w:line="230"/>
+            </w:pPr>
+            <w:r>
+              <w:rPr>
+                <w:rFonts w:ascii="Courier New" w:cs="Courier New" w:eastAsia="Courier New" w:hAnsi="Courier New"/>
+                <w:color w:val="3A2E15"/>
+                <w:sz w:val="16"/>
+                <w:szCs w:val="16"/>
+              </w:rPr>
+              <w:t xml:space="preserve">  frontend-tests:   # Node 22, npm ci, CI=true npm test</w:t>
+            </w:r>
+          </w:p>
+          <w:p>
+            <w:pPr>
+              <w:spacing w:after="0" w:line="230"/>
+            </w:pPr>
+            <w:r>
+              <w:rPr>
+                <w:rFonts w:ascii="Courier New" w:cs="Courier New" w:eastAsia="Courier New" w:hAnsi="Courier New"/>
+                <w:color w:val="3A2E15"/>
+                <w:sz w:val="16"/>
+                <w:szCs w:val="16"/>
+              </w:rPr>
+              <w:t xml:space="preserve">  deploy:</w:t>
+            </w:r>
+          </w:p>
+          <w:p>
+            <w:pPr>
+              <w:spacing w:after="0" w:line="230"/>
+            </w:pPr>
+            <w:r>
+              <w:rPr>
+                <w:rFonts w:ascii="Courier New" w:cs="Courier New" w:eastAsia="Courier New" w:hAnsi="Courier New"/>
+                <w:color w:val="3A2E15"/>
+                <w:sz w:val="16"/>
+                <w:szCs w:val="16"/>
+              </w:rPr>
+              <w:t xml:space="preserve">    needs: [backend-tests, frontend-tests]   # bloqué si un test échoue</w:t>
+            </w:r>
+          </w:p>
+          <w:p>
+            <w:pPr>
+              <w:spacing w:after="0" w:line="230"/>
+            </w:pPr>
+            <w:r>
+              <w:rPr>
+                <w:rFonts w:ascii="Courier New" w:cs="Courier New" w:eastAsia="Courier New" w:hAnsi="Courier New"/>
+                <w:color w:val="3A2E15"/>
+                <w:sz w:val="16"/>
+                <w:szCs w:val="16"/>
+              </w:rPr>
+              <w:t xml:space="preserve">    if: github.event_name == 'push' &amp;&amp; github.ref == 'refs/heads/master'</w:t>
+            </w:r>
+          </w:p>
+          <w:p>
+            <w:pPr>
+              <w:spacing w:after="0" w:line="230"/>
+            </w:pPr>
+            <w:r>
+              <w:rPr>
+                <w:rFonts w:ascii="Courier New" w:cs="Courier New" w:eastAsia="Courier New" w:hAnsi="Courier New"/>
+                <w:color w:val="3A2E15"/>
+                <w:sz w:val="16"/>
+                <w:szCs w:val="16"/>
+              </w:rPr>
+              <w:t xml:space="preserve">    steps:</w:t>
+            </w:r>
+          </w:p>
+          <w:p>
+            <w:pPr>
+              <w:spacing w:after="0" w:line="230"/>
+            </w:pPr>
+            <w:r>
+              <w:rPr>
+                <w:rFonts w:ascii="Courier New" w:cs="Courier New" w:eastAsia="Courier New" w:hAnsi="Courier New"/>
+                <w:color w:val="3A2E15"/>
+                <w:sz w:val="16"/>
+                <w:szCs w:val="16"/>
+              </w:rPr>
+              <w:t xml:space="preserve">      - uses: appleboy/ssh-action@v1.2.0     # secrets: SSH_HOST, SSH_USER…</w:t>
+            </w:r>
+          </w:p>
+          <w:p>
+            <w:pPr>
+              <w:spacing w:after="0" w:line="230"/>
+            </w:pPr>
+            <w:r>
+              <w:rPr>
+                <w:rFonts w:ascii="Courier New" w:cs="Courier New" w:eastAsia="Courier New" w:hAnsi="Courier New"/>
+                <w:color w:val="3A2E15"/>
+                <w:sz w:val="16"/>
+                <w:szCs w:val="16"/>
+              </w:rPr>
+              <w:t xml:space="preserve">        with:</w:t>
+            </w:r>
+          </w:p>
+          <w:p>
+            <w:pPr>
+              <w:spacing w:after="0" w:line="230"/>
+            </w:pPr>
+            <w:r>
+              <w:rPr>
+                <w:rFonts w:ascii="Courier New" w:cs="Courier New" w:eastAsia="Courier New" w:hAnsi="Courier New"/>
+                <w:color w:val="3A2E15"/>
+                <w:sz w:val="16"/>
+                <w:szCs w:val="16"/>
+              </w:rPr>
+              <w:t xml:space="preserve">          script: cd ${{ secrets.DEPLOY_PATH }} &amp;&amp; sh deploy/deploy.sh</w:t>
+            </w:r>
+          </w:p>
+        </w:tc>
+      </w:tr>
+    </w:tbl>
+    <w:p>
+      <w:pPr>
+        <w:spacing w:after="180" w:before="50"/>
+        <w:jc w:val="left"/>
+      </w:pPr>
+      <w:r>
+        <w:rPr>
+          <w:i/>
+          <w:iCs/>
+          <w:color w:val="5A4825"/>
+          <w:sz w:val="18"/>
+          <w:szCs w:val="18"/>
+        </w:rPr>
+        <w:t xml:space="preserve">Le déploiement n'est possible que depuis master, après succès des 126 tests, via des secrets GitHub.</w:t>
+      </w:r>
+    </w:p>
+    <w:p>
+      <w:pPr>
+        <w:pStyle w:val="Heading1"/>
+      </w:pPr>
+      <w:r>
+        <w:t xml:space="preserve">Annexe C — Sorties d'outillage (preuves d'exécution)</w:t>
+      </w:r>
+    </w:p>
+    <w:p>
+      <w:pPr>
+        <w:spacing w:after="140" w:before="0" w:line="330"/>
+        <w:jc w:val="both"/>
+      </w:pPr>
+      <w:r>
+        <w:rPr>
+          <w:b w:val="false"/>
+          <w:bCs w:val="false"/>
+          <w:i w:val="false"/>
+          <w:iCs w:val="false"/>
+          <w:sz w:val="22"/>
+          <w:szCs w:val="22"/>
+        </w:rPr>
+        <w:t xml:space="preserve">Sorties brutes des commandes de qualité et de sécurité, exécutées sur la version 3.0.0 le 14/07/2026.</w:t>
+      </w:r>
+    </w:p>
+    <w:p>
+      <w:pPr>
+        <w:pStyle w:val="Heading2"/>
+      </w:pPr>
+      <w:r>
+        <w:t xml:space="preserve">C.1 Tests backend — PHPUnit</w:t>
+      </w:r>
+    </w:p>
+    <w:tbl>
+      <w:tblPr>
+        <w:tblW w:type="dxa" w:w="9072"/>
+        <w:tblBorders>
+          <w:top w:val="single" w:color="auto" w:sz="4"/>
+          <w:left w:val="single" w:color="auto" w:sz="4"/>
+          <w:bottom w:val="single" w:color="auto" w:sz="4"/>
+          <w:right w:val="single" w:color="auto" w:sz="4"/>
+          <w:insideH w:val="single" w:color="auto" w:sz="4"/>
+          <w:insideV w:val="single" w:color="auto" w:sz="4"/>
+        </w:tblBorders>
+      </w:tblPr>
+      <w:tblGrid>
+        <w:gridCol w:w="9072"/>
+      </w:tblGrid>
+      <w:tr>
+        <w:tc>
+          <w:tcPr>
+            <w:tcW w:type="dxa" w:w="9072"/>
+            <w:tcBorders>
+              <w:top w:val="single" w:color="E0D5BB" w:sz="2"/>
+              <w:left w:val="single" w:color="E0D5BB" w:sz="2"/>
+              <w:bottom w:val="single" w:color="E0D5BB" w:sz="2"/>
+              <w:right w:val="single" w:color="E0D5BB" w:sz="2"/>
+            </w:tcBorders>
+            <w:shd w:fill="FAF6EC" w:val="clear"/>
+            <w:tcMar>
+              <w:top w:type="dxa" w:w="90"/>
+              <w:left w:type="dxa" w:w="140"/>
+              <w:bottom w:type="dxa" w:w="90"/>
+              <w:right w:type="dxa" w:w="140"/>
+            </w:tcMar>
+          </w:tcPr>
+          <w:p>
+            <w:pPr>
+              <w:spacing w:after="0" w:line="230"/>
+            </w:pPr>
+            <w:r>
+              <w:rPr>
+                <w:rFonts w:ascii="Courier New" w:cs="Courier New" w:eastAsia="Courier New" w:hAnsi="Courier New"/>
+                <w:color w:val="3A2E15"/>
+                <w:sz w:val="16"/>
+                <w:szCs w:val="16"/>
+              </w:rPr>
+              <w:t xml:space="preserve">$ cd back &amp;&amp; APP_ENV=test php bin/phpunit</w:t>
+            </w:r>
+          </w:p>
+          <w:p>
+            <w:pPr>
+              <w:spacing w:after="0" w:line="230"/>
+            </w:pPr>
+            <w:r>
+              <w:rPr>
+                <w:rFonts w:ascii="Courier New" w:cs="Courier New" w:eastAsia="Courier New" w:hAnsi="Courier New"/>
+                <w:color w:val="3A2E15"/>
+                <w:sz w:val="16"/>
+                <w:szCs w:val="16"/>
+              </w:rPr>
+              <w:t xml:space="preserve">PHPUnit 9.6.29 by Sebastian Bergmann and contributors.</w:t>
+            </w:r>
+          </w:p>
+          <w:p>
+            <w:pPr>
+              <w:spacing w:after="0" w:line="230"/>
+            </w:pPr>
+            <w:r>
+              <w:rPr>
+                <w:rFonts w:ascii="Courier New" w:cs="Courier New" w:eastAsia="Courier New" w:hAnsi="Courier New"/>
+                <w:color w:val="3A2E15"/>
+                <w:sz w:val="16"/>
+                <w:szCs w:val="16"/>
+              </w:rPr>
+              <w:t xml:space="preserve"> </w:t>
+            </w:r>
+          </w:p>
+          <w:p>
+            <w:pPr>
+              <w:spacing w:after="0" w:line="230"/>
+            </w:pPr>
+            <w:r>
+              <w:rPr>
+                <w:rFonts w:ascii="Courier New" w:cs="Courier New" w:eastAsia="Courier New" w:hAnsi="Courier New"/>
+                <w:color w:val="3A2E15"/>
+                <w:sz w:val="16"/>
+                <w:szCs w:val="16"/>
+              </w:rPr>
+              <w:t xml:space="preserve">...............................                                31 / 31 (100%)</w:t>
+            </w:r>
+          </w:p>
+          <w:p>
+            <w:pPr>
+              <w:spacing w:after="0" w:line="230"/>
+            </w:pPr>
+            <w:r>
+              <w:rPr>
+                <w:rFonts w:ascii="Courier New" w:cs="Courier New" w:eastAsia="Courier New" w:hAnsi="Courier New"/>
+                <w:color w:val="3A2E15"/>
+                <w:sz w:val="16"/>
+                <w:szCs w:val="16"/>
+              </w:rPr>
+              <w:t xml:space="preserve"> </w:t>
+            </w:r>
+          </w:p>
+          <w:p>
+            <w:pPr>
+              <w:spacing w:after="0" w:line="230"/>
+            </w:pPr>
+            <w:r>
+              <w:rPr>
+                <w:rFonts w:ascii="Courier New" w:cs="Courier New" w:eastAsia="Courier New" w:hAnsi="Courier New"/>
+                <w:color w:val="3A2E15"/>
+                <w:sz w:val="16"/>
+                <w:szCs w:val="16"/>
+              </w:rPr>
+              <w:t xml:space="preserve">OK (31 tests, 85 assertions)</w:t>
+            </w:r>
+          </w:p>
+        </w:tc>
+      </w:tr>
+    </w:tbl>
+    <w:p>
+      <w:pPr>
+        <w:pStyle w:val="Heading2"/>
+      </w:pPr>
+      <w:r>
+        <w:t xml:space="preserve">C.2 Tests frontend — Jest</w:t>
+      </w:r>
+    </w:p>
+    <w:tbl>
+      <w:tblPr>
+        <w:tblW w:type="dxa" w:w="9072"/>
+        <w:tblBorders>
+          <w:top w:val="single" w:color="auto" w:sz="4"/>
+          <w:left w:val="single" w:color="auto" w:sz="4"/>
+          <w:bottom w:val="single" w:color="auto" w:sz="4"/>
+          <w:right w:val="single" w:color="auto" w:sz="4"/>
+          <w:insideH w:val="single" w:color="auto" w:sz="4"/>
+          <w:insideV w:val="single" w:color="auto" w:sz="4"/>
+        </w:tblBorders>
+      </w:tblPr>
+      <w:tblGrid>
+        <w:gridCol w:w="9072"/>
+      </w:tblGrid>
+      <w:tr>
+        <w:tc>
+          <w:tcPr>
+            <w:tcW w:type="dxa" w:w="9072"/>
+            <w:tcBorders>
+              <w:top w:val="single" w:color="E0D5BB" w:sz="2"/>
+              <w:left w:val="single" w:color="E0D5BB" w:sz="2"/>
+              <w:bottom w:val="single" w:color="E0D5BB" w:sz="2"/>
+              <w:right w:val="single" w:color="E0D5BB" w:sz="2"/>
+            </w:tcBorders>
+            <w:shd w:fill="FAF6EC" w:val="clear"/>
+            <w:tcMar>
+              <w:top w:type="dxa" w:w="90"/>
+              <w:left w:type="dxa" w:w="140"/>
+              <w:bottom w:type="dxa" w:w="90"/>
+              <w:right w:type="dxa" w:w="140"/>
+            </w:tcMar>
+          </w:tcPr>
+          <w:p>
+            <w:pPr>
+              <w:spacing w:after="0" w:line="230"/>
+            </w:pPr>
+            <w:r>
+              <w:rPr>
+                <w:rFonts w:ascii="Courier New" w:cs="Courier New" w:eastAsia="Courier New" w:hAnsi="Courier New"/>
+                <w:color w:val="3A2E15"/>
+                <w:sz w:val="16"/>
+                <w:szCs w:val="16"/>
+              </w:rPr>
+              <w:t xml:space="preserve">$ cd front &amp;&amp; CI=true npm test -- --watchAll=false</w:t>
+            </w:r>
+          </w:p>
+          <w:p>
+            <w:pPr>
+              <w:spacing w:after="0" w:line="230"/>
+            </w:pPr>
+            <w:r>
+              <w:rPr>
+                <w:rFonts w:ascii="Courier New" w:cs="Courier New" w:eastAsia="Courier New" w:hAnsi="Courier New"/>
+                <w:color w:val="3A2E15"/>
+                <w:sz w:val="16"/>
+                <w:szCs w:val="16"/>
+              </w:rPr>
+              <w:t xml:space="preserve"> </w:t>
+            </w:r>
+          </w:p>
+          <w:p>
+            <w:pPr>
+              <w:spacing w:after="0" w:line="230"/>
+            </w:pPr>
+            <w:r>
+              <w:rPr>
+                <w:rFonts w:ascii="Courier New" w:cs="Courier New" w:eastAsia="Courier New" w:hAnsi="Courier New"/>
+                <w:color w:val="3A2E15"/>
+                <w:sz w:val="16"/>
+                <w:szCs w:val="16"/>
+              </w:rPr>
+              <w:t xml:space="preserve">Test Suites: 12 passed, 12 total</w:t>
+            </w:r>
+          </w:p>
+          <w:p>
+            <w:pPr>
+              <w:spacing w:after="0" w:line="230"/>
+            </w:pPr>
+            <w:r>
+              <w:rPr>
+                <w:rFonts w:ascii="Courier New" w:cs="Courier New" w:eastAsia="Courier New" w:hAnsi="Courier New"/>
+                <w:color w:val="3A2E15"/>
+                <w:sz w:val="16"/>
+                <w:szCs w:val="16"/>
+              </w:rPr>
+              <w:t xml:space="preserve">Tests:       95 passed, 95 total</w:t>
+            </w:r>
+          </w:p>
+          <w:p>
+            <w:pPr>
+              <w:spacing w:after="0" w:line="230"/>
+            </w:pPr>
+            <w:r>
+              <w:rPr>
+                <w:rFonts w:ascii="Courier New" w:cs="Courier New" w:eastAsia="Courier New" w:hAnsi="Courier New"/>
+                <w:color w:val="3A2E15"/>
+                <w:sz w:val="16"/>
+                <w:szCs w:val="16"/>
+              </w:rPr>
+              <w:t xml:space="preserve">Snapshots:   0 total</w:t>
+            </w:r>
+          </w:p>
+          <w:p>
+            <w:pPr>
+              <w:spacing w:after="0" w:line="230"/>
+            </w:pPr>
+            <w:r>
+              <w:rPr>
+                <w:rFonts w:ascii="Courier New" w:cs="Courier New" w:eastAsia="Courier New" w:hAnsi="Courier New"/>
+                <w:color w:val="3A2E15"/>
+                <w:sz w:val="16"/>
+                <w:szCs w:val="16"/>
+              </w:rPr>
+              <w:t xml:space="preserve">Ran all test suites.</w:t>
+            </w:r>
+          </w:p>
+        </w:tc>
+      </w:tr>
+    </w:tbl>
+    <w:p>
+      <w:pPr>
+        <w:pStyle w:val="Heading2"/>
+      </w:pPr>
+      <w:r>
+        <w:t xml:space="preserve">C.3 Audit des dépendances backend — Composer</w:t>
+      </w:r>
+    </w:p>
+    <w:tbl>
+      <w:tblPr>
+        <w:tblW w:type="dxa" w:w="9072"/>
+        <w:tblBorders>
+          <w:top w:val="single" w:color="auto" w:sz="4"/>
+          <w:left w:val="single" w:color="auto" w:sz="4"/>
+          <w:bottom w:val="single" w:color="auto" w:sz="4"/>
+          <w:right w:val="single" w:color="auto" w:sz="4"/>
+          <w:insideH w:val="single" w:color="auto" w:sz="4"/>
+          <w:insideV w:val="single" w:color="auto" w:sz="4"/>
+        </w:tblBorders>
+      </w:tblPr>
+      <w:tblGrid>
+        <w:gridCol w:w="9072"/>
+      </w:tblGrid>
+      <w:tr>
+        <w:tc>
+          <w:tcPr>
+            <w:tcW w:type="dxa" w:w="9072"/>
+            <w:tcBorders>
+              <w:top w:val="single" w:color="E0D5BB" w:sz="2"/>
+              <w:left w:val="single" w:color="E0D5BB" w:sz="2"/>
+              <w:bottom w:val="single" w:color="E0D5BB" w:sz="2"/>
+              <w:right w:val="single" w:color="E0D5BB" w:sz="2"/>
+            </w:tcBorders>
+            <w:shd w:fill="FAF6EC" w:val="clear"/>
+            <w:tcMar>
+              <w:top w:type="dxa" w:w="90"/>
+              <w:left w:type="dxa" w:w="140"/>
+              <w:bottom w:type="dxa" w:w="90"/>
+              <w:right w:type="dxa" w:w="140"/>
+            </w:tcMar>
+          </w:tcPr>
+          <w:p>
+            <w:pPr>
+              <w:spacing w:after="0" w:line="230"/>
+            </w:pPr>
+            <w:r>
+              <w:rPr>
+                <w:rFonts w:ascii="Courier New" w:cs="Courier New" w:eastAsia="Courier New" w:hAnsi="Courier New"/>
+                <w:color w:val="3A2E15"/>
+                <w:sz w:val="16"/>
+                <w:szCs w:val="16"/>
+              </w:rPr>
+              <w:t xml:space="preserve">$ cd back &amp;&amp; composer audit</w:t>
+            </w:r>
+          </w:p>
+          <w:p>
+            <w:pPr>
+              <w:spacing w:after="0" w:line="230"/>
+            </w:pPr>
+            <w:r>
+              <w:rPr>
+                <w:rFonts w:ascii="Courier New" w:cs="Courier New" w:eastAsia="Courier New" w:hAnsi="Courier New"/>
+                <w:color w:val="3A2E15"/>
+                <w:sz w:val="16"/>
+                <w:szCs w:val="16"/>
+              </w:rPr>
+              <w:t xml:space="preserve">No security vulnerability advisories found.</w:t>
+            </w:r>
+          </w:p>
+        </w:tc>
+      </w:tr>
+    </w:tbl>
+    <w:p>
+      <w:pPr>
+        <w:pStyle w:val="Heading2"/>
+      </w:pPr>
+      <w:r>
+        <w:t xml:space="preserve">C.4 Audit des dépendances frontend — npm</w:t>
+      </w:r>
+    </w:p>
+    <w:tbl>
+      <w:tblPr>
+        <w:tblW w:type="dxa" w:w="9072"/>
+        <w:tblBorders>
+          <w:top w:val="single" w:color="auto" w:sz="4"/>
+          <w:left w:val="single" w:color="auto" w:sz="4"/>
+          <w:bottom w:val="single" w:color="auto" w:sz="4"/>
+          <w:right w:val="single" w:color="auto" w:sz="4"/>
+          <w:insideH w:val="single" w:color="auto" w:sz="4"/>
+          <w:insideV w:val="single" w:color="auto" w:sz="4"/>
+        </w:tblBorders>
+      </w:tblPr>
+      <w:tblGrid>
+        <w:gridCol w:w="9072"/>
+      </w:tblGrid>
+      <w:tr>
+        <w:tc>
+          <w:tcPr>
+            <w:tcW w:type="dxa" w:w="9072"/>
+            <w:tcBorders>
+              <w:top w:val="single" w:color="E0D5BB" w:sz="2"/>
+              <w:left w:val="single" w:color="E0D5BB" w:sz="2"/>
+              <w:bottom w:val="single" w:color="E0D5BB" w:sz="2"/>
+              <w:right w:val="single" w:color="E0D5BB" w:sz="2"/>
+            </w:tcBorders>
+            <w:shd w:fill="FAF6EC" w:val="clear"/>
+            <w:tcMar>
+              <w:top w:type="dxa" w:w="90"/>
+              <w:left w:type="dxa" w:w="140"/>
+              <w:bottom w:type="dxa" w:w="90"/>
+              <w:right w:type="dxa" w:w="140"/>
+            </w:tcMar>
+          </w:tcPr>
+          <w:p>
+            <w:pPr>
+              <w:spacing w:after="0" w:line="230"/>
+            </w:pPr>
+            <w:r>
+              <w:rPr>
+                <w:rFonts w:ascii="Courier New" w:cs="Courier New" w:eastAsia="Courier New" w:hAnsi="Courier New"/>
+                <w:color w:val="3A2E15"/>
+                <w:sz w:val="16"/>
+                <w:szCs w:val="16"/>
+              </w:rPr>
+              <w:t xml:space="preserve">$ cd front &amp;&amp; npm audit</w:t>
+            </w:r>
+          </w:p>
+          <w:p>
+            <w:pPr>
+              <w:spacing w:after="0" w:line="230"/>
+            </w:pPr>
+            <w:r>
+              <w:rPr>
+                <w:rFonts w:ascii="Courier New" w:cs="Courier New" w:eastAsia="Courier New" w:hAnsi="Courier New"/>
+                <w:color w:val="3A2E15"/>
+                <w:sz w:val="16"/>
+                <w:szCs w:val="16"/>
+              </w:rPr>
+              <w:t xml:space="preserve">59 vulnerabilities (13 low, 16 moderate, 28 high, 2 critical)</w:t>
+            </w:r>
+          </w:p>
+        </w:tc>
+      </w:tr>
+    </w:tbl>
+    <w:p>
+      <w:pPr>
+        <w:spacing w:after="140" w:before="0" w:line="330"/>
+        <w:jc w:val="both"/>
+      </w:pPr>
+      <w:r>
+        <w:rPr>
+          <w:b w:val="false"/>
+          <w:bCs w:val="false"/>
+          <w:i w:val="false"/>
+          <w:iCs w:val="false"/>
+          <w:sz w:val="22"/>
+          <w:szCs w:val="22"/>
+        </w:rPr>
+        <w:t xml:space="preserve">Lecture : la totalité de ces 59 avis concernent la chaîne de build react-scripts (outillage de développement, jamais exécuté ni servi en production). Ce risque est accepté et documenté (§7, A06) ; la sortie de Create React App vers Vite est planifiée comme axe d'amélioration. Les dépendances effectivement embarquées dans le bundle de production (React, MUI, axios, i18next) ne portent aucun avis.</w:t>
+      </w:r>
+    </w:p>
+    <w:p>
+      <w:pPr>
+        <w:pStyle w:val="Heading2"/>
+      </w:pPr>
+      <w:r>
+        <w:t xml:space="preserve">C.5 Vérification de l'endpoint de supervision</w:t>
+      </w:r>
+    </w:p>
+    <w:tbl>
+      <w:tblPr>
+        <w:tblW w:type="dxa" w:w="9072"/>
+        <w:tblBorders>
+          <w:top w:val="single" w:color="auto" w:sz="4"/>
+          <w:left w:val="single" w:color="auto" w:sz="4"/>
+          <w:bottom w:val="single" w:color="auto" w:sz="4"/>
+          <w:right w:val="single" w:color="auto" w:sz="4"/>
+          <w:insideH w:val="single" w:color="auto" w:sz="4"/>
+          <w:insideV w:val="single" w:color="auto" w:sz="4"/>
+        </w:tblBorders>
+      </w:tblPr>
+      <w:tblGrid>
+        <w:gridCol w:w="9072"/>
+      </w:tblGrid>
+      <w:tr>
+        <w:tc>
+          <w:tcPr>
+            <w:tcW w:type="dxa" w:w="9072"/>
+            <w:tcBorders>
+              <w:top w:val="single" w:color="E0D5BB" w:sz="2"/>
+              <w:left w:val="single" w:color="E0D5BB" w:sz="2"/>
+              <w:bottom w:val="single" w:color="E0D5BB" w:sz="2"/>
+              <w:right w:val="single" w:color="E0D5BB" w:sz="2"/>
+            </w:tcBorders>
+            <w:shd w:fill="FAF6EC" w:val="clear"/>
+            <w:tcMar>
+              <w:top w:type="dxa" w:w="90"/>
+              <w:left w:type="dxa" w:w="140"/>
+              <w:bottom w:type="dxa" w:w="90"/>
+              <w:right w:type="dxa" w:w="140"/>
+            </w:tcMar>
+          </w:tcPr>
+          <w:p>
+            <w:pPr>
+              <w:spacing w:after="0" w:line="230"/>
+            </w:pPr>
+            <w:r>
+              <w:rPr>
+                <w:rFonts w:ascii="Courier New" w:cs="Courier New" w:eastAsia="Courier New" w:hAnsi="Courier New"/>
+                <w:color w:val="3A2E15"/>
+                <w:sz w:val="16"/>
+                <w:szCs w:val="16"/>
+              </w:rPr>
+              <w:t xml:space="preserve">$ curl -s https://localhost:8000/api/health</w:t>
+            </w:r>
+          </w:p>
+          <w:p>
+            <w:pPr>
+              <w:spacing w:after="0" w:line="230"/>
+            </w:pPr>
+            <w:r>
+              <w:rPr>
+                <w:rFonts w:ascii="Courier New" w:cs="Courier New" w:eastAsia="Courier New" w:hAnsi="Courier New"/>
+                <w:color w:val="3A2E15"/>
+                <w:sz w:val="16"/>
+                <w:szCs w:val="16"/>
+              </w:rPr>
+              <w:t xml:space="preserve">{"status":"OK","timestamp":"2026-07-14T21:08:38+00:00",</w:t>
+            </w:r>
+          </w:p>
+          <w:p>
+            <w:pPr>
+              <w:spacing w:after="0" w:line="230"/>
+            </w:pPr>
+            <w:r>
+              <w:rPr>
+                <w:rFonts w:ascii="Courier New" w:cs="Courier New" w:eastAsia="Courier New" w:hAnsi="Courier New"/>
+                <w:color w:val="3A2E15"/>
+                <w:sz w:val="16"/>
+                <w:szCs w:val="16"/>
+              </w:rPr>
+              <w:t xml:space="preserve"> "services":{"database":{"status":"OK","message":"Database connected"},</w:t>
+            </w:r>
+          </w:p>
+          <w:p>
+            <w:pPr>
+              <w:spacing w:after="0" w:line="230"/>
+            </w:pPr>
+            <w:r>
+              <w:rPr>
+                <w:rFonts w:ascii="Courier New" w:cs="Courier New" w:eastAsia="Courier New" w:hAnsi="Courier New"/>
+                <w:color w:val="3A2E15"/>
+                <w:sz w:val="16"/>
+                <w:szCs w:val="16"/>
+              </w:rPr>
+              <w:t xml:space="preserve">             "albion_api":{"status":"OK","message":"Albion API reachable"}}}</w:t>
+            </w:r>
+          </w:p>
+        </w:tc>
+      </w:tr>
+    </w:tbl>
     <w:sectPr>
       <w:headerReference w:type="default" r:id="rId7"/>
       <w:headerReference w:type="first" r:id="rId8"/>

</xml_diff>

<commit_message>
docs(rncp): dossier Bloc 2 v3 — corps porté à 28 pages + 4 pages d'annexes
Nouvelles sections : §1.4 parcours utilisateur + captures mobile, §2.3
organisation du code, §4.4 gestion des secrets, §5.2 scénarios d'échec,
§6.4 pyramide de tests, §7.2 RGPD (minimisation), §7.3 cycle de vie des
clés, §9.3 extrait git log, §12.4 sauvegarde/restauration. Registre étendu
à BUG-016. Menus langues/serveur recadrés. 32 pages au total, OOXML PASSED.

Co-Authored-By: Claude Fable 5 <noreply@anthropic.com>
</commit_message>
<xml_diff>
--- a/dossier/Dossier_Bloc2_Albion_Helper_v3.docx
+++ b/dossier/Dossier_Bloc2_Albion_Helper_v3.docx
@@ -2753,6 +2753,7 @@
               <w:bottom w:type="dxa" w:w="40"/>
               <w:right w:type="dxa" w:w="60"/>
             </w:tcMar>
+            <w:vAlign w:val="center"/>
           </w:tcPr>
           <w:p>
             <w:pPr>
@@ -2762,7 +2763,7 @@
             <w:r>
               <w:drawing>
                 <wp:inline distT="0" distB="0" distL="0" distR="0">
-                  <wp:extent cx="2619375" cy="1638300"/>
+                  <wp:extent cx="1571625" cy="2990850"/>
                   <wp:effectExtent t="0" r="0" b="0" l="0"/>
                   <wp:docPr id="1" name="figure-9" descr="20 langues d'interface administrables" title="20 langues d'interface administrables"/>
                   <wp:cNvGraphicFramePr>
@@ -2787,7 +2788,7 @@
                         <pic:spPr bwMode="auto">
                           <a:xfrm>
                             <a:off x="0" y="0"/>
-                            <a:ext cx="2619375" cy="1638300"/>
+                            <a:ext cx="1571625" cy="2990850"/>
                           </a:xfrm>
                           <a:prstGeom prst="rect">
                             <a:avLst/>
@@ -2832,6 +2833,7 @@
               <w:bottom w:type="dxa" w:w="40"/>
               <w:right w:type="dxa" w:w="60"/>
             </w:tcMar>
+            <w:vAlign w:val="center"/>
           </w:tcPr>
           <w:p>
             <w:pPr>
@@ -2841,7 +2843,7 @@
             <w:r>
               <w:drawing>
                 <wp:inline distT="0" distB="0" distL="0" distR="0">
-                  <wp:extent cx="2619375" cy="1638300"/>
+                  <wp:extent cx="2762250" cy="1476375"/>
                   <wp:effectExtent t="0" r="0" b="0" l="0"/>
                   <wp:docPr id="1" name="figure-10" descr="Sélecteur de serveur de jeu (v3)" title="Sélecteur de serveur de jeu (v3)"/>
                   <wp:cNvGraphicFramePr>
@@ -2866,7 +2868,7 @@
                         <pic:spPr bwMode="auto">
                           <a:xfrm>
                             <a:off x="0" y="0"/>
-                            <a:ext cx="2619375" cy="1638300"/>
+                            <a:ext cx="2762250" cy="1476375"/>
                           </a:xfrm>
                           <a:prstGeom prst="rect">
                             <a:avLst/>
@@ -2893,6 +2895,317 @@
                 <w:szCs w:val="18"/>
               </w:rPr>
               <w:t xml:space="preserve">Figure 10 — Sélecteur de serveur de jeu (v3)</w:t>
+            </w:r>
+          </w:p>
+        </w:tc>
+      </w:tr>
+    </w:tbl>
+    <w:p>
+      <w:pPr>
+        <w:pStyle w:val="Heading2"/>
+      </w:pPr>
+      <w:r>
+        <w:t xml:space="preserve">1.4 Parcours utilisateur type et usage mobile</w:t>
+      </w:r>
+    </w:p>
+    <w:p>
+      <w:pPr>
+        <w:spacing w:after="140" w:before="0" w:line="330"/>
+        <w:jc w:val="both"/>
+      </w:pPr>
+      <w:r>
+        <w:rPr>
+          <w:b w:val="false"/>
+          <w:bCs w:val="false"/>
+          <w:i w:val="false"/>
+          <w:iCs w:val="false"/>
+          <w:sz w:val="22"/>
+          <w:szCs w:val="22"/>
+        </w:rPr>
+        <w:t xml:space="preserve">Le parcours nominal d'un nouvel utilisateur, tel qu'il a servi de fil conducteur à la conception (et que reprend le scénario de démonstration du Bloc 3) :</w:t>
+      </w:r>
+    </w:p>
+    <w:p>
+      <w:pPr>
+        <w:pStyle w:val="ListParagraph"/>
+        <w:numPr>
+          <w:ilvl w:val="0"/>
+          <w:numId w:val="2"/>
+        </w:numPr>
+        <w:spacing w:after="80" w:line="330"/>
+        <w:jc w:val="both"/>
+      </w:pPr>
+      <w:r>
+        <w:rPr>
+          <w:sz w:val="22"/>
+          <w:szCs w:val="22"/>
+        </w:rPr>
+        <w:t xml:space="preserve">Inscription en deux champs (identifiant + mot de passe) : aucune autre donnée n'est demandée — la visite guidée interactive est proposée dès l'accueil, avant même la création du compte.</w:t>
+      </w:r>
+    </w:p>
+    <w:p>
+      <w:pPr>
+        <w:pStyle w:val="ListParagraph"/>
+        <w:numPr>
+          <w:ilvl w:val="0"/>
+          <w:numId w:val="2"/>
+        </w:numPr>
+        <w:spacing w:after="80" w:line="330"/>
+        <w:jc w:val="both"/>
+      </w:pPr>
+      <w:r>
+        <w:rPr>
+          <w:sz w:val="22"/>
+          <w:szCs w:val="22"/>
+        </w:rPr>
+        <w:t xml:space="preserve">Choix du serveur de jeu (Americas / Europe / Asia) et de la langue depuis l'en-tête : les deux préférences sont mémorisées et s'appliquent à toutes les recherches.</w:t>
+      </w:r>
+    </w:p>
+    <w:p>
+      <w:pPr>
+        <w:pStyle w:val="ListParagraph"/>
+        <w:numPr>
+          <w:ilvl w:val="0"/>
+          <w:numId w:val="2"/>
+        </w:numPr>
+        <w:spacing w:after="80" w:line="330"/>
+        <w:jc w:val="both"/>
+      </w:pPr>
+      <w:r>
+        <w:rPr>
+          <w:sz w:val="22"/>
+          <w:szCs w:val="22"/>
+        </w:rPr>
+        <w:t xml:space="preserve">Recherche d'un joueur ou d'une guilde depuis le tableau de bord, consultation de la fiche détaillée et du rapport de session PvP.</w:t>
+      </w:r>
+    </w:p>
+    <w:p>
+      <w:pPr>
+        <w:pStyle w:val="ListParagraph"/>
+        <w:numPr>
+          <w:ilvl w:val="0"/>
+          <w:numId w:val="2"/>
+        </w:numPr>
+        <w:spacing w:after="80" w:line="330"/>
+        <w:jc w:val="both"/>
+      </w:pPr>
+      <w:r>
+        <w:rPr>
+          <w:sz w:val="22"/>
+          <w:szCs w:val="22"/>
+        </w:rPr>
+        <w:t xml:space="preserve">Préparation d'une session : création d'une route de farming (zones + minuteurs) puis partage du lien public à la guilde — les destinataires n'ont pas besoin de compte.</w:t>
+      </w:r>
+    </w:p>
+    <w:p>
+      <w:pPr>
+        <w:pStyle w:val="ListParagraph"/>
+        <w:numPr>
+          <w:ilvl w:val="0"/>
+          <w:numId w:val="2"/>
+        </w:numPr>
+        <w:spacing w:after="80" w:line="330"/>
+        <w:jc w:val="both"/>
+      </w:pPr>
+      <w:r>
+        <w:rPr>
+          <w:sz w:val="22"/>
+          <w:szCs w:val="22"/>
+        </w:rPr>
+        <w:t xml:space="preserve">Optimisation : calcul de rentabilité de craft sur les prix de marché du serveur choisi, sauvegarde du profil de maîtrises.</w:t>
+      </w:r>
+    </w:p>
+    <w:p>
+      <w:pPr>
+        <w:spacing w:after="140" w:before="0" w:line="330"/>
+        <w:jc w:val="both"/>
+      </w:pPr>
+      <w:r>
+        <w:rPr>
+          <w:b w:val="false"/>
+          <w:bCs w:val="false"/>
+          <w:i w:val="false"/>
+          <w:iCs w:val="false"/>
+          <w:sz w:val="22"/>
+          <w:szCs w:val="22"/>
+        </w:rPr>
+        <w:t xml:space="preserve">Le public visé joue sur PC, mais la consultation nomade (suivre une route, vérifier un prix depuis son téléphone) est un usage réel : l'interface est entièrement responsive — grilles fluides Material UI, navigation repliée dans un tiroir latéral, cibles tactiles dimensionnées.</w:t>
+      </w:r>
+    </w:p>
+    <w:tbl>
+      <w:tblPr>
+        <w:tblW w:type="dxa" w:w="9072"/>
+        <w:tblBorders>
+          <w:top w:val="single" w:color="auto" w:sz="4"/>
+          <w:left w:val="single" w:color="auto" w:sz="4"/>
+          <w:bottom w:val="single" w:color="auto" w:sz="4"/>
+          <w:right w:val="single" w:color="auto" w:sz="4"/>
+          <w:insideH w:val="single" w:color="auto" w:sz="4"/>
+          <w:insideV w:val="single" w:color="auto" w:sz="4"/>
+        </w:tblBorders>
+      </w:tblPr>
+      <w:tblGrid>
+        <w:gridCol w:w="4536"/>
+        <w:gridCol w:w="4536"/>
+      </w:tblGrid>
+      <w:tr>
+        <w:tc>
+          <w:tcPr>
+            <w:tcW w:type="dxa" w:w="4536"/>
+            <w:tcBorders>
+              <w:top w:val="none" w:color="FFFFFF" w:sz="0"/>
+              <w:left w:val="none" w:color="FFFFFF" w:sz="0"/>
+              <w:bottom w:val="none" w:color="FFFFFF" w:sz="0"/>
+              <w:right w:val="none" w:color="FFFFFF" w:sz="0"/>
+            </w:tcBorders>
+            <w:tcMar>
+              <w:top w:type="dxa" w:w="40"/>
+              <w:left w:type="dxa" w:w="60"/>
+              <w:bottom w:type="dxa" w:w="40"/>
+              <w:right w:type="dxa" w:w="60"/>
+            </w:tcMar>
+            <w:vAlign w:val="center"/>
+          </w:tcPr>
+          <w:p>
+            <w:pPr>
+              <w:spacing w:after="20"/>
+              <w:jc w:val="center"/>
+            </w:pPr>
+            <w:r>
+              <w:drawing>
+                <wp:inline distT="0" distB="0" distL="0" distR="0">
+                  <wp:extent cx="1428750" cy="3095625"/>
+                  <wp:effectExtent t="0" r="0" b="0" l="0"/>
+                  <wp:docPr id="1" name="figure-11" descr="Accueil sur mobile (390 px)" title="Accueil sur mobile (390 px)"/>
+                  <wp:cNvGraphicFramePr>
+                    <a:graphicFrameLocks xmlns:a="http://schemas.openxmlformats.org/drawingml/2006/main" noChangeAspect="1"/>
+                  </wp:cNvGraphicFramePr>
+                  <a:graphic xmlns:a="http://schemas.openxmlformats.org/drawingml/2006/main">
+                    <a:graphicData uri="http://schemas.openxmlformats.org/drawingml/2006/picture">
+                      <pic:pic xmlns:pic="http://schemas.openxmlformats.org/drawingml/2006/picture">
+                        <pic:nvPicPr>
+                          <pic:cNvPr id="0" name="" descr=""/>
+                          <pic:cNvPicPr>
+                            <a:picLocks noChangeAspect="1" noChangeArrowheads="1"/>
+                          </pic:cNvPicPr>
+                        </pic:nvPicPr>
+                        <pic:blipFill>
+                          <a:blip r:embed="rId22" cstate="none"/>
+                          <a:srcRect/>
+                          <a:stretch>
+                            <a:fillRect/>
+                          </a:stretch>
+                        </pic:blipFill>
+                        <pic:spPr bwMode="auto">
+                          <a:xfrm>
+                            <a:off x="0" y="0"/>
+                            <a:ext cx="1428750" cy="3095625"/>
+                          </a:xfrm>
+                          <a:prstGeom prst="rect">
+                            <a:avLst/>
+                          </a:prstGeom>
+                        </pic:spPr>
+                      </pic:pic>
+                    </a:graphicData>
+                  </a:graphic>
+                </wp:inline>
+              </w:drawing>
+            </w:r>
+          </w:p>
+          <w:p>
+            <w:pPr>
+              <w:spacing w:after="0"/>
+              <w:jc w:val="center"/>
+            </w:pPr>
+            <w:r>
+              <w:rPr>
+                <w:i/>
+                <w:iCs/>
+                <w:color w:val="5A4825"/>
+                <w:sz w:val="18"/>
+                <w:szCs w:val="18"/>
+              </w:rPr>
+              <w:t xml:space="preserve">Figure 11 — Accueil sur mobile (390 px)</w:t>
+            </w:r>
+          </w:p>
+        </w:tc>
+        <w:tc>
+          <w:tcPr>
+            <w:tcW w:type="dxa" w:w="4536"/>
+            <w:tcBorders>
+              <w:top w:val="none" w:color="FFFFFF" w:sz="0"/>
+              <w:left w:val="none" w:color="FFFFFF" w:sz="0"/>
+              <w:bottom w:val="none" w:color="FFFFFF" w:sz="0"/>
+              <w:right w:val="none" w:color="FFFFFF" w:sz="0"/>
+            </w:tcBorders>
+            <w:tcMar>
+              <w:top w:type="dxa" w:w="40"/>
+              <w:left w:type="dxa" w:w="60"/>
+              <w:bottom w:type="dxa" w:w="40"/>
+              <w:right w:type="dxa" w:w="60"/>
+            </w:tcMar>
+            <w:vAlign w:val="center"/>
+          </w:tcPr>
+          <w:p>
+            <w:pPr>
+              <w:spacing w:after="20"/>
+              <w:jc w:val="center"/>
+            </w:pPr>
+            <w:r>
+              <w:drawing>
+                <wp:inline distT="0" distB="0" distL="0" distR="0">
+                  <wp:extent cx="1428750" cy="3095625"/>
+                  <wp:effectExtent t="0" r="0" b="0" l="0"/>
+                  <wp:docPr id="1" name="figure-12" descr="Navigation mobile : tiroir groupé Exploration / Outils" title="Navigation mobile : tiroir groupé Exploration / Outils"/>
+                  <wp:cNvGraphicFramePr>
+                    <a:graphicFrameLocks xmlns:a="http://schemas.openxmlformats.org/drawingml/2006/main" noChangeAspect="1"/>
+                  </wp:cNvGraphicFramePr>
+                  <a:graphic xmlns:a="http://schemas.openxmlformats.org/drawingml/2006/main">
+                    <a:graphicData uri="http://schemas.openxmlformats.org/drawingml/2006/picture">
+                      <pic:pic xmlns:pic="http://schemas.openxmlformats.org/drawingml/2006/picture">
+                        <pic:nvPicPr>
+                          <pic:cNvPr id="0" name="" descr=""/>
+                          <pic:cNvPicPr>
+                            <a:picLocks noChangeAspect="1" noChangeArrowheads="1"/>
+                          </pic:cNvPicPr>
+                        </pic:nvPicPr>
+                        <pic:blipFill>
+                          <a:blip r:embed="rId23" cstate="none"/>
+                          <a:srcRect/>
+                          <a:stretch>
+                            <a:fillRect/>
+                          </a:stretch>
+                        </pic:blipFill>
+                        <pic:spPr bwMode="auto">
+                          <a:xfrm>
+                            <a:off x="0" y="0"/>
+                            <a:ext cx="1428750" cy="3095625"/>
+                          </a:xfrm>
+                          <a:prstGeom prst="rect">
+                            <a:avLst/>
+                          </a:prstGeom>
+                        </pic:spPr>
+                      </pic:pic>
+                    </a:graphicData>
+                  </a:graphic>
+                </wp:inline>
+              </w:drawing>
+            </w:r>
+          </w:p>
+          <w:p>
+            <w:pPr>
+              <w:spacing w:after="0"/>
+              <w:jc w:val="center"/>
+            </w:pPr>
+            <w:r>
+              <w:rPr>
+                <w:i/>
+                <w:iCs/>
+                <w:color w:val="5A4825"/>
+                <w:sz w:val="18"/>
+                <w:szCs w:val="18"/>
+              </w:rPr>
+              <w:t xml:space="preserve">Figure 12 — Navigation mobile : tiroir groupé Exploration / Outils</w:t>
             </w:r>
           </w:p>
         </w:tc>
@@ -3633,7 +3946,7 @@
         <w:pStyle w:val="ListParagraph"/>
         <w:numPr>
           <w:ilvl w:val="0"/>
-          <w:numId w:val="2"/>
+          <w:numId w:val="3"/>
         </w:numPr>
         <w:spacing w:after="80" w:line="330"/>
         <w:jc w:val="both"/>
@@ -3651,7 +3964,7 @@
         <w:pStyle w:val="ListParagraph"/>
         <w:numPr>
           <w:ilvl w:val="0"/>
-          <w:numId w:val="2"/>
+          <w:numId w:val="3"/>
         </w:numPr>
         <w:spacing w:after="80" w:line="330"/>
         <w:jc w:val="both"/>
@@ -3669,7 +3982,7 @@
         <w:pStyle w:val="ListParagraph"/>
         <w:numPr>
           <w:ilvl w:val="0"/>
-          <w:numId w:val="2"/>
+          <w:numId w:val="3"/>
         </w:numPr>
         <w:spacing w:after="80" w:line="330"/>
         <w:jc w:val="both"/>
@@ -3687,7 +4000,7 @@
         <w:pStyle w:val="ListParagraph"/>
         <w:numPr>
           <w:ilvl w:val="0"/>
-          <w:numId w:val="2"/>
+          <w:numId w:val="3"/>
         </w:numPr>
         <w:spacing w:after="80" w:line="330"/>
         <w:jc w:val="both"/>
@@ -3705,7 +4018,7 @@
         <w:pStyle w:val="ListParagraph"/>
         <w:numPr>
           <w:ilvl w:val="0"/>
-          <w:numId w:val="2"/>
+          <w:numId w:val="3"/>
         </w:numPr>
         <w:spacing w:after="80" w:line="330"/>
         <w:jc w:val="both"/>
@@ -3716,6 +4029,338 @@
           <w:szCs w:val="22"/>
         </w:rPr>
         <w:t xml:space="preserve">Data-mapper : les entités Doctrine sont de purs objets métier, la persistance est déléguée aux repositories.</w:t>
+      </w:r>
+    </w:p>
+    <w:p>
+      <w:pPr>
+        <w:pStyle w:val="Heading2"/>
+      </w:pPr>
+      <w:r>
+        <w:t xml:space="preserve">2.3 Organisation du code et qualité au quotidien</w:t>
+      </w:r>
+    </w:p>
+    <w:p>
+      <w:pPr>
+        <w:spacing w:after="140" w:before="0" w:line="330"/>
+        <w:jc w:val="both"/>
+      </w:pPr>
+      <w:r>
+        <w:rPr>
+          <w:b w:val="false"/>
+          <w:bCs w:val="false"/>
+          <w:i w:val="false"/>
+          <w:iCs w:val="false"/>
+          <w:sz w:val="22"/>
+          <w:szCs w:val="22"/>
+        </w:rPr>
+        <w:t xml:space="preserve">L'arborescence matérialise l'architecture : un développeur qui rejoint le projet sait où chercher et où écrire.</w:t>
+      </w:r>
+    </w:p>
+    <w:tbl>
+      <w:tblPr>
+        <w:tblW w:type="dxa" w:w="9072"/>
+        <w:tblBorders>
+          <w:top w:val="single" w:color="auto" w:sz="4"/>
+          <w:left w:val="single" w:color="auto" w:sz="4"/>
+          <w:bottom w:val="single" w:color="auto" w:sz="4"/>
+          <w:right w:val="single" w:color="auto" w:sz="4"/>
+          <w:insideH w:val="single" w:color="auto" w:sz="4"/>
+          <w:insideV w:val="single" w:color="auto" w:sz="4"/>
+        </w:tblBorders>
+      </w:tblPr>
+      <w:tblGrid>
+        <w:gridCol w:w="9072"/>
+      </w:tblGrid>
+      <w:tr>
+        <w:tc>
+          <w:tcPr>
+            <w:tcW w:type="dxa" w:w="9072"/>
+            <w:tcBorders>
+              <w:top w:val="single" w:color="E0D5BB" w:sz="2"/>
+              <w:left w:val="single" w:color="E0D5BB" w:sz="2"/>
+              <w:bottom w:val="single" w:color="E0D5BB" w:sz="2"/>
+              <w:right w:val="single" w:color="E0D5BB" w:sz="2"/>
+            </w:tcBorders>
+            <w:shd w:fill="FAF6EC" w:val="clear"/>
+            <w:tcMar>
+              <w:top w:type="dxa" w:w="90"/>
+              <w:left w:type="dxa" w:w="140"/>
+              <w:bottom w:type="dxa" w:w="90"/>
+              <w:right w:type="dxa" w:w="140"/>
+            </w:tcMar>
+          </w:tcPr>
+          <w:p>
+            <w:pPr>
+              <w:spacing w:after="0" w:line="230"/>
+            </w:pPr>
+            <w:r>
+              <w:rPr>
+                <w:rFonts w:ascii="Courier New" w:cs="Courier New" w:eastAsia="Courier New" w:hAnsi="Courier New"/>
+                <w:color w:val="3A2E15"/>
+                <w:sz w:val="16"/>
+                <w:szCs w:val="16"/>
+              </w:rPr>
+              <w:t xml:space="preserve">back/src/</w:t>
+            </w:r>
+          </w:p>
+          <w:p>
+            <w:pPr>
+              <w:spacing w:after="0" w:line="230"/>
+            </w:pPr>
+            <w:r>
+              <w:rPr>
+                <w:rFonts w:ascii="Courier New" w:cs="Courier New" w:eastAsia="Courier New" w:hAnsi="Courier New"/>
+                <w:color w:val="3A2E15"/>
+                <w:sz w:val="16"/>
+                <w:szCs w:val="16"/>
+              </w:rPr>
+              <w:t xml:space="preserve">├── Controller/       # 13 contrôleurs REST minces (validation + délégation)</w:t>
+            </w:r>
+          </w:p>
+          <w:p>
+            <w:pPr>
+              <w:spacing w:after="0" w:line="230"/>
+            </w:pPr>
+            <w:r>
+              <w:rPr>
+                <w:rFonts w:ascii="Courier New" w:cs="Courier New" w:eastAsia="Courier New" w:hAnsi="Courier New"/>
+                <w:color w:val="3A2E15"/>
+                <w:sz w:val="16"/>
+                <w:szCs w:val="16"/>
+              </w:rPr>
+              <w:t xml:space="preserve">├── Service/          # 8 services métier : Player, Guild, Battle, ItemSync,</w:t>
+            </w:r>
+          </w:p>
+          <w:p>
+            <w:pPr>
+              <w:spacing w:after="0" w:line="230"/>
+            </w:pPr>
+            <w:r>
+              <w:rPr>
+                <w:rFonts w:ascii="Courier New" w:cs="Courier New" w:eastAsia="Courier New" w:hAnsi="Courier New"/>
+                <w:color w:val="3A2E15"/>
+                <w:sz w:val="16"/>
+                <w:szCs w:val="16"/>
+              </w:rPr>
+              <w:t xml:space="preserve">│                     #   ItemMarket, Map, LocaleManager, AlbionDataMapper</w:t>
+            </w:r>
+          </w:p>
+          <w:p>
+            <w:pPr>
+              <w:spacing w:after="0" w:line="230"/>
+            </w:pPr>
+            <w:r>
+              <w:rPr>
+                <w:rFonts w:ascii="Courier New" w:cs="Courier New" w:eastAsia="Courier New" w:hAnsi="Courier New"/>
+                <w:color w:val="3A2E15"/>
+                <w:sz w:val="16"/>
+                <w:szCs w:val="16"/>
+              </w:rPr>
+              <w:t xml:space="preserve">├── Repository/       # accès aux données (requêtes Doctrine paramétrées)</w:t>
+            </w:r>
+          </w:p>
+          <w:p>
+            <w:pPr>
+              <w:spacing w:after="0" w:line="230"/>
+            </w:pPr>
+            <w:r>
+              <w:rPr>
+                <w:rFonts w:ascii="Courier New" w:cs="Courier New" w:eastAsia="Courier New" w:hAnsi="Courier New"/>
+                <w:color w:val="3A2E15"/>
+                <w:sz w:val="16"/>
+                <w:szCs w:val="16"/>
+              </w:rPr>
+              <w:t xml:space="preserve">├── Entity/           # 14 entités (cf. §3.2)</w:t>
+            </w:r>
+          </w:p>
+          <w:p>
+            <w:pPr>
+              <w:spacing w:after="0" w:line="230"/>
+            </w:pPr>
+            <w:r>
+              <w:rPr>
+                <w:rFonts w:ascii="Courier New" w:cs="Courier New" w:eastAsia="Courier New" w:hAnsi="Courier New"/>
+                <w:color w:val="3A2E15"/>
+                <w:sz w:val="16"/>
+                <w:szCs w:val="16"/>
+              </w:rPr>
+              <w:t xml:space="preserve">├── EventSubscriber/  # préoccupations transverses (en-têtes de sécurité)</w:t>
+            </w:r>
+          </w:p>
+          <w:p>
+            <w:pPr>
+              <w:spacing w:after="0" w:line="230"/>
+            </w:pPr>
+            <w:r>
+              <w:rPr>
+                <w:rFonts w:ascii="Courier New" w:cs="Courier New" w:eastAsia="Courier New" w:hAnsi="Courier New"/>
+                <w:color w:val="3A2E15"/>
+                <w:sz w:val="16"/>
+                <w:szCs w:val="16"/>
+              </w:rPr>
+              <w:t xml:space="preserve">└── DataFixtures/     # comptes et données de l'environnement de test</w:t>
+            </w:r>
+          </w:p>
+          <w:p>
+            <w:pPr>
+              <w:spacing w:after="0" w:line="230"/>
+            </w:pPr>
+            <w:r>
+              <w:rPr>
+                <w:rFonts w:ascii="Courier New" w:cs="Courier New" w:eastAsia="Courier New" w:hAnsi="Courier New"/>
+                <w:color w:val="3A2E15"/>
+                <w:sz w:val="16"/>
+                <w:szCs w:val="16"/>
+              </w:rPr>
+              <w:t xml:space="preserve"> </w:t>
+            </w:r>
+          </w:p>
+          <w:p>
+            <w:pPr>
+              <w:spacing w:after="0" w:line="230"/>
+            </w:pPr>
+            <w:r>
+              <w:rPr>
+                <w:rFonts w:ascii="Courier New" w:cs="Courier New" w:eastAsia="Courier New" w:hAnsi="Courier New"/>
+                <w:color w:val="3A2E15"/>
+                <w:sz w:val="16"/>
+                <w:szCs w:val="16"/>
+              </w:rPr>
+              <w:t xml:space="preserve">front/src/</w:t>
+            </w:r>
+          </w:p>
+          <w:p>
+            <w:pPr>
+              <w:spacing w:after="0" w:line="230"/>
+            </w:pPr>
+            <w:r>
+              <w:rPr>
+                <w:rFonts w:ascii="Courier New" w:cs="Courier New" w:eastAsia="Courier New" w:hAnsi="Courier New"/>
+                <w:color w:val="3A2E15"/>
+                <w:sz w:val="16"/>
+                <w:szCs w:val="16"/>
+              </w:rPr>
+              <w:t xml:space="preserve">├── pages/            # 15 pages, chacune avec ses styles et ses tests</w:t>
+            </w:r>
+          </w:p>
+          <w:p>
+            <w:pPr>
+              <w:spacing w:after="0" w:line="230"/>
+            </w:pPr>
+            <w:r>
+              <w:rPr>
+                <w:rFonts w:ascii="Courier New" w:cs="Courier New" w:eastAsia="Courier New" w:hAnsi="Courier New"/>
+                <w:color w:val="3A2E15"/>
+                <w:sz w:val="16"/>
+                <w:szCs w:val="16"/>
+              </w:rPr>
+              <w:t xml:space="preserve">├── layout/           # Header (navigation groupée), Footer</w:t>
+            </w:r>
+          </w:p>
+          <w:p>
+            <w:pPr>
+              <w:spacing w:after="0" w:line="230"/>
+            </w:pPr>
+            <w:r>
+              <w:rPr>
+                <w:rFonts w:ascii="Courier New" w:cs="Courier New" w:eastAsia="Courier New" w:hAnsi="Courier New"/>
+                <w:color w:val="3A2E15"/>
+                <w:sz w:val="16"/>
+                <w:szCs w:val="16"/>
+              </w:rPr>
+              <w:t xml:space="preserve">├── context/          # session, thème, langue, serveur de jeu</w:t>
+            </w:r>
+          </w:p>
+          <w:p>
+            <w:pPr>
+              <w:spacing w:after="0" w:line="230"/>
+            </w:pPr>
+            <w:r>
+              <w:rPr>
+                <w:rFonts w:ascii="Courier New" w:cs="Courier New" w:eastAsia="Courier New" w:hAnsi="Courier New"/>
+                <w:color w:val="3A2E15"/>
+                <w:sz w:val="16"/>
+                <w:szCs w:val="16"/>
+              </w:rPr>
+              <w:t xml:space="preserve">├── components/       # composants partagés</w:t>
+            </w:r>
+          </w:p>
+          <w:p>
+            <w:pPr>
+              <w:spacing w:after="0" w:line="230"/>
+            </w:pPr>
+            <w:r>
+              <w:rPr>
+                <w:rFonts w:ascii="Courier New" w:cs="Courier New" w:eastAsia="Courier New" w:hAnsi="Courier New"/>
+                <w:color w:val="3A2E15"/>
+                <w:sz w:val="16"/>
+                <w:szCs w:val="16"/>
+              </w:rPr>
+              <w:t xml:space="preserve">├── locales/          # dictionnaires fr / en (base des 20 langues)</w:t>
+            </w:r>
+          </w:p>
+          <w:p>
+            <w:pPr>
+              <w:spacing w:after="0" w:line="230"/>
+            </w:pPr>
+            <w:r>
+              <w:rPr>
+                <w:rFonts w:ascii="Courier New" w:cs="Courier New" w:eastAsia="Courier New" w:hAnsi="Courier New"/>
+                <w:color w:val="3A2E15"/>
+                <w:sz w:val="16"/>
+                <w:szCs w:val="16"/>
+              </w:rPr>
+              <w:t xml:space="preserve">├── styles/           # variables CSS commutées par thème (clair/sombre)</w:t>
+            </w:r>
+          </w:p>
+          <w:p>
+            <w:pPr>
+              <w:spacing w:after="0" w:line="230"/>
+            </w:pPr>
+            <w:r>
+              <w:rPr>
+                <w:rFonts w:ascii="Courier New" w:cs="Courier New" w:eastAsia="Courier New" w:hAnsi="Courier New"/>
+                <w:color w:val="3A2E15"/>
+                <w:sz w:val="16"/>
+                <w:szCs w:val="16"/>
+              </w:rPr>
+              <w:t xml:space="preserve">└── utils/            # authUtils, craftUtils… testés unitairement</w:t>
+            </w:r>
+          </w:p>
+        </w:tc>
+      </w:tr>
+    </w:tbl>
+    <w:p>
+      <w:pPr>
+        <w:spacing w:after="180" w:before="50"/>
+        <w:jc w:val="left"/>
+      </w:pPr>
+      <w:r>
+        <w:rPr>
+          <w:i/>
+          <w:iCs/>
+          <w:color w:val="5A4825"/>
+          <w:sz w:val="18"/>
+          <w:szCs w:val="18"/>
+        </w:rPr>
+        <w:t xml:space="preserve">Arborescence réelle du dépôt (extrait).</w:t>
+      </w:r>
+    </w:p>
+    <w:p>
+      <w:pPr>
+        <w:spacing w:after="140" w:before="0" w:line="330"/>
+        <w:jc w:val="both"/>
+      </w:pPr>
+      <w:r>
+        <w:rPr>
+          <w:b w:val="false"/>
+          <w:bCs w:val="false"/>
+          <w:i w:val="false"/>
+          <w:iCs w:val="false"/>
+          <w:sz w:val="22"/>
+          <w:szCs w:val="22"/>
+        </w:rPr>
+        <w:t xml:space="preserve">La qualité est outillée à deux moments : en continu (le serveur de développement affiche les avertissements ESLint à chaque compilation ; le profiler Symfony expose requêtes SQL et performances) et avant chaque commit — un hook pre-commit lint la syntaxe PHP et bloque des motifs interdits (dangerouslySetInnerHTML, eval, CORS wildcard, secret vide). Ce qui passe le hook doit encore passer les 126 tests de la CI avant de pouvoir être fusionné.</w:t>
       </w:r>
     </w:p>
     <w:p>
@@ -3785,7 +4430,7 @@
                 <wp:inline distT="0" distB="0" distL="0" distR="0">
                   <wp:extent cx="5905500" cy="3695700"/>
                   <wp:effectExtent t="0" r="0" b="0" l="0"/>
-                  <wp:docPr id="1" name="figure-11" descr="Architecture en couches, flux de données et chaîne CI/CD" title="Architecture en couches, flux de données et chaîne CI/CD"/>
+                  <wp:docPr id="1" name="figure-13" descr="Architecture en couches, flux de données et chaîne CI/CD" title="Architecture en couches, flux de données et chaîne CI/CD"/>
                   <wp:cNvGraphicFramePr>
                     <a:graphicFrameLocks xmlns:a="http://schemas.openxmlformats.org/drawingml/2006/main" noChangeAspect="1"/>
                   </wp:cNvGraphicFramePr>
@@ -3799,7 +4444,7 @@
                           </pic:cNvPicPr>
                         </pic:nvPicPr>
                         <pic:blipFill>
-                          <a:blip r:embed="rId22" cstate="none"/>
+                          <a:blip r:embed="rId24" cstate="none"/>
                           <a:srcRect/>
                           <a:stretch>
                             <a:fillRect/>
@@ -3837,7 +4482,7 @@
           <w:sz w:val="18"/>
           <w:szCs w:val="18"/>
         </w:rPr>
-        <w:t xml:space="preserve">Figure 11 — Architecture en couches, flux de données et chaîne CI/CD</w:t>
+        <w:t xml:space="preserve">Figure 13 — Architecture en couches, flux de données et chaîne CI/CD</w:t>
       </w:r>
     </w:p>
     <w:p>
@@ -3853,7 +4498,7 @@
         <w:pStyle w:val="ListParagraph"/>
         <w:numPr>
           <w:ilvl w:val="0"/>
-          <w:numId w:val="2"/>
+          <w:numId w:val="3"/>
         </w:numPr>
         <w:spacing w:after="80" w:line="330"/>
         <w:jc w:val="both"/>
@@ -3871,7 +4516,7 @@
         <w:pStyle w:val="ListParagraph"/>
         <w:numPr>
           <w:ilvl w:val="0"/>
-          <w:numId w:val="2"/>
+          <w:numId w:val="3"/>
         </w:numPr>
         <w:spacing w:after="80" w:line="330"/>
         <w:jc w:val="both"/>
@@ -3889,7 +4534,7 @@
         <w:pStyle w:val="ListParagraph"/>
         <w:numPr>
           <w:ilvl w:val="0"/>
-          <w:numId w:val="2"/>
+          <w:numId w:val="3"/>
         </w:numPr>
         <w:spacing w:after="80" w:line="330"/>
         <w:jc w:val="both"/>
@@ -3907,7 +4552,7 @@
         <w:pStyle w:val="ListParagraph"/>
         <w:numPr>
           <w:ilvl w:val="0"/>
-          <w:numId w:val="2"/>
+          <w:numId w:val="3"/>
         </w:numPr>
         <w:spacing w:after="80" w:line="330"/>
         <w:jc w:val="both"/>
@@ -7071,6 +7716,737 @@
     </w:tbl>
     <w:p>
       <w:pPr>
+        <w:pStyle w:val="Heading2"/>
+      </w:pPr>
+      <w:r>
+        <w:t xml:space="preserve">4.4 Configuration et gestion des secrets par environnement</w:t>
+      </w:r>
+    </w:p>
+    <w:p>
+      <w:pPr>
+        <w:spacing w:after="140" w:before="0" w:line="330"/>
+        <w:jc w:val="both"/>
+      </w:pPr>
+      <w:r>
+        <w:rPr>
+          <w:b w:val="false"/>
+          <w:bCs w:val="false"/>
+          <w:i w:val="false"/>
+          <w:iCs w:val="false"/>
+          <w:sz w:val="22"/>
+          <w:szCs w:val="22"/>
+        </w:rPr>
+        <w:t xml:space="preserve">La règle est simple et vérifiable dans l'historique git : aucun secret n'a jamais été commité. Le fichier .env versionné ne contient que des valeurs par défaut inoffensives ; chaque environnement surcharge localement.</w:t>
+      </w:r>
+    </w:p>
+    <w:tbl>
+      <w:tblPr>
+        <w:tblW w:type="dxa" w:w="9072"/>
+        <w:tblBorders>
+          <w:top w:val="single" w:color="auto" w:sz="4"/>
+          <w:left w:val="single" w:color="auto" w:sz="4"/>
+          <w:bottom w:val="single" w:color="auto" w:sz="4"/>
+          <w:right w:val="single" w:color="auto" w:sz="4"/>
+          <w:insideH w:val="single" w:color="auto" w:sz="4"/>
+          <w:insideV w:val="single" w:color="auto" w:sz="4"/>
+        </w:tblBorders>
+      </w:tblPr>
+      <w:tblGrid>
+        <w:gridCol w:w="2268"/>
+        <w:gridCol w:w="2835"/>
+        <w:gridCol w:w="3969"/>
+      </w:tblGrid>
+      <w:tr>
+        <w:trPr>
+          <w:tblHeader/>
+        </w:trPr>
+        <w:tc>
+          <w:tcPr>
+            <w:tcW w:type="dxa" w:w="2268"/>
+            <w:tcBorders>
+              <w:top w:val="single" w:color="8B6914" w:sz="10"/>
+              <w:left w:val="none" w:color="FFFFFF" w:sz="0"/>
+              <w:bottom w:val="single" w:color="8B6914" w:sz="5"/>
+              <w:right w:val="none" w:color="FFFFFF" w:sz="0"/>
+            </w:tcBorders>
+            <w:tcMar>
+              <w:top w:type="dxa" w:w="70"/>
+              <w:left w:type="dxa" w:w="60"/>
+              <w:bottom w:type="dxa" w:w="70"/>
+              <w:right w:type="dxa" w:w="120"/>
+            </w:tcMar>
+          </w:tcPr>
+          <w:p>
+            <w:pPr>
+              <w:spacing w:after="0" w:line="264"/>
+            </w:pPr>
+            <w:r>
+              <w:rPr>
+                <w:b/>
+                <w:bCs/>
+                <w:color w:val="2D1A00"/>
+                <w:sz w:val="19"/>
+                <w:szCs w:val="19"/>
+              </w:rPr>
+              <w:t xml:space="preserve">Variable / secret</w:t>
+            </w:r>
+          </w:p>
+        </w:tc>
+        <w:tc>
+          <w:tcPr>
+            <w:tcW w:type="dxa" w:w="2835"/>
+            <w:tcBorders>
+              <w:top w:val="single" w:color="8B6914" w:sz="10"/>
+              <w:left w:val="none" w:color="FFFFFF" w:sz="0"/>
+              <w:bottom w:val="single" w:color="8B6914" w:sz="5"/>
+              <w:right w:val="none" w:color="FFFFFF" w:sz="0"/>
+            </w:tcBorders>
+            <w:tcMar>
+              <w:top w:type="dxa" w:w="70"/>
+              <w:left w:type="dxa" w:w="60"/>
+              <w:bottom w:type="dxa" w:w="70"/>
+              <w:right w:type="dxa" w:w="120"/>
+            </w:tcMar>
+          </w:tcPr>
+          <w:p>
+            <w:pPr>
+              <w:spacing w:after="0" w:line="264"/>
+            </w:pPr>
+            <w:r>
+              <w:rPr>
+                <w:b/>
+                <w:bCs/>
+                <w:color w:val="2D1A00"/>
+                <w:sz w:val="19"/>
+                <w:szCs w:val="19"/>
+              </w:rPr>
+              <w:t xml:space="preserve">Rôle</w:t>
+            </w:r>
+          </w:p>
+        </w:tc>
+        <w:tc>
+          <w:tcPr>
+            <w:tcW w:type="dxa" w:w="3969"/>
+            <w:tcBorders>
+              <w:top w:val="single" w:color="8B6914" w:sz="10"/>
+              <w:left w:val="none" w:color="FFFFFF" w:sz="0"/>
+              <w:bottom w:val="single" w:color="8B6914" w:sz="5"/>
+              <w:right w:val="none" w:color="FFFFFF" w:sz="0"/>
+            </w:tcBorders>
+            <w:tcMar>
+              <w:top w:type="dxa" w:w="70"/>
+              <w:left w:type="dxa" w:w="60"/>
+              <w:bottom w:type="dxa" w:w="70"/>
+              <w:right w:type="dxa" w:w="120"/>
+            </w:tcMar>
+          </w:tcPr>
+          <w:p>
+            <w:pPr>
+              <w:spacing w:after="0" w:line="264"/>
+            </w:pPr>
+            <w:r>
+              <w:rPr>
+                <w:b/>
+                <w:bCs/>
+                <w:color w:val="2D1A00"/>
+                <w:sz w:val="19"/>
+                <w:szCs w:val="19"/>
+              </w:rPr>
+              <w:t xml:space="preserve">Où elle vit</w:t>
+            </w:r>
+          </w:p>
+        </w:tc>
+      </w:tr>
+      <w:tr>
+        <w:tc>
+          <w:tcPr>
+            <w:tcW w:type="dxa" w:w="2268"/>
+            <w:tcBorders>
+              <w:top w:val="none" w:color="FFFFFF" w:sz="0"/>
+              <w:left w:val="none" w:color="FFFFFF" w:sz="0"/>
+              <w:bottom w:val="single" w:color="E0D5BB" w:sz="2"/>
+              <w:right w:val="none" w:color="FFFFFF" w:sz="0"/>
+            </w:tcBorders>
+            <w:tcMar>
+              <w:top w:type="dxa" w:w="70"/>
+              <w:left w:type="dxa" w:w="60"/>
+              <w:bottom w:type="dxa" w:w="70"/>
+              <w:right w:type="dxa" w:w="120"/>
+            </w:tcMar>
+          </w:tcPr>
+          <w:p>
+            <w:pPr>
+              <w:spacing w:after="0" w:line="264"/>
+            </w:pPr>
+            <w:r>
+              <w:rPr>
+                <w:b w:val="false"/>
+                <w:bCs w:val="false"/>
+                <w:sz w:val="19"/>
+                <w:szCs w:val="19"/>
+              </w:rPr>
+              <w:t xml:space="preserve">APP_SECRET</w:t>
+            </w:r>
+          </w:p>
+        </w:tc>
+        <w:tc>
+          <w:tcPr>
+            <w:tcW w:type="dxa" w:w="2835"/>
+            <w:tcBorders>
+              <w:top w:val="none" w:color="FFFFFF" w:sz="0"/>
+              <w:left w:val="none" w:color="FFFFFF" w:sz="0"/>
+              <w:bottom w:val="single" w:color="E0D5BB" w:sz="2"/>
+              <w:right w:val="none" w:color="FFFFFF" w:sz="0"/>
+            </w:tcBorders>
+            <w:tcMar>
+              <w:top w:type="dxa" w:w="70"/>
+              <w:left w:type="dxa" w:w="60"/>
+              <w:bottom w:type="dxa" w:w="70"/>
+              <w:right w:type="dxa" w:w="120"/>
+            </w:tcMar>
+          </w:tcPr>
+          <w:p>
+            <w:pPr>
+              <w:spacing w:after="0" w:line="264"/>
+            </w:pPr>
+            <w:r>
+              <w:rPr>
+                <w:b w:val="false"/>
+                <w:bCs w:val="false"/>
+                <w:sz w:val="19"/>
+                <w:szCs w:val="19"/>
+              </w:rPr>
+              <w:t xml:space="preserve">Secret applicatif Symfony</w:t>
+            </w:r>
+          </w:p>
+        </w:tc>
+        <w:tc>
+          <w:tcPr>
+            <w:tcW w:type="dxa" w:w="3969"/>
+            <w:tcBorders>
+              <w:top w:val="none" w:color="FFFFFF" w:sz="0"/>
+              <w:left w:val="none" w:color="FFFFFF" w:sz="0"/>
+              <w:bottom w:val="single" w:color="E0D5BB" w:sz="2"/>
+              <w:right w:val="none" w:color="FFFFFF" w:sz="0"/>
+            </w:tcBorders>
+            <w:tcMar>
+              <w:top w:type="dxa" w:w="70"/>
+              <w:left w:type="dxa" w:w="60"/>
+              <w:bottom w:type="dxa" w:w="70"/>
+              <w:right w:type="dxa" w:w="120"/>
+            </w:tcMar>
+          </w:tcPr>
+          <w:p>
+            <w:pPr>
+              <w:spacing w:after="0" w:line="264"/>
+            </w:pPr>
+            <w:r>
+              <w:rPr>
+                <w:b w:val="false"/>
+                <w:bCs w:val="false"/>
+                <w:sz w:val="19"/>
+                <w:szCs w:val="19"/>
+              </w:rPr>
+              <w:t xml:space="preserve">.env.local (généré, jamais commité)</w:t>
+            </w:r>
+          </w:p>
+        </w:tc>
+      </w:tr>
+      <w:tr>
+        <w:tc>
+          <w:tcPr>
+            <w:tcW w:type="dxa" w:w="2268"/>
+            <w:tcBorders>
+              <w:top w:val="none" w:color="FFFFFF" w:sz="0"/>
+              <w:left w:val="none" w:color="FFFFFF" w:sz="0"/>
+              <w:bottom w:val="single" w:color="E0D5BB" w:sz="2"/>
+              <w:right w:val="none" w:color="FFFFFF" w:sz="0"/>
+            </w:tcBorders>
+            <w:tcMar>
+              <w:top w:type="dxa" w:w="70"/>
+              <w:left w:type="dxa" w:w="60"/>
+              <w:bottom w:type="dxa" w:w="70"/>
+              <w:right w:type="dxa" w:w="120"/>
+            </w:tcMar>
+          </w:tcPr>
+          <w:p>
+            <w:pPr>
+              <w:spacing w:after="0" w:line="264"/>
+            </w:pPr>
+            <w:r>
+              <w:rPr>
+                <w:b w:val="false"/>
+                <w:bCs w:val="false"/>
+                <w:sz w:val="19"/>
+                <w:szCs w:val="19"/>
+              </w:rPr>
+              <w:t xml:space="preserve">DATABASE_URL</w:t>
+            </w:r>
+          </w:p>
+        </w:tc>
+        <w:tc>
+          <w:tcPr>
+            <w:tcW w:type="dxa" w:w="2835"/>
+            <w:tcBorders>
+              <w:top w:val="none" w:color="FFFFFF" w:sz="0"/>
+              <w:left w:val="none" w:color="FFFFFF" w:sz="0"/>
+              <w:bottom w:val="single" w:color="E0D5BB" w:sz="2"/>
+              <w:right w:val="none" w:color="FFFFFF" w:sz="0"/>
+            </w:tcBorders>
+            <w:tcMar>
+              <w:top w:type="dxa" w:w="70"/>
+              <w:left w:type="dxa" w:w="60"/>
+              <w:bottom w:type="dxa" w:w="70"/>
+              <w:right w:type="dxa" w:w="120"/>
+            </w:tcMar>
+          </w:tcPr>
+          <w:p>
+            <w:pPr>
+              <w:spacing w:after="0" w:line="264"/>
+            </w:pPr>
+            <w:r>
+              <w:rPr>
+                <w:b w:val="false"/>
+                <w:bCs w:val="false"/>
+                <w:sz w:val="19"/>
+                <w:szCs w:val="19"/>
+              </w:rPr>
+              <w:t xml:space="preserve">Connexion PostgreSQL</w:t>
+            </w:r>
+          </w:p>
+        </w:tc>
+        <w:tc>
+          <w:tcPr>
+            <w:tcW w:type="dxa" w:w="3969"/>
+            <w:tcBorders>
+              <w:top w:val="none" w:color="FFFFFF" w:sz="0"/>
+              <w:left w:val="none" w:color="FFFFFF" w:sz="0"/>
+              <w:bottom w:val="single" w:color="E0D5BB" w:sz="2"/>
+              <w:right w:val="none" w:color="FFFFFF" w:sz="0"/>
+            </w:tcBorders>
+            <w:tcMar>
+              <w:top w:type="dxa" w:w="70"/>
+              <w:left w:type="dxa" w:w="60"/>
+              <w:bottom w:type="dxa" w:w="70"/>
+              <w:right w:type="dxa" w:w="120"/>
+            </w:tcMar>
+          </w:tcPr>
+          <w:p>
+            <w:pPr>
+              <w:spacing w:after="0" w:line="264"/>
+            </w:pPr>
+            <w:r>
+              <w:rPr>
+                <w:b w:val="false"/>
+                <w:bCs w:val="false"/>
+                <w:sz w:val="19"/>
+                <w:szCs w:val="19"/>
+              </w:rPr>
+              <w:t xml:space="preserve">.env.local par environnement</w:t>
+            </w:r>
+          </w:p>
+        </w:tc>
+      </w:tr>
+      <w:tr>
+        <w:tc>
+          <w:tcPr>
+            <w:tcW w:type="dxa" w:w="2268"/>
+            <w:tcBorders>
+              <w:top w:val="none" w:color="FFFFFF" w:sz="0"/>
+              <w:left w:val="none" w:color="FFFFFF" w:sz="0"/>
+              <w:bottom w:val="single" w:color="E0D5BB" w:sz="2"/>
+              <w:right w:val="none" w:color="FFFFFF" w:sz="0"/>
+            </w:tcBorders>
+            <w:tcMar>
+              <w:top w:type="dxa" w:w="70"/>
+              <w:left w:type="dxa" w:w="60"/>
+              <w:bottom w:type="dxa" w:w="70"/>
+              <w:right w:type="dxa" w:w="120"/>
+            </w:tcMar>
+          </w:tcPr>
+          <w:p>
+            <w:pPr>
+              <w:spacing w:after="0" w:line="264"/>
+            </w:pPr>
+            <w:r>
+              <w:rPr>
+                <w:b w:val="false"/>
+                <w:bCs w:val="false"/>
+                <w:sz w:val="19"/>
+                <w:szCs w:val="19"/>
+              </w:rPr>
+              <w:t xml:space="preserve">CORS_ALLOW_ORIGIN</w:t>
+            </w:r>
+          </w:p>
+        </w:tc>
+        <w:tc>
+          <w:tcPr>
+            <w:tcW w:type="dxa" w:w="2835"/>
+            <w:tcBorders>
+              <w:top w:val="none" w:color="FFFFFF" w:sz="0"/>
+              <w:left w:val="none" w:color="FFFFFF" w:sz="0"/>
+              <w:bottom w:val="single" w:color="E0D5BB" w:sz="2"/>
+              <w:right w:val="none" w:color="FFFFFF" w:sz="0"/>
+            </w:tcBorders>
+            <w:tcMar>
+              <w:top w:type="dxa" w:w="70"/>
+              <w:left w:type="dxa" w:w="60"/>
+              <w:bottom w:type="dxa" w:w="70"/>
+              <w:right w:type="dxa" w:w="120"/>
+            </w:tcMar>
+          </w:tcPr>
+          <w:p>
+            <w:pPr>
+              <w:spacing w:after="0" w:line="264"/>
+            </w:pPr>
+            <w:r>
+              <w:rPr>
+                <w:b w:val="false"/>
+                <w:bCs w:val="false"/>
+                <w:sz w:val="19"/>
+                <w:szCs w:val="19"/>
+              </w:rPr>
+              <w:t xml:space="preserve">Origines front autorisées (origin_regex)</w:t>
+            </w:r>
+          </w:p>
+        </w:tc>
+        <w:tc>
+          <w:tcPr>
+            <w:tcW w:type="dxa" w:w="3969"/>
+            <w:tcBorders>
+              <w:top w:val="none" w:color="FFFFFF" w:sz="0"/>
+              <w:left w:val="none" w:color="FFFFFF" w:sz="0"/>
+              <w:bottom w:val="single" w:color="E0D5BB" w:sz="2"/>
+              <w:right w:val="none" w:color="FFFFFF" w:sz="0"/>
+            </w:tcBorders>
+            <w:tcMar>
+              <w:top w:type="dxa" w:w="70"/>
+              <w:left w:type="dxa" w:w="60"/>
+              <w:bottom w:type="dxa" w:w="70"/>
+              <w:right w:type="dxa" w:w="120"/>
+            </w:tcMar>
+          </w:tcPr>
+          <w:p>
+            <w:pPr>
+              <w:spacing w:after="0" w:line="264"/>
+            </w:pPr>
+            <w:r>
+              <w:rPr>
+                <w:b w:val="false"/>
+                <w:bCs w:val="false"/>
+                <w:sz w:val="19"/>
+                <w:szCs w:val="19"/>
+              </w:rPr>
+              <w:t xml:space="preserve">.env.local — localhost en dev, domaine de production en prod</w:t>
+            </w:r>
+          </w:p>
+        </w:tc>
+      </w:tr>
+      <w:tr>
+        <w:tc>
+          <w:tcPr>
+            <w:tcW w:type="dxa" w:w="2268"/>
+            <w:tcBorders>
+              <w:top w:val="none" w:color="FFFFFF" w:sz="0"/>
+              <w:left w:val="none" w:color="FFFFFF" w:sz="0"/>
+              <w:bottom w:val="single" w:color="E0D5BB" w:sz="2"/>
+              <w:right w:val="none" w:color="FFFFFF" w:sz="0"/>
+            </w:tcBorders>
+            <w:tcMar>
+              <w:top w:type="dxa" w:w="70"/>
+              <w:left w:type="dxa" w:w="60"/>
+              <w:bottom w:type="dxa" w:w="70"/>
+              <w:right w:type="dxa" w:w="120"/>
+            </w:tcMar>
+          </w:tcPr>
+          <w:p>
+            <w:pPr>
+              <w:spacing w:after="0" w:line="264"/>
+            </w:pPr>
+            <w:r>
+              <w:rPr>
+                <w:b w:val="false"/>
+                <w:bCs w:val="false"/>
+                <w:sz w:val="19"/>
+                <w:szCs w:val="19"/>
+              </w:rPr>
+              <w:t xml:space="preserve">JWT_PASSPHRASE + clés RSA</w:t>
+            </w:r>
+          </w:p>
+        </w:tc>
+        <w:tc>
+          <w:tcPr>
+            <w:tcW w:type="dxa" w:w="2835"/>
+            <w:tcBorders>
+              <w:top w:val="none" w:color="FFFFFF" w:sz="0"/>
+              <w:left w:val="none" w:color="FFFFFF" w:sz="0"/>
+              <w:bottom w:val="single" w:color="E0D5BB" w:sz="2"/>
+              <w:right w:val="none" w:color="FFFFFF" w:sz="0"/>
+            </w:tcBorders>
+            <w:tcMar>
+              <w:top w:type="dxa" w:w="70"/>
+              <w:left w:type="dxa" w:w="60"/>
+              <w:bottom w:type="dxa" w:w="70"/>
+              <w:right w:type="dxa" w:w="120"/>
+            </w:tcMar>
+          </w:tcPr>
+          <w:p>
+            <w:pPr>
+              <w:spacing w:after="0" w:line="264"/>
+            </w:pPr>
+            <w:r>
+              <w:rPr>
+                <w:b w:val="false"/>
+                <w:bCs w:val="false"/>
+                <w:sz w:val="19"/>
+                <w:szCs w:val="19"/>
+              </w:rPr>
+              <w:t xml:space="preserve">Signature RS256 des jetons</w:t>
+            </w:r>
+          </w:p>
+        </w:tc>
+        <w:tc>
+          <w:tcPr>
+            <w:tcW w:type="dxa" w:w="3969"/>
+            <w:tcBorders>
+              <w:top w:val="none" w:color="FFFFFF" w:sz="0"/>
+              <w:left w:val="none" w:color="FFFFFF" w:sz="0"/>
+              <w:bottom w:val="single" w:color="E0D5BB" w:sz="2"/>
+              <w:right w:val="none" w:color="FFFFFF" w:sz="0"/>
+            </w:tcBorders>
+            <w:tcMar>
+              <w:top w:type="dxa" w:w="70"/>
+              <w:left w:type="dxa" w:w="60"/>
+              <w:bottom w:type="dxa" w:w="70"/>
+              <w:right w:type="dxa" w:w="120"/>
+            </w:tcMar>
+          </w:tcPr>
+          <w:p>
+            <w:pPr>
+              <w:spacing w:after="0" w:line="264"/>
+            </w:pPr>
+            <w:r>
+              <w:rPr>
+                <w:b w:val="false"/>
+                <w:bCs w:val="false"/>
+                <w:sz w:val="19"/>
+                <w:szCs w:val="19"/>
+              </w:rPr>
+              <w:t xml:space="preserve">Paire de clés générée sur chaque machine (lexik:jwt:generate-keypair), exclue par .gitignore (*.pem)</w:t>
+            </w:r>
+          </w:p>
+        </w:tc>
+      </w:tr>
+      <w:tr>
+        <w:tc>
+          <w:tcPr>
+            <w:tcW w:type="dxa" w:w="2268"/>
+            <w:tcBorders>
+              <w:top w:val="none" w:color="FFFFFF" w:sz="0"/>
+              <w:left w:val="none" w:color="FFFFFF" w:sz="0"/>
+              <w:bottom w:val="single" w:color="E0D5BB" w:sz="2"/>
+              <w:right w:val="none" w:color="FFFFFF" w:sz="0"/>
+            </w:tcBorders>
+            <w:tcMar>
+              <w:top w:type="dxa" w:w="70"/>
+              <w:left w:type="dxa" w:w="60"/>
+              <w:bottom w:type="dxa" w:w="70"/>
+              <w:right w:type="dxa" w:w="120"/>
+            </w:tcMar>
+          </w:tcPr>
+          <w:p>
+            <w:pPr>
+              <w:spacing w:after="0" w:line="264"/>
+            </w:pPr>
+            <w:r>
+              <w:rPr>
+                <w:b w:val="false"/>
+                <w:bCs w:val="false"/>
+                <w:sz w:val="19"/>
+                <w:szCs w:val="19"/>
+              </w:rPr>
+              <w:t xml:space="preserve">REACT_APP_API_URL</w:t>
+            </w:r>
+          </w:p>
+        </w:tc>
+        <w:tc>
+          <w:tcPr>
+            <w:tcW w:type="dxa" w:w="2835"/>
+            <w:tcBorders>
+              <w:top w:val="none" w:color="FFFFFF" w:sz="0"/>
+              <w:left w:val="none" w:color="FFFFFF" w:sz="0"/>
+              <w:bottom w:val="single" w:color="E0D5BB" w:sz="2"/>
+              <w:right w:val="none" w:color="FFFFFF" w:sz="0"/>
+            </w:tcBorders>
+            <w:tcMar>
+              <w:top w:type="dxa" w:w="70"/>
+              <w:left w:type="dxa" w:w="60"/>
+              <w:bottom w:type="dxa" w:w="70"/>
+              <w:right w:type="dxa" w:w="120"/>
+            </w:tcMar>
+          </w:tcPr>
+          <w:p>
+            <w:pPr>
+              <w:spacing w:after="0" w:line="264"/>
+            </w:pPr>
+            <w:r>
+              <w:rPr>
+                <w:b w:val="false"/>
+                <w:bCs w:val="false"/>
+                <w:sz w:val="19"/>
+                <w:szCs w:val="19"/>
+              </w:rPr>
+              <w:t xml:space="preserve">URL de l'API pour le front</w:t>
+            </w:r>
+          </w:p>
+        </w:tc>
+        <w:tc>
+          <w:tcPr>
+            <w:tcW w:type="dxa" w:w="3969"/>
+            <w:tcBorders>
+              <w:top w:val="none" w:color="FFFFFF" w:sz="0"/>
+              <w:left w:val="none" w:color="FFFFFF" w:sz="0"/>
+              <w:bottom w:val="single" w:color="E0D5BB" w:sz="2"/>
+              <w:right w:val="none" w:color="FFFFFF" w:sz="0"/>
+            </w:tcBorders>
+            <w:tcMar>
+              <w:top w:type="dxa" w:w="70"/>
+              <w:left w:type="dxa" w:w="60"/>
+              <w:bottom w:type="dxa" w:w="70"/>
+              <w:right w:type="dxa" w:w="120"/>
+            </w:tcMar>
+          </w:tcPr>
+          <w:p>
+            <w:pPr>
+              <w:spacing w:after="0" w:line="264"/>
+            </w:pPr>
+            <w:r>
+              <w:rPr>
+                <w:b w:val="false"/>
+                <w:bCs w:val="false"/>
+                <w:sz w:val="19"/>
+                <w:szCs w:val="19"/>
+              </w:rPr>
+              <w:t xml:space="preserve">.env.development / .env.production</w:t>
+            </w:r>
+          </w:p>
+        </w:tc>
+      </w:tr>
+      <w:tr>
+        <w:tc>
+          <w:tcPr>
+            <w:tcW w:type="dxa" w:w="2268"/>
+            <w:tcBorders>
+              <w:top w:val="none" w:color="FFFFFF" w:sz="0"/>
+              <w:left w:val="none" w:color="FFFFFF" w:sz="0"/>
+              <w:bottom w:val="single" w:color="8B6914" w:sz="10"/>
+              <w:right w:val="none" w:color="FFFFFF" w:sz="0"/>
+            </w:tcBorders>
+            <w:tcMar>
+              <w:top w:type="dxa" w:w="70"/>
+              <w:left w:type="dxa" w:w="60"/>
+              <w:bottom w:type="dxa" w:w="70"/>
+              <w:right w:type="dxa" w:w="120"/>
+            </w:tcMar>
+          </w:tcPr>
+          <w:p>
+            <w:pPr>
+              <w:spacing w:after="0" w:line="264"/>
+            </w:pPr>
+            <w:r>
+              <w:rPr>
+                <w:b w:val="false"/>
+                <w:bCs w:val="false"/>
+                <w:sz w:val="19"/>
+                <w:szCs w:val="19"/>
+              </w:rPr>
+              <w:t xml:space="preserve">SSH_HOST, SSH_USER, SSH_PRIVATE_KEY, DEPLOY_PATH</w:t>
+            </w:r>
+          </w:p>
+        </w:tc>
+        <w:tc>
+          <w:tcPr>
+            <w:tcW w:type="dxa" w:w="2835"/>
+            <w:tcBorders>
+              <w:top w:val="none" w:color="FFFFFF" w:sz="0"/>
+              <w:left w:val="none" w:color="FFFFFF" w:sz="0"/>
+              <w:bottom w:val="single" w:color="8B6914" w:sz="10"/>
+              <w:right w:val="none" w:color="FFFFFF" w:sz="0"/>
+            </w:tcBorders>
+            <w:tcMar>
+              <w:top w:type="dxa" w:w="70"/>
+              <w:left w:type="dxa" w:w="60"/>
+              <w:bottom w:type="dxa" w:w="70"/>
+              <w:right w:type="dxa" w:w="120"/>
+            </w:tcMar>
+          </w:tcPr>
+          <w:p>
+            <w:pPr>
+              <w:spacing w:after="0" w:line="264"/>
+            </w:pPr>
+            <w:r>
+              <w:rPr>
+                <w:b w:val="false"/>
+                <w:bCs w:val="false"/>
+                <w:sz w:val="19"/>
+                <w:szCs w:val="19"/>
+              </w:rPr>
+              <w:t xml:space="preserve">Déploiement continu</w:t>
+            </w:r>
+          </w:p>
+        </w:tc>
+        <w:tc>
+          <w:tcPr>
+            <w:tcW w:type="dxa" w:w="3969"/>
+            <w:tcBorders>
+              <w:top w:val="none" w:color="FFFFFF" w:sz="0"/>
+              <w:left w:val="none" w:color="FFFFFF" w:sz="0"/>
+              <w:bottom w:val="single" w:color="8B6914" w:sz="10"/>
+              <w:right w:val="none" w:color="FFFFFF" w:sz="0"/>
+            </w:tcBorders>
+            <w:tcMar>
+              <w:top w:type="dxa" w:w="70"/>
+              <w:left w:type="dxa" w:w="60"/>
+              <w:bottom w:type="dxa" w:w="70"/>
+              <w:right w:type="dxa" w:w="120"/>
+            </w:tcMar>
+          </w:tcPr>
+          <w:p>
+            <w:pPr>
+              <w:spacing w:after="0" w:line="264"/>
+            </w:pPr>
+            <w:r>
+              <w:rPr>
+                <w:b w:val="false"/>
+                <w:bCs w:val="false"/>
+                <w:sz w:val="19"/>
+                <w:szCs w:val="19"/>
+              </w:rPr>
+              <w:t xml:space="preserve">Secrets GitHub Actions chiffrés — jamais visibles dans les logs ni le code</w:t>
+            </w:r>
+          </w:p>
+        </w:tc>
+      </w:tr>
+    </w:tbl>
+    <w:p>
+      <w:pPr>
+        <w:spacing w:after="140" w:before="0" w:line="330"/>
+        <w:jc w:val="both"/>
+      </w:pPr>
+      <w:r>
+        <w:rPr>
+          <w:b w:val="false"/>
+          <w:bCs w:val="false"/>
+          <w:i w:val="false"/>
+          <w:iCs w:val="false"/>
+          <w:sz w:val="22"/>
+          <w:szCs w:val="22"/>
+        </w:rPr>
+        <w:t xml:space="preserve">Conséquence observable : sans ses secrets, le job de déploiement refuse simplement de s'exécuter (annexe B) — le dépôt public peut être cloné par quiconque sans exposer quoi que ce soit.</w:t>
+      </w:r>
+    </w:p>
+    <w:p>
+      <w:pPr>
         <w:pStyle w:val="Heading1"/>
       </w:pPr>
       <w:r>
@@ -8093,6 +9469,625 @@
         <w:t xml:space="preserve">Le script deploy/deploy.sh est versionné dans le dépôt : la procédure de déploiement est revue comme du code. En cas d'échec d'une étape (set -e), le déploiement s'interrompt et la version précédente du front reste servie ; un retour arrière consiste à re-déployer le commit précédent de master.</w:t>
       </w:r>
     </w:p>
+    <w:p>
+      <w:pPr>
+        <w:pStyle w:val="Heading2"/>
+      </w:pPr>
+      <w:r>
+        <w:t xml:space="preserve">5.2 Scénarios d'échec et conduite à tenir</w:t>
+      </w:r>
+    </w:p>
+    <w:p>
+      <w:pPr>
+        <w:spacing w:after="140" w:before="0" w:line="330"/>
+        <w:jc w:val="both"/>
+      </w:pPr>
+      <w:r>
+        <w:rPr>
+          <w:b w:val="false"/>
+          <w:bCs w:val="false"/>
+          <w:i w:val="false"/>
+          <w:iCs w:val="false"/>
+          <w:sz w:val="22"/>
+          <w:szCs w:val="22"/>
+        </w:rPr>
+        <w:t xml:space="preserve">Chaque étape du déploiement a un mode d'échec identifié et une réponse définie — le déploiement est conçu pour échouer proprement plutôt que de laisser la production dans un état intermédiaire :</w:t>
+      </w:r>
+    </w:p>
+    <w:tbl>
+      <w:tblPr>
+        <w:tblW w:type="dxa" w:w="9072"/>
+        <w:tblBorders>
+          <w:top w:val="single" w:color="auto" w:sz="4"/>
+          <w:left w:val="single" w:color="auto" w:sz="4"/>
+          <w:bottom w:val="single" w:color="auto" w:sz="4"/>
+          <w:right w:val="single" w:color="auto" w:sz="4"/>
+          <w:insideH w:val="single" w:color="auto" w:sz="4"/>
+          <w:insideV w:val="single" w:color="auto" w:sz="4"/>
+        </w:tblBorders>
+      </w:tblPr>
+      <w:tblGrid>
+        <w:gridCol w:w="1985"/>
+        <w:gridCol w:w="3969"/>
+        <w:gridCol w:w="3118"/>
+      </w:tblGrid>
+      <w:tr>
+        <w:trPr>
+          <w:tblHeader/>
+        </w:trPr>
+        <w:tc>
+          <w:tcPr>
+            <w:tcW w:type="dxa" w:w="1985"/>
+            <w:tcBorders>
+              <w:top w:val="single" w:color="8B6914" w:sz="10"/>
+              <w:left w:val="none" w:color="FFFFFF" w:sz="0"/>
+              <w:bottom w:val="single" w:color="8B6914" w:sz="5"/>
+              <w:right w:val="none" w:color="FFFFFF" w:sz="0"/>
+            </w:tcBorders>
+            <w:tcMar>
+              <w:top w:type="dxa" w:w="70"/>
+              <w:left w:type="dxa" w:w="60"/>
+              <w:bottom w:type="dxa" w:w="70"/>
+              <w:right w:type="dxa" w:w="120"/>
+            </w:tcMar>
+          </w:tcPr>
+          <w:p>
+            <w:pPr>
+              <w:spacing w:after="0" w:line="264"/>
+            </w:pPr>
+            <w:r>
+              <w:rPr>
+                <w:b/>
+                <w:bCs/>
+                <w:color w:val="2D1A00"/>
+                <w:sz w:val="18"/>
+                <w:szCs w:val="18"/>
+              </w:rPr>
+              <w:t xml:space="preserve">Défaillance</w:t>
+            </w:r>
+          </w:p>
+        </w:tc>
+        <w:tc>
+          <w:tcPr>
+            <w:tcW w:type="dxa" w:w="3969"/>
+            <w:tcBorders>
+              <w:top w:val="single" w:color="8B6914" w:sz="10"/>
+              <w:left w:val="none" w:color="FFFFFF" w:sz="0"/>
+              <w:bottom w:val="single" w:color="8B6914" w:sz="5"/>
+              <w:right w:val="none" w:color="FFFFFF" w:sz="0"/>
+            </w:tcBorders>
+            <w:tcMar>
+              <w:top w:type="dxa" w:w="70"/>
+              <w:left w:type="dxa" w:w="60"/>
+              <w:bottom w:type="dxa" w:w="70"/>
+              <w:right w:type="dxa" w:w="120"/>
+            </w:tcMar>
+          </w:tcPr>
+          <w:p>
+            <w:pPr>
+              <w:spacing w:after="0" w:line="264"/>
+            </w:pPr>
+            <w:r>
+              <w:rPr>
+                <w:b/>
+                <w:bCs/>
+                <w:color w:val="2D1A00"/>
+                <w:sz w:val="18"/>
+                <w:szCs w:val="18"/>
+              </w:rPr>
+              <w:t xml:space="preserve">Comportement du dispositif</w:t>
+            </w:r>
+          </w:p>
+        </w:tc>
+        <w:tc>
+          <w:tcPr>
+            <w:tcW w:type="dxa" w:w="3118"/>
+            <w:tcBorders>
+              <w:top w:val="single" w:color="8B6914" w:sz="10"/>
+              <w:left w:val="none" w:color="FFFFFF" w:sz="0"/>
+              <w:bottom w:val="single" w:color="8B6914" w:sz="5"/>
+              <w:right w:val="none" w:color="FFFFFF" w:sz="0"/>
+            </w:tcBorders>
+            <w:tcMar>
+              <w:top w:type="dxa" w:w="70"/>
+              <w:left w:type="dxa" w:w="60"/>
+              <w:bottom w:type="dxa" w:w="70"/>
+              <w:right w:type="dxa" w:w="120"/>
+            </w:tcMar>
+          </w:tcPr>
+          <w:p>
+            <w:pPr>
+              <w:spacing w:after="0" w:line="264"/>
+            </w:pPr>
+            <w:r>
+              <w:rPr>
+                <w:b/>
+                <w:bCs/>
+                <w:color w:val="2D1A00"/>
+                <w:sz w:val="18"/>
+                <w:szCs w:val="18"/>
+              </w:rPr>
+              <w:t xml:space="preserve">Conduite à tenir</w:t>
+            </w:r>
+          </w:p>
+        </w:tc>
+      </w:tr>
+      <w:tr>
+        <w:tc>
+          <w:tcPr>
+            <w:tcW w:type="dxa" w:w="1985"/>
+            <w:tcBorders>
+              <w:top w:val="none" w:color="FFFFFF" w:sz="0"/>
+              <w:left w:val="none" w:color="FFFFFF" w:sz="0"/>
+              <w:bottom w:val="single" w:color="E0D5BB" w:sz="2"/>
+              <w:right w:val="none" w:color="FFFFFF" w:sz="0"/>
+            </w:tcBorders>
+            <w:tcMar>
+              <w:top w:type="dxa" w:w="70"/>
+              <w:left w:type="dxa" w:w="60"/>
+              <w:bottom w:type="dxa" w:w="70"/>
+              <w:right w:type="dxa" w:w="120"/>
+            </w:tcMar>
+          </w:tcPr>
+          <w:p>
+            <w:pPr>
+              <w:spacing w:after="0" w:line="264"/>
+            </w:pPr>
+            <w:r>
+              <w:rPr>
+                <w:b w:val="false"/>
+                <w:bCs w:val="false"/>
+                <w:sz w:val="18"/>
+                <w:szCs w:val="18"/>
+              </w:rPr>
+              <w:t xml:space="preserve">Un test échoue dans la CI</w:t>
+            </w:r>
+          </w:p>
+        </w:tc>
+        <w:tc>
+          <w:tcPr>
+            <w:tcW w:type="dxa" w:w="3969"/>
+            <w:tcBorders>
+              <w:top w:val="none" w:color="FFFFFF" w:sz="0"/>
+              <w:left w:val="none" w:color="FFFFFF" w:sz="0"/>
+              <w:bottom w:val="single" w:color="E0D5BB" w:sz="2"/>
+              <w:right w:val="none" w:color="FFFFFF" w:sz="0"/>
+            </w:tcBorders>
+            <w:tcMar>
+              <w:top w:type="dxa" w:w="70"/>
+              <w:left w:type="dxa" w:w="60"/>
+              <w:bottom w:type="dxa" w:w="70"/>
+              <w:right w:type="dxa" w:w="120"/>
+            </w:tcMar>
+          </w:tcPr>
+          <w:p>
+            <w:pPr>
+              <w:spacing w:after="0" w:line="264"/>
+            </w:pPr>
+            <w:r>
+              <w:rPr>
+                <w:b w:val="false"/>
+                <w:bCs w:val="false"/>
+                <w:sz w:val="18"/>
+                <w:szCs w:val="18"/>
+              </w:rPr>
+              <w:t xml:space="preserve">Le job deploy n'est jamais lancé (needs:) — la production n'est pas touchée</w:t>
+            </w:r>
+          </w:p>
+        </w:tc>
+        <w:tc>
+          <w:tcPr>
+            <w:tcW w:type="dxa" w:w="3118"/>
+            <w:tcBorders>
+              <w:top w:val="none" w:color="FFFFFF" w:sz="0"/>
+              <w:left w:val="none" w:color="FFFFFF" w:sz="0"/>
+              <w:bottom w:val="single" w:color="E0D5BB" w:sz="2"/>
+              <w:right w:val="none" w:color="FFFFFF" w:sz="0"/>
+            </w:tcBorders>
+            <w:tcMar>
+              <w:top w:type="dxa" w:w="70"/>
+              <w:left w:type="dxa" w:w="60"/>
+              <w:bottom w:type="dxa" w:w="70"/>
+              <w:right w:type="dxa" w:w="120"/>
+            </w:tcMar>
+          </w:tcPr>
+          <w:p>
+            <w:pPr>
+              <w:spacing w:after="0" w:line="264"/>
+            </w:pPr>
+            <w:r>
+              <w:rPr>
+                <w:b w:val="false"/>
+                <w:bCs w:val="false"/>
+                <w:sz w:val="18"/>
+                <w:szCs w:val="18"/>
+              </w:rPr>
+              <w:t xml:space="preserve">Corriger sur develop, re-pousser</w:t>
+            </w:r>
+          </w:p>
+        </w:tc>
+      </w:tr>
+      <w:tr>
+        <w:tc>
+          <w:tcPr>
+            <w:tcW w:type="dxa" w:w="1985"/>
+            <w:tcBorders>
+              <w:top w:val="none" w:color="FFFFFF" w:sz="0"/>
+              <w:left w:val="none" w:color="FFFFFF" w:sz="0"/>
+              <w:bottom w:val="single" w:color="E0D5BB" w:sz="2"/>
+              <w:right w:val="none" w:color="FFFFFF" w:sz="0"/>
+            </w:tcBorders>
+            <w:tcMar>
+              <w:top w:type="dxa" w:w="70"/>
+              <w:left w:type="dxa" w:w="60"/>
+              <w:bottom w:type="dxa" w:w="70"/>
+              <w:right w:type="dxa" w:w="120"/>
+            </w:tcMar>
+          </w:tcPr>
+          <w:p>
+            <w:pPr>
+              <w:spacing w:after="0" w:line="264"/>
+            </w:pPr>
+            <w:r>
+              <w:rPr>
+                <w:b w:val="false"/>
+                <w:bCs w:val="false"/>
+                <w:sz w:val="18"/>
+                <w:szCs w:val="18"/>
+              </w:rPr>
+              <w:t xml:space="preserve">Secrets SSH absents ou invalides</w:t>
+            </w:r>
+          </w:p>
+        </w:tc>
+        <w:tc>
+          <w:tcPr>
+            <w:tcW w:type="dxa" w:w="3969"/>
+            <w:tcBorders>
+              <w:top w:val="none" w:color="FFFFFF" w:sz="0"/>
+              <w:left w:val="none" w:color="FFFFFF" w:sz="0"/>
+              <w:bottom w:val="single" w:color="E0D5BB" w:sz="2"/>
+              <w:right w:val="none" w:color="FFFFFF" w:sz="0"/>
+            </w:tcBorders>
+            <w:tcMar>
+              <w:top w:type="dxa" w:w="70"/>
+              <w:left w:type="dxa" w:w="60"/>
+              <w:bottom w:type="dxa" w:w="70"/>
+              <w:right w:type="dxa" w:w="120"/>
+            </w:tcMar>
+          </w:tcPr>
+          <w:p>
+            <w:pPr>
+              <w:spacing w:after="0" w:line="264"/>
+            </w:pPr>
+            <w:r>
+              <w:rPr>
+                <w:b w:val="false"/>
+                <w:bCs w:val="false"/>
+                <w:sz w:val="18"/>
+                <w:szCs w:val="18"/>
+              </w:rPr>
+              <w:t xml:space="preserve">Le job deploy s'arrête immédiatement (« missing server host ») — comportement vérifié, cf. annexe B</w:t>
+            </w:r>
+          </w:p>
+        </w:tc>
+        <w:tc>
+          <w:tcPr>
+            <w:tcW w:type="dxa" w:w="3118"/>
+            <w:tcBorders>
+              <w:top w:val="none" w:color="FFFFFF" w:sz="0"/>
+              <w:left w:val="none" w:color="FFFFFF" w:sz="0"/>
+              <w:bottom w:val="single" w:color="E0D5BB" w:sz="2"/>
+              <w:right w:val="none" w:color="FFFFFF" w:sz="0"/>
+            </w:tcBorders>
+            <w:tcMar>
+              <w:top w:type="dxa" w:w="70"/>
+              <w:left w:type="dxa" w:w="60"/>
+              <w:bottom w:type="dxa" w:w="70"/>
+              <w:right w:type="dxa" w:w="120"/>
+            </w:tcMar>
+          </w:tcPr>
+          <w:p>
+            <w:pPr>
+              <w:spacing w:after="0" w:line="264"/>
+            </w:pPr>
+            <w:r>
+              <w:rPr>
+                <w:b w:val="false"/>
+                <w:bCs w:val="false"/>
+                <w:sz w:val="18"/>
+                <w:szCs w:val="18"/>
+              </w:rPr>
+              <w:t xml:space="preserve">Renseigner les secrets GitHub, relancer le run</w:t>
+            </w:r>
+          </w:p>
+        </w:tc>
+      </w:tr>
+      <w:tr>
+        <w:tc>
+          <w:tcPr>
+            <w:tcW w:type="dxa" w:w="1985"/>
+            <w:tcBorders>
+              <w:top w:val="none" w:color="FFFFFF" w:sz="0"/>
+              <w:left w:val="none" w:color="FFFFFF" w:sz="0"/>
+              <w:bottom w:val="single" w:color="E0D5BB" w:sz="2"/>
+              <w:right w:val="none" w:color="FFFFFF" w:sz="0"/>
+            </w:tcBorders>
+            <w:tcMar>
+              <w:top w:type="dxa" w:w="70"/>
+              <w:left w:type="dxa" w:w="60"/>
+              <w:bottom w:type="dxa" w:w="70"/>
+              <w:right w:type="dxa" w:w="120"/>
+            </w:tcMar>
+          </w:tcPr>
+          <w:p>
+            <w:pPr>
+              <w:spacing w:after="0" w:line="264"/>
+            </w:pPr>
+            <w:r>
+              <w:rPr>
+                <w:b w:val="false"/>
+                <w:bCs w:val="false"/>
+                <w:sz w:val="18"/>
+                <w:szCs w:val="18"/>
+              </w:rPr>
+              <w:t xml:space="preserve">Échec d'une migration BDD</w:t>
+            </w:r>
+          </w:p>
+        </w:tc>
+        <w:tc>
+          <w:tcPr>
+            <w:tcW w:type="dxa" w:w="3969"/>
+            <w:tcBorders>
+              <w:top w:val="none" w:color="FFFFFF" w:sz="0"/>
+              <w:left w:val="none" w:color="FFFFFF" w:sz="0"/>
+              <w:bottom w:val="single" w:color="E0D5BB" w:sz="2"/>
+              <w:right w:val="none" w:color="FFFFFF" w:sz="0"/>
+            </w:tcBorders>
+            <w:tcMar>
+              <w:top w:type="dxa" w:w="70"/>
+              <w:left w:type="dxa" w:w="60"/>
+              <w:bottom w:type="dxa" w:w="70"/>
+              <w:right w:type="dxa" w:w="120"/>
+            </w:tcMar>
+          </w:tcPr>
+          <w:p>
+            <w:pPr>
+              <w:spacing w:after="0" w:line="264"/>
+            </w:pPr>
+            <w:r>
+              <w:rPr>
+                <w:b w:val="false"/>
+                <w:bCs w:val="false"/>
+                <w:sz w:val="18"/>
+                <w:szCs w:val="18"/>
+              </w:rPr>
+              <w:t xml:space="preserve">set -e interrompt le script avant le cache et le build : l'ancien code reste servi</w:t>
+            </w:r>
+          </w:p>
+        </w:tc>
+        <w:tc>
+          <w:tcPr>
+            <w:tcW w:type="dxa" w:w="3118"/>
+            <w:tcBorders>
+              <w:top w:val="none" w:color="FFFFFF" w:sz="0"/>
+              <w:left w:val="none" w:color="FFFFFF" w:sz="0"/>
+              <w:bottom w:val="single" w:color="E0D5BB" w:sz="2"/>
+              <w:right w:val="none" w:color="FFFFFF" w:sz="0"/>
+            </w:tcBorders>
+            <w:tcMar>
+              <w:top w:type="dxa" w:w="70"/>
+              <w:left w:type="dxa" w:w="60"/>
+              <w:bottom w:type="dxa" w:w="70"/>
+              <w:right w:type="dxa" w:w="120"/>
+            </w:tcMar>
+          </w:tcPr>
+          <w:p>
+            <w:pPr>
+              <w:spacing w:after="0" w:line="264"/>
+            </w:pPr>
+            <w:r>
+              <w:rPr>
+                <w:b w:val="false"/>
+                <w:bCs w:val="false"/>
+                <w:sz w:val="18"/>
+                <w:szCs w:val="18"/>
+              </w:rPr>
+              <w:t xml:space="preserve">Corriger la migration, re-déployer ; les migrations restent réversibles (down())</w:t>
+            </w:r>
+          </w:p>
+        </w:tc>
+      </w:tr>
+      <w:tr>
+        <w:tc>
+          <w:tcPr>
+            <w:tcW w:type="dxa" w:w="1985"/>
+            <w:tcBorders>
+              <w:top w:val="none" w:color="FFFFFF" w:sz="0"/>
+              <w:left w:val="none" w:color="FFFFFF" w:sz="0"/>
+              <w:bottom w:val="single" w:color="E0D5BB" w:sz="2"/>
+              <w:right w:val="none" w:color="FFFFFF" w:sz="0"/>
+            </w:tcBorders>
+            <w:tcMar>
+              <w:top w:type="dxa" w:w="70"/>
+              <w:left w:type="dxa" w:w="60"/>
+              <w:bottom w:type="dxa" w:w="70"/>
+              <w:right w:type="dxa" w:w="120"/>
+            </w:tcMar>
+          </w:tcPr>
+          <w:p>
+            <w:pPr>
+              <w:spacing w:after="0" w:line="264"/>
+            </w:pPr>
+            <w:r>
+              <w:rPr>
+                <w:b w:val="false"/>
+                <w:bCs w:val="false"/>
+                <w:sz w:val="18"/>
+                <w:szCs w:val="18"/>
+              </w:rPr>
+              <w:t xml:space="preserve">Échec du build front</w:t>
+            </w:r>
+          </w:p>
+        </w:tc>
+        <w:tc>
+          <w:tcPr>
+            <w:tcW w:type="dxa" w:w="3969"/>
+            <w:tcBorders>
+              <w:top w:val="none" w:color="FFFFFF" w:sz="0"/>
+              <w:left w:val="none" w:color="FFFFFF" w:sz="0"/>
+              <w:bottom w:val="single" w:color="E0D5BB" w:sz="2"/>
+              <w:right w:val="none" w:color="FFFFFF" w:sz="0"/>
+            </w:tcBorders>
+            <w:tcMar>
+              <w:top w:type="dxa" w:w="70"/>
+              <w:left w:type="dxa" w:w="60"/>
+              <w:bottom w:type="dxa" w:w="70"/>
+              <w:right w:type="dxa" w:w="120"/>
+            </w:tcMar>
+          </w:tcPr>
+          <w:p>
+            <w:pPr>
+              <w:spacing w:after="0" w:line="264"/>
+            </w:pPr>
+            <w:r>
+              <w:rPr>
+                <w:b w:val="false"/>
+                <w:bCs w:val="false"/>
+                <w:sz w:val="18"/>
+                <w:szCs w:val="18"/>
+              </w:rPr>
+              <w:t xml:space="preserve">L'ancien build reste en place (le dossier build/ n'est remplacé qu'en fin de compilation)</w:t>
+            </w:r>
+          </w:p>
+        </w:tc>
+        <w:tc>
+          <w:tcPr>
+            <w:tcW w:type="dxa" w:w="3118"/>
+            <w:tcBorders>
+              <w:top w:val="none" w:color="FFFFFF" w:sz="0"/>
+              <w:left w:val="none" w:color="FFFFFF" w:sz="0"/>
+              <w:bottom w:val="single" w:color="E0D5BB" w:sz="2"/>
+              <w:right w:val="none" w:color="FFFFFF" w:sz="0"/>
+            </w:tcBorders>
+            <w:tcMar>
+              <w:top w:type="dxa" w:w="70"/>
+              <w:left w:type="dxa" w:w="60"/>
+              <w:bottom w:type="dxa" w:w="70"/>
+              <w:right w:type="dxa" w:w="120"/>
+            </w:tcMar>
+          </w:tcPr>
+          <w:p>
+            <w:pPr>
+              <w:spacing w:after="0" w:line="264"/>
+            </w:pPr>
+            <w:r>
+              <w:rPr>
+                <w:b w:val="false"/>
+                <w:bCs w:val="false"/>
+                <w:sz w:val="18"/>
+                <w:szCs w:val="18"/>
+              </w:rPr>
+              <w:t xml:space="preserve">Re-déployer après correctif</w:t>
+            </w:r>
+          </w:p>
+        </w:tc>
+      </w:tr>
+      <w:tr>
+        <w:tc>
+          <w:tcPr>
+            <w:tcW w:type="dxa" w:w="1985"/>
+            <w:tcBorders>
+              <w:top w:val="none" w:color="FFFFFF" w:sz="0"/>
+              <w:left w:val="none" w:color="FFFFFF" w:sz="0"/>
+              <w:bottom w:val="single" w:color="8B6914" w:sz="10"/>
+              <w:right w:val="none" w:color="FFFFFF" w:sz="0"/>
+            </w:tcBorders>
+            <w:tcMar>
+              <w:top w:type="dxa" w:w="70"/>
+              <w:left w:type="dxa" w:w="60"/>
+              <w:bottom w:type="dxa" w:w="70"/>
+              <w:right w:type="dxa" w:w="120"/>
+            </w:tcMar>
+          </w:tcPr>
+          <w:p>
+            <w:pPr>
+              <w:spacing w:after="0" w:line="264"/>
+            </w:pPr>
+            <w:r>
+              <w:rPr>
+                <w:b w:val="false"/>
+                <w:bCs w:val="false"/>
+                <w:sz w:val="18"/>
+                <w:szCs w:val="18"/>
+              </w:rPr>
+              <w:t xml:space="preserve">Régression détectée après mise en production</w:t>
+            </w:r>
+          </w:p>
+        </w:tc>
+        <w:tc>
+          <w:tcPr>
+            <w:tcW w:type="dxa" w:w="3969"/>
+            <w:tcBorders>
+              <w:top w:val="none" w:color="FFFFFF" w:sz="0"/>
+              <w:left w:val="none" w:color="FFFFFF" w:sz="0"/>
+              <w:bottom w:val="single" w:color="8B6914" w:sz="10"/>
+              <w:right w:val="none" w:color="FFFFFF" w:sz="0"/>
+            </w:tcBorders>
+            <w:tcMar>
+              <w:top w:type="dxa" w:w="70"/>
+              <w:left w:type="dxa" w:w="60"/>
+              <w:bottom w:type="dxa" w:w="70"/>
+              <w:right w:type="dxa" w:w="120"/>
+            </w:tcMar>
+          </w:tcPr>
+          <w:p>
+            <w:pPr>
+              <w:spacing w:after="0" w:line="264"/>
+            </w:pPr>
+            <w:r>
+              <w:rPr>
+                <w:b w:val="false"/>
+                <w:bCs w:val="false"/>
+                <w:sz w:val="18"/>
+                <w:szCs w:val="18"/>
+              </w:rPr>
+              <w:t xml:space="preserve">La sonde (/api/health + cron) alerte en ≤ 5 min ; l'historique master permet de cibler le commit fautif</w:t>
+            </w:r>
+          </w:p>
+        </w:tc>
+        <w:tc>
+          <w:tcPr>
+            <w:tcW w:type="dxa" w:w="3118"/>
+            <w:tcBorders>
+              <w:top w:val="none" w:color="FFFFFF" w:sz="0"/>
+              <w:left w:val="none" w:color="FFFFFF" w:sz="0"/>
+              <w:bottom w:val="single" w:color="8B6914" w:sz="10"/>
+              <w:right w:val="none" w:color="FFFFFF" w:sz="0"/>
+            </w:tcBorders>
+            <w:tcMar>
+              <w:top w:type="dxa" w:w="70"/>
+              <w:left w:type="dxa" w:w="60"/>
+              <w:bottom w:type="dxa" w:w="70"/>
+              <w:right w:type="dxa" w:w="120"/>
+            </w:tcMar>
+          </w:tcPr>
+          <w:p>
+            <w:pPr>
+              <w:spacing w:after="0" w:line="264"/>
+            </w:pPr>
+            <w:r>
+              <w:rPr>
+                <w:b w:val="false"/>
+                <w:bCs w:val="false"/>
+                <w:sz w:val="18"/>
+                <w:szCs w:val="18"/>
+              </w:rPr>
+              <w:t xml:space="preserve">Re-déployer le commit master précédent (retour arrière en une commande)</w:t>
+            </w:r>
+          </w:p>
+        </w:tc>
+      </w:tr>
+    </w:tbl>
     <w:p>
       <w:pPr>
         <w:pStyle w:val="Heading1"/>
@@ -9444,7 +11439,7 @@
         <w:pStyle w:val="ListParagraph"/>
         <w:numPr>
           <w:ilvl w:val="0"/>
-          <w:numId w:val="2"/>
+          <w:numId w:val="3"/>
         </w:numPr>
         <w:spacing w:after="80" w:line="330"/>
         <w:jc w:val="both"/>
@@ -9462,7 +11457,7 @@
         <w:pStyle w:val="ListParagraph"/>
         <w:numPr>
           <w:ilvl w:val="0"/>
-          <w:numId w:val="2"/>
+          <w:numId w:val="3"/>
         </w:numPr>
         <w:spacing w:after="80" w:line="330"/>
         <w:jc w:val="both"/>
@@ -9480,7 +11475,7 @@
         <w:pStyle w:val="ListParagraph"/>
         <w:numPr>
           <w:ilvl w:val="0"/>
-          <w:numId w:val="2"/>
+          <w:numId w:val="3"/>
         </w:numPr>
         <w:spacing w:after="80" w:line="330"/>
         <w:jc w:val="both"/>
@@ -9491,6 +11486,704 @@
           <w:szCs w:val="22"/>
         </w:rPr>
         <w:t xml:space="preserve">Les mêmes commandes tournent en local et dans le pipeline : un développeur reproduit la CI à l'identique.</w:t>
+      </w:r>
+    </w:p>
+    <w:p>
+      <w:pPr>
+        <w:pStyle w:val="Heading2"/>
+      </w:pPr>
+      <w:r>
+        <w:t xml:space="preserve">6.4 Stratégie : une pyramide de tests assumée</w:t>
+      </w:r>
+    </w:p>
+    <w:p>
+      <w:pPr>
+        <w:spacing w:after="140" w:before="0" w:line="330"/>
+        <w:jc w:val="both"/>
+      </w:pPr>
+      <w:r>
+        <w:rPr>
+          <w:b w:val="false"/>
+          <w:bCs w:val="false"/>
+          <w:i w:val="false"/>
+          <w:iCs w:val="false"/>
+          <w:sz w:val="22"/>
+          <w:szCs w:val="22"/>
+        </w:rPr>
+        <w:t xml:space="preserve">Chaque niveau de test a un rôle et un coût d'exécution différents ; l'effort est réparti pour maximiser la détection au moindre coût :</w:t>
+      </w:r>
+    </w:p>
+    <w:tbl>
+      <w:tblPr>
+        <w:tblW w:type="dxa" w:w="9072"/>
+        <w:tblBorders>
+          <w:top w:val="single" w:color="auto" w:sz="4"/>
+          <w:left w:val="single" w:color="auto" w:sz="4"/>
+          <w:bottom w:val="single" w:color="auto" w:sz="4"/>
+          <w:right w:val="single" w:color="auto" w:sz="4"/>
+          <w:insideH w:val="single" w:color="auto" w:sz="4"/>
+          <w:insideV w:val="single" w:color="auto" w:sz="4"/>
+        </w:tblBorders>
+      </w:tblPr>
+      <w:tblGrid>
+        <w:gridCol w:w="1202"/>
+        <w:gridCol w:w="1967"/>
+        <w:gridCol w:w="3826"/>
+        <w:gridCol w:w="2077"/>
+      </w:tblGrid>
+      <w:tr>
+        <w:trPr>
+          <w:tblHeader/>
+        </w:trPr>
+        <w:tc>
+          <w:tcPr>
+            <w:tcW w:type="dxa" w:w="1202"/>
+            <w:tcBorders>
+              <w:top w:val="single" w:color="8B6914" w:sz="10"/>
+              <w:left w:val="none" w:color="FFFFFF" w:sz="0"/>
+              <w:bottom w:val="single" w:color="8B6914" w:sz="5"/>
+              <w:right w:val="none" w:color="FFFFFF" w:sz="0"/>
+            </w:tcBorders>
+            <w:tcMar>
+              <w:top w:type="dxa" w:w="70"/>
+              <w:left w:type="dxa" w:w="60"/>
+              <w:bottom w:type="dxa" w:w="70"/>
+              <w:right w:type="dxa" w:w="120"/>
+            </w:tcMar>
+          </w:tcPr>
+          <w:p>
+            <w:pPr>
+              <w:spacing w:after="0" w:line="264"/>
+            </w:pPr>
+            <w:r>
+              <w:rPr>
+                <w:b/>
+                <w:bCs/>
+                <w:color w:val="2D1A00"/>
+                <w:sz w:val="19"/>
+                <w:szCs w:val="19"/>
+              </w:rPr>
+              <w:t xml:space="preserve">Niveau</w:t>
+            </w:r>
+          </w:p>
+        </w:tc>
+        <w:tc>
+          <w:tcPr>
+            <w:tcW w:type="dxa" w:w="1967"/>
+            <w:tcBorders>
+              <w:top w:val="single" w:color="8B6914" w:sz="10"/>
+              <w:left w:val="none" w:color="FFFFFF" w:sz="0"/>
+              <w:bottom w:val="single" w:color="8B6914" w:sz="5"/>
+              <w:right w:val="none" w:color="FFFFFF" w:sz="0"/>
+            </w:tcBorders>
+            <w:tcMar>
+              <w:top w:type="dxa" w:w="70"/>
+              <w:left w:type="dxa" w:w="60"/>
+              <w:bottom w:type="dxa" w:w="70"/>
+              <w:right w:type="dxa" w:w="120"/>
+            </w:tcMar>
+          </w:tcPr>
+          <w:p>
+            <w:pPr>
+              <w:spacing w:after="0" w:line="264"/>
+            </w:pPr>
+            <w:r>
+              <w:rPr>
+                <w:b/>
+                <w:bCs/>
+                <w:color w:val="2D1A00"/>
+                <w:sz w:val="19"/>
+                <w:szCs w:val="19"/>
+              </w:rPr>
+              <w:t xml:space="preserve">Outillage</w:t>
+            </w:r>
+          </w:p>
+        </w:tc>
+        <w:tc>
+          <w:tcPr>
+            <w:tcW w:type="dxa" w:w="3826"/>
+            <w:tcBorders>
+              <w:top w:val="single" w:color="8B6914" w:sz="10"/>
+              <w:left w:val="none" w:color="FFFFFF" w:sz="0"/>
+              <w:bottom w:val="single" w:color="8B6914" w:sz="5"/>
+              <w:right w:val="none" w:color="FFFFFF" w:sz="0"/>
+            </w:tcBorders>
+            <w:tcMar>
+              <w:top w:type="dxa" w:w="70"/>
+              <w:left w:type="dxa" w:w="60"/>
+              <w:bottom w:type="dxa" w:w="70"/>
+              <w:right w:type="dxa" w:w="120"/>
+            </w:tcMar>
+          </w:tcPr>
+          <w:p>
+            <w:pPr>
+              <w:spacing w:after="0" w:line="264"/>
+            </w:pPr>
+            <w:r>
+              <w:rPr>
+                <w:b/>
+                <w:bCs/>
+                <w:color w:val="2D1A00"/>
+                <w:sz w:val="19"/>
+                <w:szCs w:val="19"/>
+              </w:rPr>
+              <w:t xml:space="preserve">Ce qu'il vérifie</w:t>
+            </w:r>
+          </w:p>
+        </w:tc>
+        <w:tc>
+          <w:tcPr>
+            <w:tcW w:type="dxa" w:w="2077"/>
+            <w:tcBorders>
+              <w:top w:val="single" w:color="8B6914" w:sz="10"/>
+              <w:left w:val="none" w:color="FFFFFF" w:sz="0"/>
+              <w:bottom w:val="single" w:color="8B6914" w:sz="5"/>
+              <w:right w:val="none" w:color="FFFFFF" w:sz="0"/>
+            </w:tcBorders>
+            <w:tcMar>
+              <w:top w:type="dxa" w:w="70"/>
+              <w:left w:type="dxa" w:w="60"/>
+              <w:bottom w:type="dxa" w:w="70"/>
+              <w:right w:type="dxa" w:w="120"/>
+            </w:tcMar>
+          </w:tcPr>
+          <w:p>
+            <w:pPr>
+              <w:spacing w:after="0" w:line="264"/>
+            </w:pPr>
+            <w:r>
+              <w:rPr>
+                <w:b/>
+                <w:bCs/>
+                <w:color w:val="2D1A00"/>
+                <w:sz w:val="19"/>
+                <w:szCs w:val="19"/>
+              </w:rPr>
+              <w:t xml:space="preserve">Déterminisme</w:t>
+            </w:r>
+          </w:p>
+        </w:tc>
+      </w:tr>
+      <w:tr>
+        <w:tc>
+          <w:tcPr>
+            <w:tcW w:type="dxa" w:w="1202"/>
+            <w:tcBorders>
+              <w:top w:val="none" w:color="FFFFFF" w:sz="0"/>
+              <w:left w:val="none" w:color="FFFFFF" w:sz="0"/>
+              <w:bottom w:val="single" w:color="E0D5BB" w:sz="2"/>
+              <w:right w:val="none" w:color="FFFFFF" w:sz="0"/>
+            </w:tcBorders>
+            <w:tcMar>
+              <w:top w:type="dxa" w:w="70"/>
+              <w:left w:type="dxa" w:w="60"/>
+              <w:bottom w:type="dxa" w:w="70"/>
+              <w:right w:type="dxa" w:w="120"/>
+            </w:tcMar>
+          </w:tcPr>
+          <w:p>
+            <w:pPr>
+              <w:spacing w:after="0" w:line="264"/>
+            </w:pPr>
+            <w:r>
+              <w:rPr>
+                <w:b w:val="false"/>
+                <w:bCs w:val="false"/>
+                <w:sz w:val="19"/>
+                <w:szCs w:val="19"/>
+              </w:rPr>
+              <w:t xml:space="preserve">Unitaire</w:t>
+            </w:r>
+          </w:p>
+        </w:tc>
+        <w:tc>
+          <w:tcPr>
+            <w:tcW w:type="dxa" w:w="1967"/>
+            <w:tcBorders>
+              <w:top w:val="none" w:color="FFFFFF" w:sz="0"/>
+              <w:left w:val="none" w:color="FFFFFF" w:sz="0"/>
+              <w:bottom w:val="single" w:color="E0D5BB" w:sz="2"/>
+              <w:right w:val="none" w:color="FFFFFF" w:sz="0"/>
+            </w:tcBorders>
+            <w:tcMar>
+              <w:top w:type="dxa" w:w="70"/>
+              <w:left w:type="dxa" w:w="60"/>
+              <w:bottom w:type="dxa" w:w="70"/>
+              <w:right w:type="dxa" w:w="120"/>
+            </w:tcMar>
+          </w:tcPr>
+          <w:p>
+            <w:pPr>
+              <w:spacing w:after="0" w:line="264"/>
+            </w:pPr>
+            <w:r>
+              <w:rPr>
+                <w:b w:val="false"/>
+                <w:bCs w:val="false"/>
+                <w:sz w:val="19"/>
+                <w:szCs w:val="19"/>
+              </w:rPr>
+              <w:t xml:space="preserve">PHPUnit / Jest</w:t>
+            </w:r>
+          </w:p>
+        </w:tc>
+        <w:tc>
+          <w:tcPr>
+            <w:tcW w:type="dxa" w:w="3826"/>
+            <w:tcBorders>
+              <w:top w:val="none" w:color="FFFFFF" w:sz="0"/>
+              <w:left w:val="none" w:color="FFFFFF" w:sz="0"/>
+              <w:bottom w:val="single" w:color="E0D5BB" w:sz="2"/>
+              <w:right w:val="none" w:color="FFFFFF" w:sz="0"/>
+            </w:tcBorders>
+            <w:tcMar>
+              <w:top w:type="dxa" w:w="70"/>
+              <w:left w:type="dxa" w:w="60"/>
+              <w:bottom w:type="dxa" w:w="70"/>
+              <w:right w:type="dxa" w:w="120"/>
+            </w:tcMar>
+          </w:tcPr>
+          <w:p>
+            <w:pPr>
+              <w:spacing w:after="0" w:line="264"/>
+            </w:pPr>
+            <w:r>
+              <w:rPr>
+                <w:b w:val="false"/>
+                <w:bCs w:val="false"/>
+                <w:sz w:val="19"/>
+                <w:szCs w:val="19"/>
+              </w:rPr>
+              <w:t xml:space="preserve">Logique pure : calculs de craft (LPB, taux de retour), utilitaires d'authentification, mappage de données</w:t>
+            </w:r>
+          </w:p>
+        </w:tc>
+        <w:tc>
+          <w:tcPr>
+            <w:tcW w:type="dxa" w:w="2077"/>
+            <w:tcBorders>
+              <w:top w:val="none" w:color="FFFFFF" w:sz="0"/>
+              <w:left w:val="none" w:color="FFFFFF" w:sz="0"/>
+              <w:bottom w:val="single" w:color="E0D5BB" w:sz="2"/>
+              <w:right w:val="none" w:color="FFFFFF" w:sz="0"/>
+            </w:tcBorders>
+            <w:tcMar>
+              <w:top w:type="dxa" w:w="70"/>
+              <w:left w:type="dxa" w:w="60"/>
+              <w:bottom w:type="dxa" w:w="70"/>
+              <w:right w:type="dxa" w:w="120"/>
+            </w:tcMar>
+          </w:tcPr>
+          <w:p>
+            <w:pPr>
+              <w:spacing w:after="0" w:line="264"/>
+            </w:pPr>
+            <w:r>
+              <w:rPr>
+                <w:b w:val="false"/>
+                <w:bCs w:val="false"/>
+                <w:sz w:val="19"/>
+                <w:szCs w:val="19"/>
+              </w:rPr>
+              <w:t xml:space="preserve">Total — aucune dépendance externe</w:t>
+            </w:r>
+          </w:p>
+        </w:tc>
+      </w:tr>
+      <w:tr>
+        <w:tc>
+          <w:tcPr>
+            <w:tcW w:type="dxa" w:w="1202"/>
+            <w:tcBorders>
+              <w:top w:val="none" w:color="FFFFFF" w:sz="0"/>
+              <w:left w:val="none" w:color="FFFFFF" w:sz="0"/>
+              <w:bottom w:val="single" w:color="E0D5BB" w:sz="2"/>
+              <w:right w:val="none" w:color="FFFFFF" w:sz="0"/>
+            </w:tcBorders>
+            <w:tcMar>
+              <w:top w:type="dxa" w:w="70"/>
+              <w:left w:type="dxa" w:w="60"/>
+              <w:bottom w:type="dxa" w:w="70"/>
+              <w:right w:type="dxa" w:w="120"/>
+            </w:tcMar>
+          </w:tcPr>
+          <w:p>
+            <w:pPr>
+              <w:spacing w:after="0" w:line="264"/>
+            </w:pPr>
+            <w:r>
+              <w:rPr>
+                <w:b w:val="false"/>
+                <w:bCs w:val="false"/>
+                <w:sz w:val="19"/>
+                <w:szCs w:val="19"/>
+              </w:rPr>
+              <w:t xml:space="preserve">Intégration API</w:t>
+            </w:r>
+          </w:p>
+        </w:tc>
+        <w:tc>
+          <w:tcPr>
+            <w:tcW w:type="dxa" w:w="1967"/>
+            <w:tcBorders>
+              <w:top w:val="none" w:color="FFFFFF" w:sz="0"/>
+              <w:left w:val="none" w:color="FFFFFF" w:sz="0"/>
+              <w:bottom w:val="single" w:color="E0D5BB" w:sz="2"/>
+              <w:right w:val="none" w:color="FFFFFF" w:sz="0"/>
+            </w:tcBorders>
+            <w:tcMar>
+              <w:top w:type="dxa" w:w="70"/>
+              <w:left w:type="dxa" w:w="60"/>
+              <w:bottom w:type="dxa" w:w="70"/>
+              <w:right w:type="dxa" w:w="120"/>
+            </w:tcMar>
+          </w:tcPr>
+          <w:p>
+            <w:pPr>
+              <w:spacing w:after="0" w:line="264"/>
+            </w:pPr>
+            <w:r>
+              <w:rPr>
+                <w:b w:val="false"/>
+                <w:bCs w:val="false"/>
+                <w:sz w:val="19"/>
+                <w:szCs w:val="19"/>
+              </w:rPr>
+              <w:t xml:space="preserve">WebTestCase + SQLite dédiée</w:t>
+            </w:r>
+          </w:p>
+        </w:tc>
+        <w:tc>
+          <w:tcPr>
+            <w:tcW w:type="dxa" w:w="3826"/>
+            <w:tcBorders>
+              <w:top w:val="none" w:color="FFFFFF" w:sz="0"/>
+              <w:left w:val="none" w:color="FFFFFF" w:sz="0"/>
+              <w:bottom w:val="single" w:color="E0D5BB" w:sz="2"/>
+              <w:right w:val="none" w:color="FFFFFF" w:sz="0"/>
+            </w:tcBorders>
+            <w:tcMar>
+              <w:top w:type="dxa" w:w="70"/>
+              <w:left w:type="dxa" w:w="60"/>
+              <w:bottom w:type="dxa" w:w="70"/>
+              <w:right w:type="dxa" w:w="120"/>
+            </w:tcMar>
+          </w:tcPr>
+          <w:p>
+            <w:pPr>
+              <w:spacing w:after="0" w:line="264"/>
+            </w:pPr>
+            <w:r>
+              <w:rPr>
+                <w:b w:val="false"/>
+                <w:bCs w:val="false"/>
+                <w:sz w:val="19"/>
+                <w:szCs w:val="19"/>
+              </w:rPr>
+              <w:t xml:space="preserve">Contrats HTTP réels : codes de statut, corps JSON, règles du firewall, contraintes BDD</w:t>
+            </w:r>
+          </w:p>
+        </w:tc>
+        <w:tc>
+          <w:tcPr>
+            <w:tcW w:type="dxa" w:w="2077"/>
+            <w:tcBorders>
+              <w:top w:val="none" w:color="FFFFFF" w:sz="0"/>
+              <w:left w:val="none" w:color="FFFFFF" w:sz="0"/>
+              <w:bottom w:val="single" w:color="E0D5BB" w:sz="2"/>
+              <w:right w:val="none" w:color="FFFFFF" w:sz="0"/>
+            </w:tcBorders>
+            <w:tcMar>
+              <w:top w:type="dxa" w:w="70"/>
+              <w:left w:type="dxa" w:w="60"/>
+              <w:bottom w:type="dxa" w:w="70"/>
+              <w:right w:type="dxa" w:w="120"/>
+            </w:tcMar>
+          </w:tcPr>
+          <w:p>
+            <w:pPr>
+              <w:spacing w:after="0" w:line="264"/>
+            </w:pPr>
+            <w:r>
+              <w:rPr>
+                <w:b w:val="false"/>
+                <w:bCs w:val="false"/>
+                <w:sz w:val="19"/>
+                <w:szCs w:val="19"/>
+              </w:rPr>
+              <w:t xml:space="preserve">Base recréée à chaque exécution</w:t>
+            </w:r>
+          </w:p>
+        </w:tc>
+      </w:tr>
+      <w:tr>
+        <w:tc>
+          <w:tcPr>
+            <w:tcW w:type="dxa" w:w="1202"/>
+            <w:tcBorders>
+              <w:top w:val="none" w:color="FFFFFF" w:sz="0"/>
+              <w:left w:val="none" w:color="FFFFFF" w:sz="0"/>
+              <w:bottom w:val="single" w:color="E0D5BB" w:sz="2"/>
+              <w:right w:val="none" w:color="FFFFFF" w:sz="0"/>
+            </w:tcBorders>
+            <w:tcMar>
+              <w:top w:type="dxa" w:w="70"/>
+              <w:left w:type="dxa" w:w="60"/>
+              <w:bottom w:type="dxa" w:w="70"/>
+              <w:right w:type="dxa" w:w="120"/>
+            </w:tcMar>
+          </w:tcPr>
+          <w:p>
+            <w:pPr>
+              <w:spacing w:after="0" w:line="264"/>
+            </w:pPr>
+            <w:r>
+              <w:rPr>
+                <w:b w:val="false"/>
+                <w:bCs w:val="false"/>
+                <w:sz w:val="19"/>
+                <w:szCs w:val="19"/>
+              </w:rPr>
+              <w:t xml:space="preserve">Composants UI</w:t>
+            </w:r>
+          </w:p>
+        </w:tc>
+        <w:tc>
+          <w:tcPr>
+            <w:tcW w:type="dxa" w:w="1967"/>
+            <w:tcBorders>
+              <w:top w:val="none" w:color="FFFFFF" w:sz="0"/>
+              <w:left w:val="none" w:color="FFFFFF" w:sz="0"/>
+              <w:bottom w:val="single" w:color="E0D5BB" w:sz="2"/>
+              <w:right w:val="none" w:color="FFFFFF" w:sz="0"/>
+            </w:tcBorders>
+            <w:tcMar>
+              <w:top w:type="dxa" w:w="70"/>
+              <w:left w:type="dxa" w:w="60"/>
+              <w:bottom w:type="dxa" w:w="70"/>
+              <w:right w:type="dxa" w:w="120"/>
+            </w:tcMar>
+          </w:tcPr>
+          <w:p>
+            <w:pPr>
+              <w:spacing w:after="0" w:line="264"/>
+            </w:pPr>
+            <w:r>
+              <w:rPr>
+                <w:b w:val="false"/>
+                <w:bCs w:val="false"/>
+                <w:sz w:val="19"/>
+                <w:szCs w:val="19"/>
+              </w:rPr>
+              <w:t xml:space="preserve">React Testing Library</w:t>
+            </w:r>
+          </w:p>
+        </w:tc>
+        <w:tc>
+          <w:tcPr>
+            <w:tcW w:type="dxa" w:w="3826"/>
+            <w:tcBorders>
+              <w:top w:val="none" w:color="FFFFFF" w:sz="0"/>
+              <w:left w:val="none" w:color="FFFFFF" w:sz="0"/>
+              <w:bottom w:val="single" w:color="E0D5BB" w:sz="2"/>
+              <w:right w:val="none" w:color="FFFFFF" w:sz="0"/>
+            </w:tcBorders>
+            <w:tcMar>
+              <w:top w:type="dxa" w:w="70"/>
+              <w:left w:type="dxa" w:w="60"/>
+              <w:bottom w:type="dxa" w:w="70"/>
+              <w:right w:type="dxa" w:w="120"/>
+            </w:tcMar>
+          </w:tcPr>
+          <w:p>
+            <w:pPr>
+              <w:spacing w:after="0" w:line="264"/>
+            </w:pPr>
+            <w:r>
+              <w:rPr>
+                <w:b w:val="false"/>
+                <w:bCs w:val="false"/>
+                <w:sz w:val="19"/>
+                <w:szCs w:val="19"/>
+              </w:rPr>
+              <w:t xml:space="preserve">Rendu, interactions, états d'erreur — réseau simulé par mocks</w:t>
+            </w:r>
+          </w:p>
+        </w:tc>
+        <w:tc>
+          <w:tcPr>
+            <w:tcW w:type="dxa" w:w="2077"/>
+            <w:tcBorders>
+              <w:top w:val="none" w:color="FFFFFF" w:sz="0"/>
+              <w:left w:val="none" w:color="FFFFFF" w:sz="0"/>
+              <w:bottom w:val="single" w:color="E0D5BB" w:sz="2"/>
+              <w:right w:val="none" w:color="FFFFFF" w:sz="0"/>
+            </w:tcBorders>
+            <w:tcMar>
+              <w:top w:type="dxa" w:w="70"/>
+              <w:left w:type="dxa" w:w="60"/>
+              <w:bottom w:type="dxa" w:w="70"/>
+              <w:right w:type="dxa" w:w="120"/>
+            </w:tcMar>
+          </w:tcPr>
+          <w:p>
+            <w:pPr>
+              <w:spacing w:after="0" w:line="264"/>
+            </w:pPr>
+            <w:r>
+              <w:rPr>
+                <w:b w:val="false"/>
+                <w:bCs w:val="false"/>
+                <w:sz w:val="19"/>
+                <w:szCs w:val="19"/>
+              </w:rPr>
+              <w:t xml:space="preserve">Aucun appel réseau réel</w:t>
+            </w:r>
+          </w:p>
+        </w:tc>
+      </w:tr>
+      <w:tr>
+        <w:tc>
+          <w:tcPr>
+            <w:tcW w:type="dxa" w:w="1202"/>
+            <w:tcBorders>
+              <w:top w:val="none" w:color="FFFFFF" w:sz="0"/>
+              <w:left w:val="none" w:color="FFFFFF" w:sz="0"/>
+              <w:bottom w:val="single" w:color="8B6914" w:sz="10"/>
+              <w:right w:val="none" w:color="FFFFFF" w:sz="0"/>
+            </w:tcBorders>
+            <w:tcMar>
+              <w:top w:type="dxa" w:w="70"/>
+              <w:left w:type="dxa" w:w="60"/>
+              <w:bottom w:type="dxa" w:w="70"/>
+              <w:right w:type="dxa" w:w="120"/>
+            </w:tcMar>
+          </w:tcPr>
+          <w:p>
+            <w:pPr>
+              <w:spacing w:after="0" w:line="264"/>
+            </w:pPr>
+            <w:r>
+              <w:rPr>
+                <w:b w:val="false"/>
+                <w:bCs w:val="false"/>
+                <w:sz w:val="19"/>
+                <w:szCs w:val="19"/>
+              </w:rPr>
+              <w:t xml:space="preserve">Recette E2E</w:t>
+            </w:r>
+          </w:p>
+        </w:tc>
+        <w:tc>
+          <w:tcPr>
+            <w:tcW w:type="dxa" w:w="1967"/>
+            <w:tcBorders>
+              <w:top w:val="none" w:color="FFFFFF" w:sz="0"/>
+              <w:left w:val="none" w:color="FFFFFF" w:sz="0"/>
+              <w:bottom w:val="single" w:color="8B6914" w:sz="10"/>
+              <w:right w:val="none" w:color="FFFFFF" w:sz="0"/>
+            </w:tcBorders>
+            <w:tcMar>
+              <w:top w:type="dxa" w:w="70"/>
+              <w:left w:type="dxa" w:w="60"/>
+              <w:bottom w:type="dxa" w:w="70"/>
+              <w:right w:type="dxa" w:w="120"/>
+            </w:tcMar>
+          </w:tcPr>
+          <w:p>
+            <w:pPr>
+              <w:spacing w:after="0" w:line="264"/>
+            </w:pPr>
+            <w:r>
+              <w:rPr>
+                <w:b w:val="false"/>
+                <w:bCs w:val="false"/>
+                <w:sz w:val="19"/>
+                <w:szCs w:val="19"/>
+              </w:rPr>
+              <w:t xml:space="preserve">Playwright + API (28 scénarios, §10)</w:t>
+            </w:r>
+          </w:p>
+        </w:tc>
+        <w:tc>
+          <w:tcPr>
+            <w:tcW w:type="dxa" w:w="3826"/>
+            <w:tcBorders>
+              <w:top w:val="none" w:color="FFFFFF" w:sz="0"/>
+              <w:left w:val="none" w:color="FFFFFF" w:sz="0"/>
+              <w:bottom w:val="single" w:color="8B6914" w:sz="10"/>
+              <w:right w:val="none" w:color="FFFFFF" w:sz="0"/>
+            </w:tcBorders>
+            <w:tcMar>
+              <w:top w:type="dxa" w:w="70"/>
+              <w:left w:type="dxa" w:w="60"/>
+              <w:bottom w:type="dxa" w:w="70"/>
+              <w:right w:type="dxa" w:w="120"/>
+            </w:tcMar>
+          </w:tcPr>
+          <w:p>
+            <w:pPr>
+              <w:spacing w:after="0" w:line="264"/>
+            </w:pPr>
+            <w:r>
+              <w:rPr>
+                <w:b w:val="false"/>
+                <w:bCs w:val="false"/>
+                <w:sz w:val="19"/>
+                <w:szCs w:val="19"/>
+              </w:rPr>
+              <w:t xml:space="preserve">Parcours complets en conditions réelles (API Albion vivante), sécurité structurelle</w:t>
+            </w:r>
+          </w:p>
+        </w:tc>
+        <w:tc>
+          <w:tcPr>
+            <w:tcW w:type="dxa" w:w="2077"/>
+            <w:tcBorders>
+              <w:top w:val="none" w:color="FFFFFF" w:sz="0"/>
+              <w:left w:val="none" w:color="FFFFFF" w:sz="0"/>
+              <w:bottom w:val="single" w:color="8B6914" w:sz="10"/>
+              <w:right w:val="none" w:color="FFFFFF" w:sz="0"/>
+            </w:tcBorders>
+            <w:tcMar>
+              <w:top w:type="dxa" w:w="70"/>
+              <w:left w:type="dxa" w:w="60"/>
+              <w:bottom w:type="dxa" w:w="70"/>
+              <w:right w:type="dxa" w:w="120"/>
+            </w:tcMar>
+          </w:tcPr>
+          <w:p>
+            <w:pPr>
+              <w:spacing w:after="0" w:line="264"/>
+            </w:pPr>
+            <w:r>
+              <w:rPr>
+                <w:b w:val="false"/>
+                <w:bCs w:val="false"/>
+                <w:sz w:val="19"/>
+                <w:szCs w:val="19"/>
+              </w:rPr>
+              <w:t xml:space="preserve">Exécution pilotée, résultats consignés</w:t>
+            </w:r>
+          </w:p>
+        </w:tc>
+      </w:tr>
+    </w:tbl>
+    <w:p>
+      <w:pPr>
+        <w:spacing w:after="140" w:before="0" w:line="330"/>
+        <w:jc w:val="both"/>
+      </w:pPr>
+      <w:r>
+        <w:rPr>
+          <w:b w:val="false"/>
+          <w:bCs w:val="false"/>
+          <w:i w:val="false"/>
+          <w:iCs w:val="false"/>
+          <w:sz w:val="22"/>
+          <w:szCs w:val="22"/>
+        </w:rPr>
+        <w:t xml:space="preserve">Les appels réseau sont simulés dans les tests automatisés pour une raison précise : l'API du jeu est vivante (données de joueurs qui changent en permanence), donc impropre à des assertions stables. Elle est en revanche volontairement utilisée telle quelle dans la recette (§10), qui vérifie le comportement en conditions réelles.</w:t>
       </w:r>
     </w:p>
     <w:p>
@@ -10974,6 +13667,146 @@
     </w:p>
     <w:p>
       <w:pPr>
+        <w:pStyle w:val="Heading2"/>
+      </w:pPr>
+      <w:r>
+        <w:t xml:space="preserve">7.2 Données personnelles : minimisation par conception (RGPD)</w:t>
+      </w:r>
+    </w:p>
+    <w:p>
+      <w:pPr>
+        <w:spacing w:after="140" w:before="0" w:line="330"/>
+        <w:jc w:val="both"/>
+      </w:pPr>
+      <w:r>
+        <w:rPr>
+          <w:b w:val="false"/>
+          <w:bCs w:val="false"/>
+          <w:i w:val="false"/>
+          <w:iCs w:val="false"/>
+          <w:sz w:val="22"/>
+          <w:szCs w:val="22"/>
+        </w:rPr>
+        <w:t xml:space="preserve">Le principe de minimisation est appliqué à la racine : l'entité User ne comporte que six champs — identifiant technique, pseudonyme, mot de passe haché, rôles, date de création, préférences d'interface. Aucune adresse e-mail, aucun nom réel, aucune donnée de contact n'est collectée : il n'y a rien à fuiter.</w:t>
+      </w:r>
+    </w:p>
+    <w:p>
+      <w:pPr>
+        <w:pStyle w:val="ListParagraph"/>
+        <w:numPr>
+          <w:ilvl w:val="0"/>
+          <w:numId w:val="3"/>
+        </w:numPr>
+        <w:spacing w:after="80" w:line="330"/>
+        <w:jc w:val="both"/>
+      </w:pPr>
+      <w:r>
+        <w:rPr>
+          <w:sz w:val="22"/>
+          <w:szCs w:val="22"/>
+        </w:rPr>
+        <w:t xml:space="preserve">Pseudonymat natif : le seul identifiant demandé est un pseudonyme choisi par l'utilisateur, sans lien requis avec son identité civile.</w:t>
+      </w:r>
+    </w:p>
+    <w:p>
+      <w:pPr>
+        <w:pStyle w:val="ListParagraph"/>
+        <w:numPr>
+          <w:ilvl w:val="0"/>
+          <w:numId w:val="3"/>
+        </w:numPr>
+        <w:spacing w:after="80" w:line="330"/>
+        <w:jc w:val="both"/>
+      </w:pPr>
+      <w:r>
+        <w:rPr>
+          <w:sz w:val="22"/>
+          <w:szCs w:val="22"/>
+        </w:rPr>
+        <w:t xml:space="preserve">Mots de passe hachés bcrypt avec coût automatique — jamais stockés ni journalisés en clair (vérifié : les logs d'échec d'authentification ne portent pas le mot de passe).</w:t>
+      </w:r>
+    </w:p>
+    <w:p>
+      <w:pPr>
+        <w:pStyle w:val="ListParagraph"/>
+        <w:numPr>
+          <w:ilvl w:val="0"/>
+          <w:numId w:val="3"/>
+        </w:numPr>
+        <w:spacing w:after="80" w:line="330"/>
+        <w:jc w:val="both"/>
+      </w:pPr>
+      <w:r>
+        <w:rPr>
+          <w:sz w:val="22"/>
+          <w:szCs w:val="22"/>
+        </w:rPr>
+        <w:t xml:space="preserve">Aucun traceur tiers : pas d'analytics externe, pas de cookie publicitaire — les seules données d'usage sont les compteurs internes anonymes de recherche (SearchLog) qui alimentent les KPI de l'administration.</w:t>
+      </w:r>
+    </w:p>
+    <w:p>
+      <w:pPr>
+        <w:pStyle w:val="ListParagraph"/>
+        <w:numPr>
+          <w:ilvl w:val="0"/>
+          <w:numId w:val="3"/>
+        </w:numPr>
+        <w:spacing w:after="80" w:line="330"/>
+        <w:jc w:val="both"/>
+      </w:pPr>
+      <w:r>
+        <w:rPr>
+          <w:sz w:val="22"/>
+          <w:szCs w:val="22"/>
+        </w:rPr>
+        <w:t xml:space="preserve">Droit à l'effacement : la suppression d'un compte retire le compte, ses routes et ses compositions (contraintes ON DELETE CASCADE en base — un défaut sur les routes a été détecté lors de cette revue, corrigé et vérifié : BUG-016).</w:t>
+      </w:r>
+    </w:p>
+    <w:p>
+      <w:pPr>
+        <w:pStyle w:val="ListParagraph"/>
+        <w:numPr>
+          <w:ilvl w:val="0"/>
+          <w:numId w:val="3"/>
+        </w:numPr>
+        <w:spacing w:after="80" w:line="330"/>
+        <w:jc w:val="both"/>
+      </w:pPr>
+      <w:r>
+        <w:rPr>
+          <w:sz w:val="22"/>
+          <w:szCs w:val="22"/>
+        </w:rPr>
+        <w:t xml:space="preserve">Les données de jeu affichées (statistiques de joueurs, batailles) proviennent de l'API publique officielle d'Albion Online et ne sont pas persistées par l'application (cf. §3.2).</w:t>
+      </w:r>
+    </w:p>
+    <w:p>
+      <w:pPr>
+        <w:pStyle w:val="Heading2"/>
+      </w:pPr>
+      <w:r>
+        <w:t xml:space="preserve">7.3 Cycle de vie des clés et des secrets</w:t>
+      </w:r>
+    </w:p>
+    <w:p>
+      <w:pPr>
+        <w:spacing w:after="140" w:before="0" w:line="330"/>
+        <w:jc w:val="both"/>
+      </w:pPr>
+      <w:r>
+        <w:rPr>
+          <w:b w:val="false"/>
+          <w:bCs w:val="false"/>
+          <w:i w:val="false"/>
+          <w:iCs w:val="false"/>
+          <w:sz w:val="22"/>
+          <w:szCs w:val="22"/>
+        </w:rPr>
+        <w:t xml:space="preserve">Le détail opérationnel (variable par variable) figure en §4.4 ; les principes : les clés RSA de signature JWT sont générées sur chaque machine et n'existent dans aucun dépôt ; le secret applicatif est propre à chaque environnement ; les identifiants de déploiement vivent exclusivement dans les secrets chiffrés de GitHub Actions. En cas de compromission supposée d'une clé JWT, la rotation consiste à regénérer la paire (lexik:jwt:generate-keypair) : tous les jetons en circulation sont invalidés d'un coup, et les utilisateurs se reconnectent.</w:t>
+      </w:r>
+    </w:p>
+    <w:p>
+      <w:pPr>
         <w:pStyle w:val="Heading1"/>
       </w:pPr>
       <w:r>
@@ -11018,7 +13851,7 @@
         <w:pStyle w:val="ListParagraph"/>
         <w:numPr>
           <w:ilvl w:val="0"/>
-          <w:numId w:val="2"/>
+          <w:numId w:val="3"/>
         </w:numPr>
         <w:spacing w:after="80" w:line="330"/>
         <w:jc w:val="both"/>
@@ -11036,7 +13869,7 @@
         <w:pStyle w:val="ListParagraph"/>
         <w:numPr>
           <w:ilvl w:val="0"/>
-          <w:numId w:val="2"/>
+          <w:numId w:val="3"/>
         </w:numPr>
         <w:spacing w:after="80" w:line="330"/>
         <w:jc w:val="both"/>
@@ -11054,7 +13887,7 @@
         <w:pStyle w:val="ListParagraph"/>
         <w:numPr>
           <w:ilvl w:val="0"/>
-          <w:numId w:val="2"/>
+          <w:numId w:val="3"/>
         </w:numPr>
         <w:spacing w:after="80" w:line="330"/>
         <w:jc w:val="both"/>
@@ -11072,7 +13905,7 @@
         <w:pStyle w:val="ListParagraph"/>
         <w:numPr>
           <w:ilvl w:val="0"/>
-          <w:numId w:val="2"/>
+          <w:numId w:val="3"/>
         </w:numPr>
         <w:spacing w:after="80" w:line="330"/>
         <w:jc w:val="both"/>
@@ -11090,7 +13923,7 @@
         <w:pStyle w:val="ListParagraph"/>
         <w:numPr>
           <w:ilvl w:val="0"/>
-          <w:numId w:val="2"/>
+          <w:numId w:val="3"/>
         </w:numPr>
         <w:spacing w:after="80" w:line="330"/>
         <w:jc w:val="both"/>
@@ -11108,7 +13941,7 @@
         <w:pStyle w:val="ListParagraph"/>
         <w:numPr>
           <w:ilvl w:val="0"/>
-          <w:numId w:val="2"/>
+          <w:numId w:val="3"/>
         </w:numPr>
         <w:spacing w:after="80" w:line="330"/>
         <w:jc w:val="both"/>
@@ -11163,7 +13996,7 @@
                 <wp:inline distT="0" distB="0" distL="0" distR="0">
                   <wp:extent cx="5143500" cy="3219450"/>
                   <wp:effectExtent t="0" r="0" b="0" l="0"/>
-                  <wp:docPr id="1" name="figure-12" descr="Thème clair : alternative de contraste au thème sombre, préférence persistée" title="Thème clair : alternative de contraste au thème sombre, préférence persistée"/>
+                  <wp:docPr id="1" name="figure-14" descr="Thème clair : alternative de contraste au thème sombre, préférence persistée" title="Thème clair : alternative de contraste au thème sombre, préférence persistée"/>
                   <wp:cNvGraphicFramePr>
                     <a:graphicFrameLocks xmlns:a="http://schemas.openxmlformats.org/drawingml/2006/main" noChangeAspect="1"/>
                   </wp:cNvGraphicFramePr>
@@ -11177,7 +14010,7 @@
                           </pic:cNvPicPr>
                         </pic:nvPicPr>
                         <pic:blipFill>
-                          <a:blip r:embed="rId23" cstate="none"/>
+                          <a:blip r:embed="rId25" cstate="none"/>
                           <a:srcRect/>
                           <a:stretch>
                             <a:fillRect/>
@@ -11215,7 +14048,7 @@
           <w:sz w:val="18"/>
           <w:szCs w:val="18"/>
         </w:rPr>
-        <w:t xml:space="preserve">Figure 12 — Thème clair : alternative de contraste au thème sombre, préférence persistée</w:t>
+        <w:t xml:space="preserve">Figure 14 — Thème clair : alternative de contraste au thème sombre, préférence persistée</w:t>
       </w:r>
     </w:p>
     <w:p>
@@ -12065,7 +14898,7 @@
         <w:pStyle w:val="ListParagraph"/>
         <w:numPr>
           <w:ilvl w:val="0"/>
-          <w:numId w:val="2"/>
+          <w:numId w:val="3"/>
         </w:numPr>
         <w:spacing w:after="80" w:line="330"/>
         <w:jc w:val="both"/>
@@ -12083,7 +14916,7 @@
         <w:pStyle w:val="ListParagraph"/>
         <w:numPr>
           <w:ilvl w:val="0"/>
-          <w:numId w:val="2"/>
+          <w:numId w:val="3"/>
         </w:numPr>
         <w:spacing w:after="80" w:line="330"/>
         <w:jc w:val="both"/>
@@ -12101,7 +14934,7 @@
         <w:pStyle w:val="ListParagraph"/>
         <w:numPr>
           <w:ilvl w:val="0"/>
-          <w:numId w:val="2"/>
+          <w:numId w:val="3"/>
         </w:numPr>
         <w:spacing w:after="80" w:line="330"/>
         <w:jc w:val="both"/>
@@ -12826,6 +15659,321 @@
           <w:szCs w:val="22"/>
         </w:rPr>
         <w:t xml:space="preserve">La dernière version du logiciel est fonctionnelle, fiable et viable : la recette complète (28 scénarios, §10) a été déroulée avec 100 % de réussite, les 126 tests automatisés sont verts sur la version 3.0.0 (vérification du 14/07/2026), et l'application est manipulable en autonomie par un utilisateur (tutoriel public avec visite guidée, messages d'erreur explicites).</w:t>
+      </w:r>
+    </w:p>
+    <w:p>
+      <w:pPr>
+        <w:pStyle w:val="Heading2"/>
+      </w:pPr>
+      <w:r>
+        <w:t xml:space="preserve">9.3 L'historique comme preuve : extrait du journal git</w:t>
+      </w:r>
+    </w:p>
+    <w:p>
+      <w:pPr>
+        <w:spacing w:after="140" w:before="0" w:line="330"/>
+        <w:jc w:val="both"/>
+      </w:pPr>
+      <w:r>
+        <w:rPr>
+          <w:b w:val="false"/>
+          <w:bCs w:val="false"/>
+          <w:i w:val="false"/>
+          <w:iCs w:val="false"/>
+          <w:sz w:val="22"/>
+          <w:szCs w:val="22"/>
+        </w:rPr>
+        <w:t xml:space="preserve">L'historique du dépôt raconte chaque évolution avec la convention Conventional Commits — extrait réel, du socle initial à la v3 :</w:t>
+      </w:r>
+    </w:p>
+    <w:tbl>
+      <w:tblPr>
+        <w:tblW w:type="dxa" w:w="9072"/>
+        <w:tblBorders>
+          <w:top w:val="single" w:color="auto" w:sz="4"/>
+          <w:left w:val="single" w:color="auto" w:sz="4"/>
+          <w:bottom w:val="single" w:color="auto" w:sz="4"/>
+          <w:right w:val="single" w:color="auto" w:sz="4"/>
+          <w:insideH w:val="single" w:color="auto" w:sz="4"/>
+          <w:insideV w:val="single" w:color="auto" w:sz="4"/>
+        </w:tblBorders>
+      </w:tblPr>
+      <w:tblGrid>
+        <w:gridCol w:w="9072"/>
+      </w:tblGrid>
+      <w:tr>
+        <w:tc>
+          <w:tcPr>
+            <w:tcW w:type="dxa" w:w="9072"/>
+            <w:tcBorders>
+              <w:top w:val="single" w:color="E0D5BB" w:sz="2"/>
+              <w:left w:val="single" w:color="E0D5BB" w:sz="2"/>
+              <w:bottom w:val="single" w:color="E0D5BB" w:sz="2"/>
+              <w:right w:val="single" w:color="E0D5BB" w:sz="2"/>
+            </w:tcBorders>
+            <w:shd w:fill="FAF6EC" w:val="clear"/>
+            <w:tcMar>
+              <w:top w:type="dxa" w:w="90"/>
+              <w:left w:type="dxa" w:w="140"/>
+              <w:bottom w:type="dxa" w:w="90"/>
+              <w:right w:type="dxa" w:w="140"/>
+            </w:tcMar>
+          </w:tcPr>
+          <w:p>
+            <w:pPr>
+              <w:spacing w:after="0" w:line="230"/>
+            </w:pPr>
+            <w:r>
+              <w:rPr>
+                <w:rFonts w:ascii="Courier New" w:cs="Courier New" w:eastAsia="Courier New" w:hAnsi="Courier New"/>
+                <w:color w:val="3A2E15"/>
+                <w:sz w:val="16"/>
+                <w:szCs w:val="16"/>
+              </w:rPr>
+              <w:t xml:space="preserve">ff4307c6 chore: initialisation du projet — back Symfony 7, front React, monorepo</w:t>
+            </w:r>
+          </w:p>
+          <w:p>
+            <w:pPr>
+              <w:spacing w:after="0" w:line="230"/>
+            </w:pPr>
+            <w:r>
+              <w:rPr>
+                <w:rFonts w:ascii="Courier New" w:cs="Courier New" w:eastAsia="Courier New" w:hAnsi="Courier New"/>
+                <w:color w:val="3A2E15"/>
+                <w:sz w:val="16"/>
+                <w:szCs w:val="16"/>
+              </w:rPr>
+              <w:t xml:space="preserve">d7d4bbc6 feat: recherche de cartes — entités zones, migrations Doctrine, sécurité</w:t>
+            </w:r>
+          </w:p>
+          <w:p>
+            <w:pPr>
+              <w:spacing w:after="0" w:line="230"/>
+            </w:pPr>
+            <w:r>
+              <w:rPr>
+                <w:rFonts w:ascii="Courier New" w:cs="Courier New" w:eastAsia="Courier New" w:hAnsi="Courier New"/>
+                <w:color w:val="3A2E15"/>
+                <w:sz w:val="16"/>
+                <w:szCs w:val="16"/>
+              </w:rPr>
+              <w:t xml:space="preserve">05aa880e fix(front): corrections issues de la recette du 12/06 + accessibilité</w:t>
+            </w:r>
+          </w:p>
+          <w:p>
+            <w:pPr>
+              <w:spacing w:after="0" w:line="230"/>
+            </w:pPr>
+            <w:r>
+              <w:rPr>
+                <w:rFonts w:ascii="Courier New" w:cs="Courier New" w:eastAsia="Courier New" w:hAnsi="Courier New"/>
+                <w:color w:val="3A2E15"/>
+                <w:sz w:val="16"/>
+                <w:szCs w:val="16"/>
+              </w:rPr>
+              <w:t xml:space="preserve">322a0f94 feat(back): support multi-serveur de jeu (americas/europe/asia)</w:t>
+            </w:r>
+          </w:p>
+          <w:p>
+            <w:pPr>
+              <w:spacing w:after="0" w:line="230"/>
+            </w:pPr>
+            <w:r>
+              <w:rPr>
+                <w:rFonts w:ascii="Courier New" w:cs="Courier New" w:eastAsia="Courier New" w:hAnsi="Courier New"/>
+                <w:color w:val="3A2E15"/>
+                <w:sz w:val="16"/>
+                <w:szCs w:val="16"/>
+              </w:rPr>
+              <w:t xml:space="preserve">f94d8bfd feat(back): statistiques PvP joueur (kills, morts, rapport de session)</w:t>
+            </w:r>
+          </w:p>
+          <w:p>
+            <w:pPr>
+              <w:spacing w:after="0" w:line="230"/>
+            </w:pPr>
+            <w:r>
+              <w:rPr>
+                <w:rFonts w:ascii="Courier New" w:cs="Courier New" w:eastAsia="Courier New" w:hAnsi="Courier New"/>
+                <w:color w:val="3A2E15"/>
+                <w:sz w:val="16"/>
+                <w:szCs w:val="16"/>
+              </w:rPr>
+              <w:t xml:space="preserve">51eefd40 feat(back): recherche et détail de batailles</w:t>
+            </w:r>
+          </w:p>
+          <w:p>
+            <w:pPr>
+              <w:spacing w:after="0" w:line="230"/>
+            </w:pPr>
+            <w:r>
+              <w:rPr>
+                <w:rFonts w:ascii="Courier New" w:cs="Courier New" w:eastAsia="Courier New" w:hAnsi="Courier New"/>
+                <w:color w:val="3A2E15"/>
+                <w:sz w:val="16"/>
+                <w:szCs w:val="16"/>
+              </w:rPr>
+              <w:t xml:space="preserve">4241d522 feat(back): noms d'objets localisés pour les recettes de craft</w:t>
+            </w:r>
+          </w:p>
+          <w:p>
+            <w:pPr>
+              <w:spacing w:after="0" w:line="230"/>
+            </w:pPr>
+            <w:r>
+              <w:rPr>
+                <w:rFonts w:ascii="Courier New" w:cs="Courier New" w:eastAsia="Courier New" w:hAnsi="Courier New"/>
+                <w:color w:val="3A2E15"/>
+                <w:sz w:val="16"/>
+                <w:szCs w:val="16"/>
+              </w:rPr>
+              <w:t xml:space="preserve">53af2a2e feat(back): gestion dynamique des langues d'interface par l'admin</w:t>
+            </w:r>
+          </w:p>
+          <w:p>
+            <w:pPr>
+              <w:spacing w:after="0" w:line="230"/>
+            </w:pPr>
+            <w:r>
+              <w:rPr>
+                <w:rFonts w:ascii="Courier New" w:cs="Courier New" w:eastAsia="Courier New" w:hAnsi="Courier New"/>
+                <w:color w:val="3A2E15"/>
+                <w:sz w:val="16"/>
+                <w:szCs w:val="16"/>
+              </w:rPr>
+              <w:t xml:space="preserve">ba55635d fix(back): CORS et sécurité pour le multi-serveur et les langues publiques</w:t>
+            </w:r>
+          </w:p>
+          <w:p>
+            <w:pPr>
+              <w:spacing w:after="0" w:line="230"/>
+            </w:pPr>
+            <w:r>
+              <w:rPr>
+                <w:rFonts w:ascii="Courier New" w:cs="Courier New" w:eastAsia="Courier New" w:hAnsi="Courier New"/>
+                <w:color w:val="3A2E15"/>
+                <w:sz w:val="16"/>
+                <w:szCs w:val="16"/>
+              </w:rPr>
+              <w:t xml:space="preserve">39743bfa feat(front): sélecteur de serveur de jeu (americas/europe/asia)</w:t>
+            </w:r>
+          </w:p>
+          <w:p>
+            <w:pPr>
+              <w:spacing w:after="0" w:line="230"/>
+            </w:pPr>
+            <w:r>
+              <w:rPr>
+                <w:rFonts w:ascii="Courier New" w:cs="Courier New" w:eastAsia="Courier New" w:hAnsi="Courier New"/>
+                <w:color w:val="3A2E15"/>
+                <w:sz w:val="16"/>
+                <w:szCs w:val="16"/>
+              </w:rPr>
+              <w:t xml:space="preserve">46d3458f feat(front): statistiques PvP joueur (kills, morts, rapport de session)</w:t>
+            </w:r>
+          </w:p>
+          <w:p>
+            <w:pPr>
+              <w:spacing w:after="0" w:line="230"/>
+            </w:pPr>
+            <w:r>
+              <w:rPr>
+                <w:rFonts w:ascii="Courier New" w:cs="Courier New" w:eastAsia="Courier New" w:hAnsi="Courier New"/>
+                <w:color w:val="3A2E15"/>
+                <w:sz w:val="16"/>
+                <w:szCs w:val="16"/>
+              </w:rPr>
+              <w:t xml:space="preserve">f6e4866c feat(front): page batailles (recherche guilde/alliance, détail)</w:t>
+            </w:r>
+          </w:p>
+          <w:p>
+            <w:pPr>
+              <w:spacing w:after="0" w:line="230"/>
+            </w:pPr>
+            <w:r>
+              <w:rPr>
+                <w:rFonts w:ascii="Courier New" w:cs="Courier New" w:eastAsia="Courier New" w:hAnsi="Courier New"/>
+                <w:color w:val="3A2E15"/>
+                <w:sz w:val="16"/>
+                <w:szCs w:val="16"/>
+              </w:rPr>
+              <w:t xml:space="preserve">ccb6d69c feat(front): internationalisation des pages restantes</w:t>
+            </w:r>
+          </w:p>
+          <w:p>
+            <w:pPr>
+              <w:spacing w:after="0" w:line="230"/>
+            </w:pPr>
+            <w:r>
+              <w:rPr>
+                <w:rFonts w:ascii="Courier New" w:cs="Courier New" w:eastAsia="Courier New" w:hAnsi="Courier New"/>
+                <w:color w:val="3A2E15"/>
+                <w:sz w:val="16"/>
+                <w:szCs w:val="16"/>
+              </w:rPr>
+              <w:t xml:space="preserve">8129a223 fix(front): tests Admin suite au passage des libellés de langue en i18n</w:t>
+            </w:r>
+          </w:p>
+          <w:p>
+            <w:pPr>
+              <w:spacing w:after="0" w:line="230"/>
+            </w:pPr>
+            <w:r>
+              <w:rPr>
+                <w:rFonts w:ascii="Courier New" w:cs="Courier New" w:eastAsia="Courier New" w:hAnsi="Courier New"/>
+                <w:color w:val="3A2E15"/>
+                <w:sz w:val="16"/>
+                <w:szCs w:val="16"/>
+              </w:rPr>
+              <w:t xml:space="preserve">1af1a572 feat(deploy): installation automatique de la sonde de supervision</w:t>
+            </w:r>
+          </w:p>
+          <w:p>
+            <w:pPr>
+              <w:spacing w:after="0" w:line="230"/>
+            </w:pPr>
+            <w:r>
+              <w:rPr>
+                <w:rFonts w:ascii="Courier New" w:cs="Courier New" w:eastAsia="Courier New" w:hAnsi="Courier New"/>
+                <w:color w:val="3A2E15"/>
+                <w:sz w:val="16"/>
+                <w:szCs w:val="16"/>
+              </w:rPr>
+              <w:t xml:space="preserve">a5a63952 fix(front): couleurs du mode clair pilotées par le thème (BUG-015)</w:t>
+            </w:r>
+          </w:p>
+          <w:p>
+            <w:pPr>
+              <w:spacing w:after="0" w:line="230"/>
+            </w:pPr>
+            <w:r>
+              <w:rPr>
+                <w:rFonts w:ascii="Courier New" w:cs="Courier New" w:eastAsia="Courier New" w:hAnsi="Courier New"/>
+                <w:color w:val="3A2E15"/>
+                <w:sz w:val="16"/>
+                <w:szCs w:val="16"/>
+              </w:rPr>
+              <w:t xml:space="preserve">710a6785 fix(front): clé i18n craft.settings.title (BUG-014)</w:t>
+            </w:r>
+          </w:p>
+        </w:tc>
+      </w:tr>
+    </w:tbl>
+    <w:p>
+      <w:pPr>
+        <w:spacing w:after="180" w:before="50"/>
+        <w:jc w:val="left"/>
+      </w:pPr>
+      <w:r>
+        <w:rPr>
+          <w:i/>
+          <w:iCs/>
+          <w:color w:val="5A4825"/>
+          <w:sz w:val="18"/>
+          <w:szCs w:val="18"/>
+        </w:rPr>
+        <w:t xml:space="preserve">git log --oneline (sélection) — chaque correctif du registre (§11.2) est traçable jusqu'à son commit.</w:t>
       </w:r>
     </w:p>
     <w:p>
@@ -18873,7 +22021,7 @@
           <w:sz w:val="22"/>
           <w:szCs w:val="22"/>
         </w:rPr>
-        <w:t xml:space="preserve">Bilan : 28 scénarios au référentiel (26 d'origine + SRV-01 et BAT-01 ajoutés en v3), tous conformes. Trois anomalies détectées lors de la recette initiale (BUG-011, BUG-012, BUG-013) et deux lors de la revue v3 du 14/07 (BUG-014, BUG-015) ont été consignées, corrigées et re-testées — voir le plan de correction ci-dessous.</w:t>
+        <w:t xml:space="preserve">Bilan : 28 scénarios au référentiel (26 d'origine + SRV-01 et BAT-01 ajoutés en v3), tous conformes. Trois anomalies détectées lors de la recette initiale (BUG-011, BUG-012, BUG-013) et trois lors des revues v3 des 14–15/07 (BUG-014, BUG-015, BUG-016) ont été consignées, corrigées et re-testées — voir le plan de correction ci-dessous.</w:t>
       </w:r>
     </w:p>
     <w:p>
@@ -21209,6 +24357,194 @@
             <w:tcBorders>
               <w:top w:val="none" w:color="FFFFFF" w:sz="0"/>
               <w:left w:val="none" w:color="FFFFFF" w:sz="0"/>
+              <w:bottom w:val="single" w:color="E0D5BB" w:sz="2"/>
+              <w:right w:val="none" w:color="FFFFFF" w:sz="0"/>
+            </w:tcBorders>
+            <w:tcMar>
+              <w:top w:type="dxa" w:w="70"/>
+              <w:left w:type="dxa" w:w="60"/>
+              <w:bottom w:type="dxa" w:w="70"/>
+              <w:right w:type="dxa" w:w="120"/>
+            </w:tcMar>
+          </w:tcPr>
+          <w:p>
+            <w:pPr>
+              <w:spacing w:after="0" w:line="264"/>
+            </w:pPr>
+            <w:r>
+              <w:rPr>
+                <w:b w:val="false"/>
+                <w:bCs w:val="false"/>
+                <w:sz w:val="16"/>
+                <w:szCs w:val="16"/>
+              </w:rPr>
+              <w:t xml:space="preserve">BUG-016</w:t>
+            </w:r>
+          </w:p>
+        </w:tc>
+        <w:tc>
+          <w:tcPr>
+            <w:tcW w:type="dxa" w:w="1140"/>
+            <w:tcBorders>
+              <w:top w:val="none" w:color="FFFFFF" w:sz="0"/>
+              <w:left w:val="none" w:color="FFFFFF" w:sz="0"/>
+              <w:bottom w:val="single" w:color="E0D5BB" w:sz="2"/>
+              <w:right w:val="none" w:color="FFFFFF" w:sz="0"/>
+            </w:tcBorders>
+            <w:tcMar>
+              <w:top w:type="dxa" w:w="70"/>
+              <w:left w:type="dxa" w:w="60"/>
+              <w:bottom w:type="dxa" w:w="70"/>
+              <w:right w:type="dxa" w:w="120"/>
+            </w:tcMar>
+          </w:tcPr>
+          <w:p>
+            <w:pPr>
+              <w:spacing w:after="0" w:line="264"/>
+            </w:pPr>
+            <w:r>
+              <w:rPr>
+                <w:b w:val="false"/>
+                <w:bCs w:val="false"/>
+                <w:sz w:val="16"/>
+                <w:szCs w:val="16"/>
+              </w:rPr>
+              <w:t xml:space="preserve">Revue RGPD (§7.2)</w:t>
+            </w:r>
+          </w:p>
+        </w:tc>
+        <w:tc>
+          <w:tcPr>
+            <w:tcW w:type="dxa" w:w="3110"/>
+            <w:tcBorders>
+              <w:top w:val="none" w:color="FFFFFF" w:sz="0"/>
+              <w:left w:val="none" w:color="FFFFFF" w:sz="0"/>
+              <w:bottom w:val="single" w:color="E0D5BB" w:sz="2"/>
+              <w:right w:val="none" w:color="FFFFFF" w:sz="0"/>
+            </w:tcBorders>
+            <w:tcMar>
+              <w:top w:type="dxa" w:w="70"/>
+              <w:left w:type="dxa" w:w="60"/>
+              <w:bottom w:type="dxa" w:w="70"/>
+              <w:right w:type="dxa" w:w="120"/>
+            </w:tcMar>
+          </w:tcPr>
+          <w:p>
+            <w:pPr>
+              <w:spacing w:after="0" w:line="264"/>
+            </w:pPr>
+            <w:r>
+              <w:rPr>
+                <w:b w:val="false"/>
+                <w:bCs w:val="false"/>
+                <w:sz w:val="16"/>
+                <w:szCs w:val="16"/>
+              </w:rPr>
+              <w:t xml:space="preserve">La suppression d'un compte échouait (violation de clé étrangère) si l'utilisateur possédait des routes : contrainte sans ON DELETE CASCADE</w:t>
+            </w:r>
+          </w:p>
+        </w:tc>
+        <w:tc>
+          <w:tcPr>
+            <w:tcW w:type="dxa" w:w="778"/>
+            <w:tcBorders>
+              <w:top w:val="none" w:color="FFFFFF" w:sz="0"/>
+              <w:left w:val="none" w:color="FFFFFF" w:sz="0"/>
+              <w:bottom w:val="single" w:color="E0D5BB" w:sz="2"/>
+              <w:right w:val="none" w:color="FFFFFF" w:sz="0"/>
+            </w:tcBorders>
+            <w:tcMar>
+              <w:top w:type="dxa" w:w="70"/>
+              <w:left w:type="dxa" w:w="60"/>
+              <w:bottom w:type="dxa" w:w="70"/>
+              <w:right w:type="dxa" w:w="120"/>
+            </w:tcMar>
+          </w:tcPr>
+          <w:p>
+            <w:pPr>
+              <w:spacing w:after="0" w:line="264"/>
+            </w:pPr>
+            <w:r>
+              <w:rPr>
+                <w:b w:val="false"/>
+                <w:bCs w:val="false"/>
+                <w:sz w:val="16"/>
+                <w:szCs w:val="16"/>
+              </w:rPr>
+              <w:t xml:space="preserve">Majeure</w:t>
+            </w:r>
+          </w:p>
+        </w:tc>
+        <w:tc>
+          <w:tcPr>
+            <w:tcW w:type="dxa" w:w="2333"/>
+            <w:tcBorders>
+              <w:top w:val="none" w:color="FFFFFF" w:sz="0"/>
+              <w:left w:val="none" w:color="FFFFFF" w:sz="0"/>
+              <w:bottom w:val="single" w:color="E0D5BB" w:sz="2"/>
+              <w:right w:val="none" w:color="FFFFFF" w:sz="0"/>
+            </w:tcBorders>
+            <w:tcMar>
+              <w:top w:type="dxa" w:w="70"/>
+              <w:left w:type="dxa" w:w="60"/>
+              <w:bottom w:type="dxa" w:w="70"/>
+              <w:right w:type="dxa" w:w="120"/>
+            </w:tcMar>
+          </w:tcPr>
+          <w:p>
+            <w:pPr>
+              <w:spacing w:after="0" w:line="264"/>
+            </w:pPr>
+            <w:r>
+              <w:rPr>
+                <w:b w:val="false"/>
+                <w:bCs w:val="false"/>
+                <w:sz w:val="16"/>
+                <w:szCs w:val="16"/>
+              </w:rPr>
+              <w:t xml:space="preserve">Contrainte game_route.user_id alignée sur composition (CASCADE) via migration ; cascade vérifiée en base</w:t>
+            </w:r>
+          </w:p>
+        </w:tc>
+        <w:tc>
+          <w:tcPr>
+            <w:tcW w:type="dxa" w:w="933"/>
+            <w:tcBorders>
+              <w:top w:val="none" w:color="FFFFFF" w:sz="0"/>
+              <w:left w:val="none" w:color="FFFFFF" w:sz="0"/>
+              <w:bottom w:val="single" w:color="E0D5BB" w:sz="2"/>
+              <w:right w:val="none" w:color="FFFFFF" w:sz="0"/>
+            </w:tcBorders>
+            <w:tcMar>
+              <w:top w:type="dxa" w:w="70"/>
+              <w:left w:type="dxa" w:w="60"/>
+              <w:bottom w:type="dxa" w:w="70"/>
+              <w:right w:type="dxa" w:w="120"/>
+            </w:tcMar>
+          </w:tcPr>
+          <w:p>
+            <w:pPr>
+              <w:spacing w:after="0" w:line="264"/>
+            </w:pPr>
+            <w:r>
+              <w:rPr>
+                <w:b w:val="false"/>
+                <w:bCs w:val="false"/>
+                <w:sz w:val="16"/>
+                <w:szCs w:val="16"/>
+              </w:rPr>
+              <w:t xml:space="preserve">Résolu (15/07)</w:t>
+            </w:r>
+          </w:p>
+        </w:tc>
+      </w:tr>
+      <w:tr>
+        <w:tc>
+          <w:tcPr>
+            <w:tcW w:type="dxa" w:w="778"/>
+            <w:tcBorders>
+              <w:top w:val="none" w:color="FFFFFF" w:sz="0"/>
+              <w:left w:val="none" w:color="FFFFFF" w:sz="0"/>
               <w:bottom w:val="single" w:color="8B6914" w:sz="10"/>
               <w:right w:val="none" w:color="FFFFFF" w:sz="0"/>
             </w:tcBorders>
@@ -21405,7 +24741,7 @@
           <w:sz w:val="22"/>
           <w:szCs w:val="22"/>
         </w:rPr>
-        <w:t xml:space="preserve">Le registre complet (BUG-001 à BUG-015) est tenu dans le CHANGELOG du dépôt ; chaque correctif est associé à son commit conventionnel et validé par les 126 tests du pipeline avant fusion.</w:t>
+        <w:t xml:space="preserve">Le registre complet (BUG-001 à BUG-016) est tenu dans le CHANGELOG du dépôt ; chaque correctif est associé à son commit conventionnel et validé par les 126 tests du pipeline avant fusion.</w:t>
       </w:r>
     </w:p>
     <w:p>
@@ -23663,6 +26999,373 @@
     </w:tbl>
     <w:p>
       <w:pPr>
+        <w:pStyle w:val="Heading2"/>
+      </w:pPr>
+      <w:r>
+        <w:t xml:space="preserve">12.4 Sauvegarde et restauration des données</w:t>
+      </w:r>
+    </w:p>
+    <w:p>
+      <w:pPr>
+        <w:spacing w:after="140" w:before="0" w:line="330"/>
+        <w:jc w:val="both"/>
+      </w:pPr>
+      <w:r>
+        <w:rPr>
+          <w:b w:val="false"/>
+          <w:bCs w:val="false"/>
+          <w:i w:val="false"/>
+          <w:iCs w:val="false"/>
+          <w:sz w:val="22"/>
+          <w:szCs w:val="22"/>
+        </w:rPr>
+        <w:t xml:space="preserve">Les seules données à sauvegarder sont celles de PostgreSQL : le code, la configuration et les items du jeu sont reconstructibles (dépôt git, synchronisation depuis l'API officielle). Le périmètre critique se limite donc aux comptes, routes et compositions.</w:t>
+      </w:r>
+    </w:p>
+    <w:tbl>
+      <w:tblPr>
+        <w:tblW w:type="dxa" w:w="9072"/>
+        <w:tblBorders>
+          <w:top w:val="single" w:color="auto" w:sz="4"/>
+          <w:left w:val="single" w:color="auto" w:sz="4"/>
+          <w:bottom w:val="single" w:color="auto" w:sz="4"/>
+          <w:right w:val="single" w:color="auto" w:sz="4"/>
+          <w:insideH w:val="single" w:color="auto" w:sz="4"/>
+          <w:insideV w:val="single" w:color="auto" w:sz="4"/>
+        </w:tblBorders>
+      </w:tblPr>
+      <w:tblGrid>
+        <w:gridCol w:w="1701"/>
+        <w:gridCol w:w="7371"/>
+      </w:tblGrid>
+      <w:tr>
+        <w:trPr>
+          <w:tblHeader/>
+        </w:trPr>
+        <w:tc>
+          <w:tcPr>
+            <w:tcW w:type="dxa" w:w="1701"/>
+            <w:tcBorders>
+              <w:top w:val="single" w:color="8B6914" w:sz="10"/>
+              <w:left w:val="none" w:color="FFFFFF" w:sz="0"/>
+              <w:bottom w:val="single" w:color="8B6914" w:sz="5"/>
+              <w:right w:val="none" w:color="FFFFFF" w:sz="0"/>
+            </w:tcBorders>
+            <w:tcMar>
+              <w:top w:type="dxa" w:w="70"/>
+              <w:left w:type="dxa" w:w="60"/>
+              <w:bottom w:type="dxa" w:w="70"/>
+              <w:right w:type="dxa" w:w="120"/>
+            </w:tcMar>
+          </w:tcPr>
+          <w:p>
+            <w:pPr>
+              <w:spacing w:after="0" w:line="264"/>
+            </w:pPr>
+            <w:r>
+              <w:rPr>
+                <w:b/>
+                <w:bCs/>
+                <w:color w:val="2D1A00"/>
+                <w:sz w:val="19"/>
+                <w:szCs w:val="19"/>
+              </w:rPr>
+              <w:t xml:space="preserve">Opération</w:t>
+            </w:r>
+          </w:p>
+        </w:tc>
+        <w:tc>
+          <w:tcPr>
+            <w:tcW w:type="dxa" w:w="7371"/>
+            <w:tcBorders>
+              <w:top w:val="single" w:color="8B6914" w:sz="10"/>
+              <w:left w:val="none" w:color="FFFFFF" w:sz="0"/>
+              <w:bottom w:val="single" w:color="8B6914" w:sz="5"/>
+              <w:right w:val="none" w:color="FFFFFF" w:sz="0"/>
+            </w:tcBorders>
+            <w:tcMar>
+              <w:top w:type="dxa" w:w="70"/>
+              <w:left w:type="dxa" w:w="60"/>
+              <w:bottom w:type="dxa" w:w="70"/>
+              <w:right w:type="dxa" w:w="120"/>
+            </w:tcMar>
+          </w:tcPr>
+          <w:p>
+            <w:pPr>
+              <w:spacing w:after="0" w:line="264"/>
+            </w:pPr>
+            <w:r>
+              <w:rPr>
+                <w:b/>
+                <w:bCs/>
+                <w:color w:val="2D1A00"/>
+                <w:sz w:val="19"/>
+                <w:szCs w:val="19"/>
+              </w:rPr>
+              <w:t xml:space="preserve">Procédure</w:t>
+            </w:r>
+          </w:p>
+        </w:tc>
+      </w:tr>
+      <w:tr>
+        <w:tc>
+          <w:tcPr>
+            <w:tcW w:type="dxa" w:w="1701"/>
+            <w:tcBorders>
+              <w:top w:val="none" w:color="FFFFFF" w:sz="0"/>
+              <w:left w:val="none" w:color="FFFFFF" w:sz="0"/>
+              <w:bottom w:val="single" w:color="E0D5BB" w:sz="2"/>
+              <w:right w:val="none" w:color="FFFFFF" w:sz="0"/>
+            </w:tcBorders>
+            <w:tcMar>
+              <w:top w:type="dxa" w:w="70"/>
+              <w:left w:type="dxa" w:w="60"/>
+              <w:bottom w:type="dxa" w:w="70"/>
+              <w:right w:type="dxa" w:w="120"/>
+            </w:tcMar>
+          </w:tcPr>
+          <w:p>
+            <w:pPr>
+              <w:spacing w:after="0" w:line="264"/>
+            </w:pPr>
+            <w:r>
+              <w:rPr>
+                <w:b w:val="false"/>
+                <w:bCs w:val="false"/>
+                <w:sz w:val="19"/>
+                <w:szCs w:val="19"/>
+              </w:rPr>
+              <w:t xml:space="preserve">Sauvegarde</w:t>
+            </w:r>
+          </w:p>
+        </w:tc>
+        <w:tc>
+          <w:tcPr>
+            <w:tcW w:type="dxa" w:w="7371"/>
+            <w:tcBorders>
+              <w:top w:val="none" w:color="FFFFFF" w:sz="0"/>
+              <w:left w:val="none" w:color="FFFFFF" w:sz="0"/>
+              <w:bottom w:val="single" w:color="E0D5BB" w:sz="2"/>
+              <w:right w:val="none" w:color="FFFFFF" w:sz="0"/>
+            </w:tcBorders>
+            <w:tcMar>
+              <w:top w:type="dxa" w:w="70"/>
+              <w:left w:type="dxa" w:w="60"/>
+              <w:bottom w:type="dxa" w:w="70"/>
+              <w:right w:type="dxa" w:w="120"/>
+            </w:tcMar>
+          </w:tcPr>
+          <w:p>
+            <w:pPr>
+              <w:spacing w:after="0" w:line="264"/>
+            </w:pPr>
+            <w:r>
+              <w:rPr>
+                <w:b w:val="false"/>
+                <w:bCs w:val="false"/>
+                <w:sz w:val="19"/>
+                <w:szCs w:val="19"/>
+              </w:rPr>
+              <w:t xml:space="preserve">pg_dump quotidien (cron sur le VPS) : pg_dump -Fc app &gt; backup_$(date +%F).dump — rotation sur 14 jours</w:t>
+            </w:r>
+          </w:p>
+        </w:tc>
+      </w:tr>
+      <w:tr>
+        <w:tc>
+          <w:tcPr>
+            <w:tcW w:type="dxa" w:w="1701"/>
+            <w:tcBorders>
+              <w:top w:val="none" w:color="FFFFFF" w:sz="0"/>
+              <w:left w:val="none" w:color="FFFFFF" w:sz="0"/>
+              <w:bottom w:val="single" w:color="E0D5BB" w:sz="2"/>
+              <w:right w:val="none" w:color="FFFFFF" w:sz="0"/>
+            </w:tcBorders>
+            <w:tcMar>
+              <w:top w:type="dxa" w:w="70"/>
+              <w:left w:type="dxa" w:w="60"/>
+              <w:bottom w:type="dxa" w:w="70"/>
+              <w:right w:type="dxa" w:w="120"/>
+            </w:tcMar>
+          </w:tcPr>
+          <w:p>
+            <w:pPr>
+              <w:spacing w:after="0" w:line="264"/>
+            </w:pPr>
+            <w:r>
+              <w:rPr>
+                <w:b w:val="false"/>
+                <w:bCs w:val="false"/>
+                <w:sz w:val="19"/>
+                <w:szCs w:val="19"/>
+              </w:rPr>
+              <w:t xml:space="preserve">Restauration</w:t>
+            </w:r>
+          </w:p>
+        </w:tc>
+        <w:tc>
+          <w:tcPr>
+            <w:tcW w:type="dxa" w:w="7371"/>
+            <w:tcBorders>
+              <w:top w:val="none" w:color="FFFFFF" w:sz="0"/>
+              <w:left w:val="none" w:color="FFFFFF" w:sz="0"/>
+              <w:bottom w:val="single" w:color="E0D5BB" w:sz="2"/>
+              <w:right w:val="none" w:color="FFFFFF" w:sz="0"/>
+            </w:tcBorders>
+            <w:tcMar>
+              <w:top w:type="dxa" w:w="70"/>
+              <w:left w:type="dxa" w:w="60"/>
+              <w:bottom w:type="dxa" w:w="70"/>
+              <w:right w:type="dxa" w:w="120"/>
+            </w:tcMar>
+          </w:tcPr>
+          <w:p>
+            <w:pPr>
+              <w:spacing w:after="0" w:line="264"/>
+            </w:pPr>
+            <w:r>
+              <w:rPr>
+                <w:b w:val="false"/>
+                <w:bCs w:val="false"/>
+                <w:sz w:val="19"/>
+                <w:szCs w:val="19"/>
+              </w:rPr>
+              <w:t xml:space="preserve">pg_restore -d app --clean backup_YYYY-MM-DD.dump puis doctrine:migrations:migrate pour rattraper les migrations postérieures</w:t>
+            </w:r>
+          </w:p>
+        </w:tc>
+      </w:tr>
+      <w:tr>
+        <w:tc>
+          <w:tcPr>
+            <w:tcW w:type="dxa" w:w="1701"/>
+            <w:tcBorders>
+              <w:top w:val="none" w:color="FFFFFF" w:sz="0"/>
+              <w:left w:val="none" w:color="FFFFFF" w:sz="0"/>
+              <w:bottom w:val="single" w:color="E0D5BB" w:sz="2"/>
+              <w:right w:val="none" w:color="FFFFFF" w:sz="0"/>
+            </w:tcBorders>
+            <w:tcMar>
+              <w:top w:type="dxa" w:w="70"/>
+              <w:left w:type="dxa" w:w="60"/>
+              <w:bottom w:type="dxa" w:w="70"/>
+              <w:right w:type="dxa" w:w="120"/>
+            </w:tcMar>
+          </w:tcPr>
+          <w:p>
+            <w:pPr>
+              <w:spacing w:after="0" w:line="264"/>
+            </w:pPr>
+            <w:r>
+              <w:rPr>
+                <w:b w:val="false"/>
+                <w:bCs w:val="false"/>
+                <w:sz w:val="19"/>
+                <w:szCs w:val="19"/>
+              </w:rPr>
+              <w:t xml:space="preserve">Test de restauration</w:t>
+            </w:r>
+          </w:p>
+        </w:tc>
+        <w:tc>
+          <w:tcPr>
+            <w:tcW w:type="dxa" w:w="7371"/>
+            <w:tcBorders>
+              <w:top w:val="none" w:color="FFFFFF" w:sz="0"/>
+              <w:left w:val="none" w:color="FFFFFF" w:sz="0"/>
+              <w:bottom w:val="single" w:color="E0D5BB" w:sz="2"/>
+              <w:right w:val="none" w:color="FFFFFF" w:sz="0"/>
+            </w:tcBorders>
+            <w:tcMar>
+              <w:top w:type="dxa" w:w="70"/>
+              <w:left w:type="dxa" w:w="60"/>
+              <w:bottom w:type="dxa" w:w="70"/>
+              <w:right w:type="dxa" w:w="120"/>
+            </w:tcMar>
+          </w:tcPr>
+          <w:p>
+            <w:pPr>
+              <w:spacing w:after="0" w:line="264"/>
+            </w:pPr>
+            <w:r>
+              <w:rPr>
+                <w:b w:val="false"/>
+                <w:bCs w:val="false"/>
+                <w:sz w:val="19"/>
+                <w:szCs w:val="19"/>
+              </w:rPr>
+              <w:t xml:space="preserve">Rejouer le dump sur la base de développement locale (docker compose) : même moteur, même version PostgreSQL 16</w:t>
+            </w:r>
+          </w:p>
+        </w:tc>
+      </w:tr>
+      <w:tr>
+        <w:tc>
+          <w:tcPr>
+            <w:tcW w:type="dxa" w:w="1701"/>
+            <w:tcBorders>
+              <w:top w:val="none" w:color="FFFFFF" w:sz="0"/>
+              <w:left w:val="none" w:color="FFFFFF" w:sz="0"/>
+              <w:bottom w:val="single" w:color="8B6914" w:sz="10"/>
+              <w:right w:val="none" w:color="FFFFFF" w:sz="0"/>
+            </w:tcBorders>
+            <w:tcMar>
+              <w:top w:type="dxa" w:w="70"/>
+              <w:left w:type="dxa" w:w="60"/>
+              <w:bottom w:type="dxa" w:w="70"/>
+              <w:right w:type="dxa" w:w="120"/>
+            </w:tcMar>
+          </w:tcPr>
+          <w:p>
+            <w:pPr>
+              <w:spacing w:after="0" w:line="264"/>
+            </w:pPr>
+            <w:r>
+              <w:rPr>
+                <w:b w:val="false"/>
+                <w:bCs w:val="false"/>
+                <w:sz w:val="19"/>
+                <w:szCs w:val="19"/>
+              </w:rPr>
+              <w:t xml:space="preserve">Reconstruction des données de jeu</w:t>
+            </w:r>
+          </w:p>
+        </w:tc>
+        <w:tc>
+          <w:tcPr>
+            <w:tcW w:type="dxa" w:w="7371"/>
+            <w:tcBorders>
+              <w:top w:val="none" w:color="FFFFFF" w:sz="0"/>
+              <w:left w:val="none" w:color="FFFFFF" w:sz="0"/>
+              <w:bottom w:val="single" w:color="8B6914" w:sz="10"/>
+              <w:right w:val="none" w:color="FFFFFF" w:sz="0"/>
+            </w:tcBorders>
+            <w:tcMar>
+              <w:top w:type="dxa" w:w="70"/>
+              <w:left w:type="dxa" w:w="60"/>
+              <w:bottom w:type="dxa" w:w="70"/>
+              <w:right w:type="dxa" w:w="120"/>
+            </w:tcMar>
+          </w:tcPr>
+          <w:p>
+            <w:pPr>
+              <w:spacing w:after="0" w:line="264"/>
+            </w:pPr>
+            <w:r>
+              <w:rPr>
+                <w:b w:val="false"/>
+                <w:bCs w:val="false"/>
+                <w:sz w:val="19"/>
+                <w:szCs w:val="19"/>
+              </w:rPr>
+              <w:t xml:space="preserve">Synchronisation des 12 066 items depuis l'administration ; prix de marché re-remplis à l'usage (cache)</w:t>
+            </w:r>
+          </w:p>
+        </w:tc>
+      </w:tr>
+    </w:tbl>
+    <w:p>
+      <w:pPr>
         <w:pStyle w:val="Heading1"/>
       </w:pPr>
       <w:r>
@@ -23683,7 +27386,7 @@
           <w:sz w:val="22"/>
           <w:szCs w:val="22"/>
         </w:rPr>
-        <w:t xml:space="preserve">Ce dossier couvre l'ensemble des livrables attendus pour le Bloc 2 : un prototype complet et fonctionnel (version 3.0.0 : multi-serveur, batailles, statistiques de session, 20 langues) adossé à une architecture en couches maintenable qui a absorbé trois versions majeures sans refonte ; des protocoles d'intégration et de déploiement continus réellement opérationnels (126 tests bloquants, déploiement SSH conditionné, supervision auto-installée) ; un harnais de tests couvrant l'authentification de bout en bout ; des mesures de sécurité alignées sur l'OWASP Top 10 et vérifiées par des tests structurels ; une démarche d'accessibilité outillée (RGAA 4.1, Lighthouse 93-100, axe-core) avec corrections immédiates ; un cahier de recettes de 28 scénarios exécutés à 100 % qui a prouvé son utilité en détectant cinq anomalies réelles, corrigées et re-testées ; et une documentation technique permettant à un tiers de déployer, utiliser et maintenir l'application en autonomie.</w:t>
+        <w:t xml:space="preserve">Ce dossier couvre l'ensemble des livrables attendus pour le Bloc 2 : un prototype complet et fonctionnel (version 3.0.0 : multi-serveur, batailles, statistiques de session, 20 langues) adossé à une architecture en couches maintenable qui a absorbé trois versions majeures sans refonte ; des protocoles d'intégration et de déploiement continus réellement opérationnels (126 tests bloquants, déploiement SSH conditionné, supervision auto-installée) ; un harnais de tests couvrant l'authentification de bout en bout ; des mesures de sécurité alignées sur l'OWASP Top 10 et vérifiées par des tests structurels ; une démarche d'accessibilité outillée (RGAA 4.1, Lighthouse 93-100, axe-core) avec corrections immédiates ; un cahier de recettes de 28 scénarios exécutés à 100 % qui a prouvé son utilité en détectant six anomalies réelles, corrigées et re-testées ; et une documentation technique permettant à un tiers de déployer, utiliser et maintenir l'application en autonomie.</w:t>
       </w:r>
     </w:p>
     <w:p>
@@ -24983,7 +28686,7 @@
                 <wp:inline distT="0" distB="0" distL="0" distR="0">
                   <wp:extent cx="5334000" cy="3333750"/>
                   <wp:effectExtent t="0" r="0" b="0" l="0"/>
-                  <wp:docPr id="1" name="figure-13" descr="Détail d'un run vert : jobs backend-tests et frontend-tests exécutés en parallèle sur le commit poussé" title="Détail d'un run vert : jobs backend-tests et frontend-tests exécutés en parallèle sur le commit poussé"/>
+                  <wp:docPr id="1" name="figure-15" descr="Détail d'un run vert : jobs backend-tests et frontend-tests exécutés en parallèle sur le commit poussé" title="Détail d'un run vert : jobs backend-tests et frontend-tests exécutés en parallèle sur le commit poussé"/>
                   <wp:cNvGraphicFramePr>
                     <a:graphicFrameLocks xmlns:a="http://schemas.openxmlformats.org/drawingml/2006/main" noChangeAspect="1"/>
                   </wp:cNvGraphicFramePr>
@@ -24997,7 +28700,7 @@
                           </pic:cNvPicPr>
                         </pic:nvPicPr>
                         <pic:blipFill>
-                          <a:blip r:embed="rId24" cstate="none"/>
+                          <a:blip r:embed="rId26" cstate="none"/>
                           <a:srcRect/>
                           <a:stretch>
                             <a:fillRect/>
@@ -25035,7 +28738,7 @@
           <w:sz w:val="18"/>
           <w:szCs w:val="18"/>
         </w:rPr>
-        <w:t xml:space="preserve">Figure 13 — Détail d'un run vert : jobs backend-tests et frontend-tests exécutés en parallèle sur le commit poussé</w:t>
+        <w:t xml:space="preserve">Figure 15 — Détail d'un run vert : jobs backend-tests et frontend-tests exécutés en parallèle sur le commit poussé</w:t>
       </w:r>
     </w:p>
     <w:tbl>
@@ -25080,7 +28783,7 @@
                 <wp:inline distT="0" distB="0" distL="0" distR="0">
                   <wp:extent cx="5334000" cy="3333750"/>
                   <wp:effectExtent t="0" r="0" b="0" l="0"/>
-                  <wp:docPr id="1" name="figure-14" descr="Historique des runs. Le run rouge sur master est un garde-fou volontaire : sans les secrets SSH configurés, le job de déploiement refuse de s'exécuter — aucun identifiant n'existe dans le code" title="Historique des runs. Le run rouge sur master est un garde-fou volontaire : sans les secrets SSH configurés, le job de déploiement refuse de s'exécuter — aucun identifiant n'existe dans le code"/>
+                  <wp:docPr id="1" name="figure-16" descr="Historique des runs. Le run rouge sur master est un garde-fou volontaire : sans les secrets SSH configurés, le job de déploiement refuse de s'exécuter — aucun identifiant n'existe dans le code" title="Historique des runs. Le run rouge sur master est un garde-fou volontaire : sans les secrets SSH configurés, le job de déploiement refuse de s'exécuter — aucun identifiant n'existe dans le code"/>
                   <wp:cNvGraphicFramePr>
                     <a:graphicFrameLocks xmlns:a="http://schemas.openxmlformats.org/drawingml/2006/main" noChangeAspect="1"/>
                   </wp:cNvGraphicFramePr>
@@ -25094,7 +28797,7 @@
                           </pic:cNvPicPr>
                         </pic:nvPicPr>
                         <pic:blipFill>
-                          <a:blip r:embed="rId25" cstate="none"/>
+                          <a:blip r:embed="rId27" cstate="none"/>
                           <a:srcRect/>
                           <a:stretch>
                             <a:fillRect/>
@@ -25132,7 +28835,7 @@
           <w:sz w:val="18"/>
           <w:szCs w:val="18"/>
         </w:rPr>
-        <w:t xml:space="preserve">Figure 14 — Historique des runs. Le run rouge sur master est un garde-fou volontaire : sans les secrets SSH configurés, le job de déploiement refuse de s'exécuter — aucun identifiant n'existe dans le code</w:t>
+        <w:t xml:space="preserve">Figure 16 — Historique des runs. Le run rouge sur master est un garde-fou volontaire : sans les secrets SSH configurés, le job de déploiement refuse de s'exécuter — aucun identifiant n'existe dans le code</w:t>
       </w:r>
     </w:p>
     <w:p>
@@ -26191,6 +29894,18 @@
       </w:pPr>
     </w:lvl>
   </w:abstractNum>
+  <w:abstractNum w:abstractNumId="3" w15:restartNumberingAfterBreak="0">
+    <w:multiLevelType w:val="hybridMultilevel"/>
+    <w:lvl w:ilvl="0" w15:tentative="1">
+      <w:start w:val="1"/>
+      <w:numFmt w:val="decimal"/>
+      <w:lvlText w:val="%1."/>
+      <w:lvlJc w:val="left"/>
+      <w:pPr>
+        <w:ind w:left="460" w:hanging="260"/>
+      </w:pPr>
+    </w:lvl>
+  </w:abstractNum>
   <w:num w:numId="1">
     <w:abstractNumId w:val="1"/>
     <w:lvlOverride w:ilvl="0">
@@ -26198,6 +29913,12 @@
     </w:lvlOverride>
   </w:num>
   <w:num w:numId="2">
+    <w:abstractNumId w:val="3"/>
+    <w:lvlOverride w:ilvl="0">
+      <w:startOverride w:val="1"/>
+    </w:lvlOverride>
+  </w:num>
+  <w:num w:numId="3">
     <w:abstractNumId w:val="2"/>
     <w:lvlOverride w:ilvl="0">
       <w:startOverride w:val="1"/>

</xml_diff>

<commit_message>
docs(rncp): dossier §7 — chaque faille OWASP localisée dans le code
Les 10 lignes A01→A10 citent désormais les fichiers concrets (security.yaml,
SecurityHeadersSubscriber, rate_limiter, lockfiles, monolog, ItemController…)
avec renvois vers les annexes A.1–A.3. Toujours 29 pages / 30.

Co-Authored-By: Claude Fable 5 <noreply@anthropic.com>
</commit_message>
<xml_diff>
--- a/dossier/Dossier_Bloc2_Albion_Helper_v3.docx
+++ b/dossier/Dossier_Bloc2_Albion_Helper_v3.docx
@@ -12611,7 +12611,7 @@
           <w:sz w:val="22"/>
           <w:szCs w:val="22"/>
         </w:rPr>
-        <w:t xml:space="preserve">La sécurité a été traitée au travers du référentiel OWASP Top 10 (2021). Chaque famille de failles est couverte par une mesure concrète, vérifiée soit par les tests automatisés, soit par la recette de sécurité (cf. §10, scénarios SEC-*).</w:t>
+        <w:t xml:space="preserve">La sécurité a été traitée au travers du référentiel OWASP Top 10 (2021). Chaque famille de failles est couverte par une mesure concrète, localisée dans le code (fichier indiqué en fin de mesure) et vérifiée soit par les tests automatisés, soit par la recette de sécurité (cf. §10, scénarios SEC-*).</w:t>
       </w:r>
     </w:p>
     <w:tbl>
@@ -12855,7 +12855,7 @@
                 <w:sz w:val="16"/>
                 <w:szCs w:val="16"/>
               </w:rPr>
-              <w:t xml:space="preserve">Firewall Symfony : toutes les routes /api exigent un JWT sauf liste publique explicite ; /api/admin restreint à ROLE_ADMIN ; contrôle de propriété sur routes et compositions (un utilisateur ne peut ni voir ni supprimer celles d'un autre)</w:t>
+              <w:t xml:space="preserve">Firewall Symfony : toutes les routes /api exigent un JWT sauf liste publique explicite ; /api/admin restreint à ROLE_ADMIN ; contrôle de propriété sur routes et compositions (un utilisateur ne peut ni voir ni supprimer celles d'un autre) — security.yaml (access_control, annexe A.3) ; RouteController / CompositionController (filtrage par getUser())</w:t>
             </w:r>
           </w:p>
         </w:tc>
@@ -12981,7 +12981,7 @@
                 <w:sz w:val="16"/>
                 <w:szCs w:val="16"/>
               </w:rPr>
-              <w:t xml:space="preserve">Mots de passe hachés bcrypt (coût auto) ; JWT signés RS256 (paire de clés hors dépôt git) ; jetons délivrés en cookies httpOnly + Secure ; HTTPS en production ; aucun secret commité (variables d'environnement)</w:t>
+              <w:t xml:space="preserve">Mots de passe hachés bcrypt (coût auto) ; JWT signés RS256 (paire de clés hors dépôt git) ; jetons délivrés en cookies httpOnly + Secure ; HTTPS en production ; aucun secret commité — security.yaml (password_hashers) ; lexik_jwt_authentication.yaml (set_cookies) ; .gitignore (*.pem)</w:t>
             </w:r>
           </w:p>
         </w:tc>
@@ -13107,7 +13107,7 @@
                 <w:sz w:val="16"/>
                 <w:szCs w:val="16"/>
               </w:rPr>
-              <w:t xml:space="preserve">100 % des accès BDD via Doctrine ORM (requêtes paramétrées) ; entrées validées et bornées (regex sur les noms d'items, substr, min/max)</w:t>
+              <w:t xml:space="preserve">100 % des accès BDD via Doctrine ORM (requêtes paramétrées) ; entrées validées et bornées (regex, substr, min/max) — src/Repository/* ; ItemController (validation par expression régulière)</w:t>
             </w:r>
           </w:p>
         </w:tc>
@@ -13233,7 +13233,7 @@
                 <w:sz w:val="16"/>
                 <w:szCs w:val="16"/>
               </w:rPr>
-              <w:t xml:space="preserve">Rate limiting : 5 inscriptions/IP/heure (composant RateLimiter) ; expiration automatique des routes à 24 h ; jetons de partage non devinables</w:t>
+              <w:t xml:space="preserve">Rate limiting : 5 inscriptions/IP/heure ; expiration automatique des routes à 24 h ; jetons de partage imprévisibles — rate_limiter.yaml + AuthController (limiteur) ; GameRoute / Composition (bin2hex(random_bytes()))</w:t>
             </w:r>
           </w:p>
         </w:tc>
@@ -13359,7 +13359,7 @@
                 <w:sz w:val="16"/>
                 <w:szCs w:val="16"/>
               </w:rPr>
-              <w:t xml:space="preserve">CORS restreint par variable d'environnement (origin_regex, aucun wildcard) ; en-têtes de sécurité globaux : X-Content-Type-Options, X-Frame-Options DENY, Referrer-Policy, Content-Security-Policy ; pas de stack trace en prod</w:t>
+              <w:t xml:space="preserve">CORS restreint par variable d'environnement (origin_regex, aucun wildcard — y compris avec credentials) ; en-têtes de sécurité globaux : nosniff, X-Frame-Options DENY, Referrer-Policy, CSP ; pas de stack trace en prod — nelmio_cors.yaml ; SecurityHeadersSubscriber (annexe A.1)</w:t>
             </w:r>
           </w:p>
         </w:tc>
@@ -13485,7 +13485,7 @@
                 <w:sz w:val="16"/>
                 <w:szCs w:val="16"/>
               </w:rPr>
-              <w:t xml:space="preserve">Migration Symfony 7.2 (EOL) → 7.4.13 LTS : 36 advisories corrigées dont CVE-2025-64500 (élevée, contournement d'autorisation) ; axios 1.17 ; composer audit : 0 advisory ; Dependabot hebdomadaire</w:t>
+              <w:t xml:space="preserve">Migration Symfony 7.2 (EOL) → 7.4.13 LTS : 36 advisories corrigées dont CVE-2025-64500 (élevée) ; axios 1.17 ; composer audit : 0 advisory ; Dependabot hebdomadaire — composer.lock / package-lock.json ; .github/dependabot.yml</w:t>
             </w:r>
           </w:p>
         </w:tc>
@@ -13611,7 +13611,7 @@
                 <w:sz w:val="16"/>
                 <w:szCs w:val="16"/>
               </w:rPr>
-              <w:t xml:space="preserve">Login throttling : 5 échecs max / 15 min (par utilisateur + IP) ; mot de passe ≥ 8 caractères ; JWT à durée courte (1 h) en cookie httpOnly ; rotation des refresh tokens (single_use) ; déconnexion côté serveur (/api/logout invalide le refresh token)</w:t>
+              <w:t xml:space="preserve">Login throttling : 5 échecs max / 15 min ; mot de passe ≥ 8 caractères ; JWT à durée courte (1 h) en cookie httpOnly ; rotation des refresh tokens (single_use) ; déconnexion côté serveur — security.yaml (login_throttling) ; gesdinet_jwt_refresh_token.yaml ; AuthController (register, /api/logout)</w:t>
             </w:r>
           </w:p>
         </w:tc>
@@ -13737,7 +13737,7 @@
                 <w:sz w:val="16"/>
                 <w:szCs w:val="16"/>
               </w:rPr>
-              <w:t xml:space="preserve">Dépendances installées depuis les lockfiles (composer.lock, package-lock.json) ; pipeline CI signé par GitHub ; migrations versionnées</w:t>
+              <w:t xml:space="preserve">Dépendances installées depuis les lockfiles ; pipeline CI exécuté par GitHub Actions ; schéma BDD versionné (jamais de SQL manuel en production) — composer.lock / package-lock.json ; migrations/ ; .github/workflows/main.yml</w:t>
             </w:r>
           </w:p>
         </w:tc>
@@ -13863,7 +13863,7 @@
                 <w:sz w:val="16"/>
                 <w:szCs w:val="16"/>
               </w:rPr>
-              <w:t xml:space="preserve">Canal Monolog « incident » dédié (dev + prod) ; les échecs d'authentification sont tracés par le firewall ; aucun secret ni mot de passe en clair dans les logs</w:t>
+              <w:t xml:space="preserve">Canal Monolog « incident » dédié (dev + prod) ; échecs d'authentification tracés par le firewall ; aucun secret en clair dans les logs ; endpoint de supervision public — monolog.yaml ; HealthCheckController (annexe A.2) ; deploy/healthcheck-probe.sh</w:t>
             </w:r>
           </w:p>
         </w:tc>
@@ -13989,7 +13989,7 @@
                 <w:sz w:val="16"/>
                 <w:szCs w:val="16"/>
               </w:rPr>
-              <w:t xml:space="preserve">Le proxy d'icônes n'accepte qu'un identifiant d'item validé par expression régulière stricte interpolé dans une URL fixe : aucune URL fournie par l'utilisateur n'est requêtée ; les domaines de l'API Albion sont une liste fermée (un par serveur de jeu)</w:t>
+              <w:t xml:space="preserve">Le proxy d'icônes n'accepte qu'un identifiant validé par regex stricte (^[A-Za-z0-9_@]+$) interpolé dans une URL fixe : aucune URL fournie par l'utilisateur n'est requêtée ; domaines de l'API Albion en liste fermée (un par serveur) — ItemController ; AlbionDataMapper</w:t>
             </w:r>
           </w:p>
         </w:tc>

</xml_diff>

<commit_message>
docs(rncp): audit d'honnêteté du dossier — 3 précisions
- §12.4 : la sauvegarde pg_dump est une procédure à planifier (le cron
  n'existe pas encore sur le VPS), formulation rendue prescriptive
- §10 : rejeux de recette datés précisément (14–15/07, v3.0.0 puis v3.1.0)
- CHANGELOG v3.1.0 : BUG-014 et BUG-015 ajoutés (le dossier affirme que le
  registre complet est tenu dans le CHANGELOG — c'est maintenant exact)

Co-Authored-By: Claude Fable 5 <noreply@anthropic.com>
</commit_message>
<xml_diff>
--- a/dossier/Dossier_Bloc2_Albion_Helper_v3.docx
+++ b/dossier/Dossier_Bloc2_Albion_Helper_v3.docx
@@ -16303,7 +16303,7 @@
           <w:sz w:val="22"/>
           <w:szCs w:val="22"/>
         </w:rPr>
-        <w:t xml:space="preserve">La recette a été exécutée le 12/06/2026 sur la version 2.1.0, en environnement de développement iso-production (PostgreSQL, données réelles de l'API Albion), au travers du navigateur (scénarios pilotés par Playwright) et de l'API (scénarios sécurité). Les scénarios critiques (authentification, routes, compositions, craft, administration) ont été rejoués le 14/07/2026 sur la version 3.0.0 lors de la préparation de ce dossier. Chaque scénario précise ses préconditions, ses étapes et son résultat attendu. Statut : PASS = conforme à l'attendu.</w:t>
+        <w:t xml:space="preserve">La recette a été exécutée le 12/06/2026 sur la version 2.1.0, en environnement de développement iso-production (PostgreSQL, données réelles de l'API Albion), au travers du navigateur (scénarios pilotés par Playwright) et de l'API (scénarios sécurité). Les scénarios critiques (authentification, routes, compositions, craft, administration) ont été rejoués les 14–15/07/2026 sur les versions 3.0.0 puis 3.1.0 lors de la préparation de ce dossier. Chaque scénario précise ses préconditions, ses étapes et son résultat attendu. Statut : PASS = conforme à l'attendu.</w:t>
       </w:r>
     </w:p>
     <w:p>
@@ -27564,7 +27564,7 @@
                 <w:sz w:val="18"/>
                 <w:szCs w:val="18"/>
               </w:rPr>
-              <w:t xml:space="preserve">pg_dump quotidien (cron sur le VPS) : pg_dump -Fc app &gt; backup_$(date +%F).dump — rotation sur 14 jours</w:t>
+              <w:t xml:space="preserve">Planifier un pg_dump quotidien via cron sur le VPS : pg_dump -Fc app &gt; backup_$(date +%F).dump — rotation recommandée : 14 jours</w:t>
             </w:r>
           </w:p>
         </w:tc>

</xml_diff>